<commit_message>
fix: add margins and control of repeated active agreements
</commit_message>
<xml_diff>
--- a/resources/templates/certificado_convenio_actividades_template.docx
+++ b/resources/templates/certificado_convenio_actividades_template.docx
@@ -4,18 +4,6 @@
   <w:body>
     <w:p>
       <w:pPr>
-        <w:ind w:left="1416" w:hanging="708"/>
-        <w:rPr>
-          <w:rFonts w:asciiTheme="minorHAnsi" w:hAnsiTheme="minorHAnsi"/>
-          <w:i/>
-          <w:iCs/>
-          <w:sz w:val="24"/>
-          <w:szCs w:val="24"/>
-        </w:rPr>
-      </w:pPr>
-    </w:p>
-    <w:p>
-      <w:pPr>
         <w:rPr>
           <w:rFonts w:asciiTheme="minorHAnsi" w:hAnsiTheme="minorHAnsi" w:cstheme="minorHAnsi"/>
           <w:i/>
@@ -29,7 +17,7 @@
           <w:noProof/>
           <w:lang w:val="es-419" w:eastAsia="es-419"/>
         </w:rPr>
-        <w:pict w14:anchorId="241A1560">
+        <w:pict w14:anchorId="4FCD88D6">
           <v:shapetype id="_x0000_t201" coordsize="21600,21600" o:spt="201" path="m,l,21600r21600,l21600,xe">
             <v:stroke joinstyle="miter"/>
             <v:path shadowok="f" o:extrusionok="f" strokeok="f" fillok="f" o:connecttype="rect"/>
@@ -260,14 +248,6 @@
         </w:rPr>
         <w:br/>
       </w:r>
-      <w:r>
-        <w:rPr>
-          <w:rFonts w:asciiTheme="minorHAnsi" w:hAnsiTheme="minorHAnsi" w:cstheme="minorHAnsi"/>
-          <w:b/>
-          <w:bCs/>
-        </w:rPr>
-        <w:br/>
-      </w:r>
     </w:p>
     <w:p>
       <w:pPr>
@@ -14442,6 +14422,8 @@
           <w:rFonts w:asciiTheme="minorHAnsi" w:hAnsiTheme="minorHAnsi"/>
           <w:i/>
           <w:iCs/>
+          <w:sz w:val="20"/>
+          <w:szCs w:val="20"/>
         </w:rPr>
       </w:pPr>
       <w:r>
@@ -14449,6 +14431,8 @@
           <w:rFonts w:asciiTheme="minorHAnsi" w:hAnsiTheme="minorHAnsi"/>
           <w:i/>
           <w:iCs/>
+          <w:sz w:val="20"/>
+          <w:szCs w:val="20"/>
         </w:rPr>
         <w:t xml:space="preserve">Para </w:t>
       </w:r>
@@ -14459,6 +14443,8 @@
           <w:bCs/>
           <w:i/>
           <w:iCs/>
+          <w:sz w:val="20"/>
+          <w:szCs w:val="20"/>
         </w:rPr>
         <w:t>verificación o confirmación</w:t>
       </w:r>
@@ -14467,6 +14453,8 @@
           <w:rFonts w:asciiTheme="minorHAnsi" w:hAnsiTheme="minorHAnsi"/>
           <w:i/>
           <w:iCs/>
+          <w:sz w:val="20"/>
+          <w:szCs w:val="20"/>
         </w:rPr>
         <w:t xml:space="preserve"> del presente certificado puede comunicarse al </w:t>
       </w:r>
@@ -14477,6 +14465,8 @@
           <w:bCs/>
           <w:i/>
           <w:iCs/>
+          <w:sz w:val="20"/>
+          <w:szCs w:val="20"/>
         </w:rPr>
         <w:t>PBX 604-448-9232 Ext 101</w:t>
       </w:r>
@@ -14487,6 +14477,8 @@
           <w:bCs/>
           <w:i/>
           <w:iCs/>
+          <w:sz w:val="20"/>
+          <w:szCs w:val="20"/>
         </w:rPr>
         <w:t xml:space="preserve"> </w:t>
       </w:r>
@@ -14495,6 +14487,8 @@
           <w:rFonts w:asciiTheme="minorHAnsi" w:hAnsiTheme="minorHAnsi"/>
           <w:i/>
           <w:iCs/>
+          <w:sz w:val="20"/>
+          <w:szCs w:val="20"/>
         </w:rPr>
         <w:t xml:space="preserve">o al correo </w:t>
       </w:r>
@@ -14505,6 +14499,8 @@
             <w:rFonts w:asciiTheme="minorHAnsi" w:hAnsiTheme="minorHAnsi"/>
             <w:i/>
             <w:iCs/>
+            <w:sz w:val="20"/>
+            <w:szCs w:val="20"/>
           </w:rPr>
           <w:t>comunicaciones@sindicatoprosalud.com</w:t>
         </w:r>
@@ -14514,6 +14510,8 @@
           <w:rFonts w:asciiTheme="minorHAnsi" w:hAnsiTheme="minorHAnsi"/>
           <w:i/>
           <w:iCs/>
+          <w:sz w:val="20"/>
+          <w:szCs w:val="20"/>
         </w:rPr>
         <w:t xml:space="preserve"> anexando copia del certificado que desea confirmar.</w:t>
       </w:r>
@@ -14581,13 +14579,13 @@
           <w:lang w:val="es-419" w:eastAsia="es-419"/>
         </w:rPr>
         <w:drawing>
-          <wp:anchor distT="0" distB="0" distL="114300" distR="114300" simplePos="0" relativeHeight="251659264" behindDoc="1" locked="0" layoutInCell="1" allowOverlap="1" wp14:anchorId="5D01061E" wp14:editId="68EB35A5">
+          <wp:anchor distT="0" distB="0" distL="114300" distR="114300" simplePos="0" relativeHeight="251659264" behindDoc="1" locked="0" layoutInCell="1" allowOverlap="1" wp14:anchorId="5D01061E" wp14:editId="00764E2F">
             <wp:simplePos x="0" y="0"/>
             <wp:positionH relativeFrom="column">
               <wp:posOffset>600075</wp:posOffset>
             </wp:positionH>
             <wp:positionV relativeFrom="paragraph">
-              <wp:posOffset>27305</wp:posOffset>
+              <wp:posOffset>17549</wp:posOffset>
             </wp:positionV>
             <wp:extent cx="714375" cy="935990"/>
             <wp:effectExtent l="0" t="0" r="9525" b="0"/>
@@ -14691,17 +14689,6 @@
     <w:p>
       <w:pPr>
         <w:spacing w:after="0" w:line="240" w:lineRule="auto"/>
-        <w:rPr>
-          <w:rFonts w:asciiTheme="minorHAnsi" w:hAnsiTheme="minorHAnsi"/>
-          <w:b/>
-          <w:i/>
-          <w:iCs/>
-        </w:rPr>
-      </w:pPr>
-    </w:p>
-    <w:p>
-      <w:pPr>
-        <w:spacing w:after="0" w:line="240" w:lineRule="auto"/>
         <w:ind w:left="708"/>
         <w:jc w:val="right"/>
         <w:rPr>
@@ -14870,7 +14857,7 @@
       <w:headerReference w:type="default" r:id="rId11"/>
       <w:footerReference w:type="default" r:id="rId12"/>
       <w:pgSz w:w="12242" w:h="15842" w:code="1"/>
-      <w:pgMar w:top="993" w:right="1610" w:bottom="1418" w:left="1701" w:header="709" w:footer="709" w:gutter="0"/>
+      <w:pgMar w:top="1985" w:right="1701" w:bottom="1985" w:left="1701" w:header="709" w:footer="709" w:gutter="0"/>
       <w:paperSrc w:first="1" w:other="1"/>
       <w:pgNumType w:start="1"/>
       <w:cols w:space="708"/>
@@ -15284,7 +15271,7 @@
 <w:numbering xmlns:wpc="http://schemas.microsoft.com/office/word/2010/wordprocessingCanvas" xmlns:cx="http://schemas.microsoft.com/office/drawing/2014/chartex" xmlns:cx1="http://schemas.microsoft.com/office/drawing/2015/9/8/chartex" xmlns:cx2="http://schemas.microsoft.com/office/drawing/2015/10/21/chartex" xmlns:cx3="http://schemas.microsoft.com/office/drawing/2016/5/9/chartex" xmlns:cx4="http://schemas.microsoft.com/office/drawing/2016/5/10/chartex" xmlns:cx5="http://schemas.microsoft.com/office/drawing/2016/5/11/chartex" xmlns:cx6="http://schemas.microsoft.com/office/drawing/2016/5/12/chartex" xmlns:cx7="http://schemas.microsoft.com/office/drawing/2016/5/13/chartex" xmlns:cx8="http://schemas.microsoft.com/office/drawing/2016/5/14/chartex" xmlns:mc="http://schemas.openxmlformats.org/markup-compatibility/2006" xmlns:aink="http://schemas.microsoft.com/office/drawing/2016/ink" xmlns:am3d="http://schemas.microsoft.com/office/drawing/2017/model3d" xmlns:o="urn:schemas-microsoft-com:office:office" xmlns:oel="http://schemas.microsoft.com/office/2019/extlst" xmlns:r="http://schemas.openxmlformats.org/officeDocument/2006/relationships" xmlns:m="http://schemas.openxmlformats.org/officeDocument/2006/math" xmlns:v="urn:schemas-microsoft-com:vml" xmlns:wp14="http://schemas.microsoft.com/office/word/2010/wordprocessingDrawing" xmlns:wp="http://schemas.openxmlformats.org/drawingml/2006/wordprocessingDrawing" xmlns:w10="urn:schemas-microsoft-com:office:word" xmlns:w="http://schemas.openxmlformats.org/wordprocessingml/2006/main" xmlns:w14="http://schemas.microsoft.com/office/word/2010/wordml" xmlns:w15="http://schemas.microsoft.com/office/word/2012/wordml" xmlns:w16cex="http://schemas.microsoft.com/office/word/2018/wordml/cex" xmlns:w16cid="http://schemas.microsoft.com/office/word/2016/wordml/cid" xmlns:w16="http://schemas.microsoft.com/office/word/2018/wordml" xmlns:w16du="http://schemas.microsoft.com/office/word/2023/wordml/word16du" xmlns:w16sdtdh="http://schemas.microsoft.com/office/word/2020/wordml/sdtdatahash" xmlns:w16sdtfl="http://schemas.microsoft.com/office/word/2024/wordml/sdtformatlock" xmlns:w16se="http://schemas.microsoft.com/office/word/2015/wordml/symex" xmlns:wpg="http://schemas.microsoft.com/office/word/2010/wordprocessingGroup" xmlns:wpi="http://schemas.microsoft.com/office/word/2010/wordprocessingInk" xmlns:wne="http://schemas.microsoft.com/office/word/2006/wordml" xmlns:wps="http://schemas.microsoft.com/office/word/2010/wordprocessingShape" mc:Ignorable="w14 w15 w16se w16cid w16 w16cex w16sdtdh w16sdtfl w16du wp14">
   <w:numPicBullet w:numPicBulletId="0">
     <w:pict>
-      <v:shapetype id="_x0000_t75" coordsize="21600,21600" o:spt="75" o:preferrelative="t" path="m@4@5l@4@11@9@11@9@5xe" filled="f" stroked="f">
+      <v:shapetype w14:anchorId="4FCD88D6" id="_x0000_t75" coordsize="21600,21600" o:spt="75" o:preferrelative="t" path="m@4@5l@4@11@9@11@9@5xe" filled="f" stroked="f">
         <v:stroke joinstyle="miter"/>
         <v:formulas>
           <v:f eqn="if lineDrawn pixelLineWidth 0"/>

</xml_diff>

<commit_message>
feat: allow pasting activity content for the agreement certificate
</commit_message>
<xml_diff>
--- a/resources/templates/certificado_convenio_actividades_template.docx
+++ b/resources/templates/certificado_convenio_actividades_template.docx
@@ -6,10 +6,16 @@
       <w:pPr>
         <w:rPr>
           <w:rFonts w:asciiTheme="minorHAnsi" w:hAnsiTheme="minorHAnsi" w:cstheme="minorHAnsi"/>
-          <w:i/>
-          <w:iCs/>
         </w:rPr>
       </w:pPr>
+      <w:r>
+        <w:rPr>
+          <w:i/>
+          <w:iCs/>
+          <w:noProof/>
+          <w:lang w:val="es-419" w:eastAsia="es-419"/>
+        </w:rPr>
+      </w:r>
       <w:r>
         <w:rPr>
           <w:i/>
@@ -23,7 +29,7 @@
             <v:path shadowok="f" o:extrusionok="f" strokeok="f" fillok="f" o:connecttype="rect"/>
             <o:lock v:ext="edit" shapetype="t"/>
           </v:shapetype>
-          <v:shape id="_x0000_s2050" type="#_x0000_t201" alt="" style="position:absolute;margin-left:537.85pt;margin-top:34.8pt;width:83.25pt;height:36.75pt;z-index:251660288;mso-wrap-edited:f;mso-width-percent:0;mso-height-percent:0;mso-width-percent:0;mso-height-percent:0" o:preferrelative="t" filled="f" stroked="f">
+          <v:shape id="_x0000_s1026" type="#_x0000_t201" alt="" style="position:absolute;margin-left:537.85pt;margin-top:34.8pt;width:83.25pt;height:36.75pt;z-index:251660288;mso-wrap-edited:f;mso-width-percent:0;mso-height-percent:0;mso-width-percent:0;mso-height-percent:0" o:preferrelative="t" filled="f" stroked="f">
             <v:imagedata r:id="rId8" o:title=""/>
             <o:lock v:ext="edit" aspectratio="t"/>
           </v:shape>
@@ -43,21 +49,19 @@
         </w:rPr>
         <w:t>${FECHA_CERTIFICADO}</w:t>
       </w:r>
+      <w:bookmarkStart w:id="0" w:name="_Hlk113457402"/>
     </w:p>
     <w:p>
       <w:pPr>
-        <w:spacing w:after="0" w:line="240" w:lineRule="auto"/>
-        <w:jc w:val="both"/>
+        <w:rPr>
+          <w:rFonts w:asciiTheme="minorHAnsi" w:hAnsiTheme="minorHAnsi" w:cstheme="minorHAnsi"/>
+          <w:i/>
+          <w:iCs/>
+        </w:rPr>
+      </w:pPr>
+      <w:r>
         <w:rPr>
           <w:rFonts w:asciiTheme="minorHAnsi" w:hAnsiTheme="minorHAnsi"/>
-          <w:i/>
-          <w:iCs/>
-        </w:rPr>
-      </w:pPr>
-      <w:bookmarkStart w:id="0" w:name="_Hlk113457402"/>
-      <w:r>
-        <w:rPr>
-          <w:rFonts w:asciiTheme="minorHAnsi" w:hAnsiTheme="minorHAnsi"/>
           <w:b/>
           <w:bCs/>
           <w:i/>
@@ -65,189 +69,16 @@
         </w:rPr>
         <w:t>${DESTINATARIO_COMPLETO}</w:t>
       </w:r>
-      <w:r>
-        <w:rPr>
-          <w:rFonts w:asciiTheme="minorHAnsi" w:hAnsiTheme="minorHAnsi"/>
-          <w:i/>
-          <w:iCs/>
-        </w:rPr>
-        <w:fldChar w:fldCharType="begin"/>
-      </w:r>
-      <w:r>
-        <w:rPr>
-          <w:rFonts w:asciiTheme="minorHAnsi" w:hAnsiTheme="minorHAnsi"/>
-          <w:i/>
-          <w:iCs/>
-        </w:rPr>
-        <w:instrText xml:space="preserve"> IF </w:instrText>
-      </w:r>
-      <w:r>
-        <w:rPr>
-          <w:rFonts w:asciiTheme="minorHAnsi" w:hAnsiTheme="minorHAnsi"/>
-          <w:i/>
-          <w:iCs/>
-        </w:rPr>
-        <w:fldChar w:fldCharType="begin"/>
-      </w:r>
-      <w:r>
-        <w:rPr>
-          <w:rFonts w:asciiTheme="minorHAnsi" w:hAnsiTheme="minorHAnsi"/>
-          <w:i/>
-          <w:iCs/>
-        </w:rPr>
-        <w:instrText xml:space="preserve"> MERGEFIELD DESTINATARIO </w:instrText>
-      </w:r>
-      <w:r>
-        <w:rPr>
-          <w:rFonts w:asciiTheme="minorHAnsi" w:hAnsiTheme="minorHAnsi"/>
-          <w:i/>
-          <w:iCs/>
-        </w:rPr>
-        <w:fldChar w:fldCharType="end"/>
-      </w:r>
-      <w:r>
-        <w:rPr>
-          <w:rFonts w:asciiTheme="minorHAnsi" w:hAnsiTheme="minorHAnsi"/>
-          <w:i/>
-          <w:iCs/>
-        </w:rPr>
-        <w:instrText xml:space="preserve"> &lt;&gt; "" "Señores</w:instrText>
-      </w:r>
     </w:p>
+    <w:bookmarkEnd w:id="0"/>
     <w:p>
       <w:pPr>
-        <w:spacing w:after="0" w:line="240" w:lineRule="auto"/>
-        <w:ind w:firstLine="708"/>
-        <w:jc w:val="both"/>
-        <w:rPr>
-          <w:rFonts w:asciiTheme="minorHAnsi" w:hAnsiTheme="minorHAnsi"/>
+        <w:rPr>
+          <w:rFonts w:asciiTheme="minorHAnsi" w:hAnsiTheme="minorHAnsi" w:cstheme="minorHAnsi"/>
           <w:b/>
           <w:bCs/>
-          <w:i/>
-          <w:iCs/>
-          <w:noProof/>
         </w:rPr>
       </w:pPr>
-      <w:r>
-        <w:rPr>
-          <w:rFonts w:asciiTheme="minorHAnsi" w:hAnsiTheme="minorHAnsi"/>
-          <w:b/>
-          <w:bCs/>
-          <w:i/>
-          <w:iCs/>
-        </w:rPr>
-        <w:fldChar w:fldCharType="begin"/>
-      </w:r>
-      <w:r>
-        <w:rPr>
-          <w:rFonts w:asciiTheme="minorHAnsi" w:hAnsiTheme="minorHAnsi"/>
-          <w:b/>
-          <w:bCs/>
-          <w:i/>
-          <w:iCs/>
-        </w:rPr>
-        <w:instrText xml:space="preserve"> MERGEFIELD  DESTINATARIO \* Upper </w:instrText>
-      </w:r>
-      <w:r>
-        <w:rPr>
-          <w:rFonts w:asciiTheme="minorHAnsi" w:hAnsiTheme="minorHAnsi"/>
-          <w:b/>
-          <w:bCs/>
-          <w:i/>
-          <w:iCs/>
-        </w:rPr>
-        <w:fldChar w:fldCharType="separate"/>
-      </w:r>
-      <w:r>
-        <w:rPr>
-          <w:rFonts w:asciiTheme="minorHAnsi" w:hAnsiTheme="minorHAnsi"/>
-          <w:b/>
-          <w:bCs/>
-          <w:i/>
-          <w:iCs/>
-          <w:noProof/>
-        </w:rPr>
-        <w:instrText>COOPERATIVA FINANCIERA</w:instrText>
-      </w:r>
-    </w:p>
-    <w:p>
-      <w:pPr>
-        <w:spacing w:after="0" w:line="240" w:lineRule="auto"/>
-        <w:ind w:firstLine="708"/>
-        <w:rPr>
-          <w:rFonts w:asciiTheme="minorHAnsi" w:hAnsiTheme="minorHAnsi" w:cstheme="minorHAnsi"/>
-          <w:b/>
-          <w:bCs/>
-        </w:rPr>
-      </w:pPr>
-      <w:r>
-        <w:rPr>
-          <w:rFonts w:asciiTheme="minorHAnsi" w:hAnsiTheme="minorHAnsi"/>
-          <w:b/>
-          <w:bCs/>
-          <w:i/>
-          <w:iCs/>
-          <w:noProof/>
-        </w:rPr>
-        <w:instrText>MEDELLIN</w:instrText>
-      </w:r>
-      <w:r>
-        <w:rPr>
-          <w:rFonts w:asciiTheme="minorHAnsi" w:hAnsiTheme="minorHAnsi"/>
-          <w:b/>
-          <w:bCs/>
-          <w:i/>
-          <w:iCs/>
-        </w:rPr>
-        <w:fldChar w:fldCharType="end"/>
-      </w:r>
-      <w:r>
-        <w:rPr>
-          <w:rFonts w:asciiTheme="minorHAnsi" w:hAnsiTheme="minorHAnsi"/>
-          <w:b/>
-          <w:bCs/>
-          <w:i/>
-          <w:iCs/>
-        </w:rPr>
-        <w:instrText xml:space="preserve"> </w:instrText>
-      </w:r>
-      <w:r>
-        <w:rPr>
-          <w:rFonts w:asciiTheme="minorHAnsi" w:hAnsiTheme="minorHAnsi"/>
-          <w:i/>
-          <w:iCs/>
-        </w:rPr>
-        <w:instrText xml:space="preserve">" "" </w:instrText>
-      </w:r>
-      <w:r>
-        <w:rPr>
-          <w:rFonts w:asciiTheme="minorHAnsi" w:hAnsiTheme="minorHAnsi"/>
-          <w:i/>
-          <w:iCs/>
-        </w:rPr>
-        <w:fldChar w:fldCharType="end"/>
-      </w:r>
-      <w:bookmarkEnd w:id="0"/>
-    </w:p>
-    <w:p>
-      <w:pPr>
-        <w:spacing w:after="0" w:line="240" w:lineRule="auto"/>
-        <w:rPr>
-          <w:rFonts w:asciiTheme="minorHAnsi" w:hAnsiTheme="minorHAnsi"/>
-          <w:b/>
-          <w:bCs/>
-          <w:i/>
-          <w:iCs/>
-        </w:rPr>
-      </w:pPr>
-      <w:r>
-        <w:rPr>
-          <w:rFonts w:asciiTheme="minorHAnsi" w:hAnsiTheme="minorHAnsi" w:cstheme="minorHAnsi"/>
-          <w:b/>
-          <w:bCs/>
-        </w:rPr>
-        <w:br/>
-      </w:r>
     </w:p>
     <w:p>
       <w:pPr>
@@ -308,71 +139,7 @@
           <w:i/>
           <w:iCs/>
         </w:rPr>
-        <w:t xml:space="preserve">El Sindicato de </w:t>
-      </w:r>
-      <w:r>
-        <w:rPr>
-          <w:rFonts w:asciiTheme="minorHAnsi" w:hAnsiTheme="minorHAnsi" w:cstheme="minorHAnsi"/>
-          <w:i/>
-          <w:iCs/>
-        </w:rPr>
-        <w:t>Profesionales de la Salud</w:t>
-      </w:r>
-      <w:r>
-        <w:rPr>
-          <w:rFonts w:asciiTheme="minorHAnsi" w:hAnsiTheme="minorHAnsi" w:cstheme="minorHAnsi"/>
-          <w:i/>
-          <w:iCs/>
-        </w:rPr>
-        <w:t xml:space="preserve"> (</w:t>
-      </w:r>
-      <w:r>
-        <w:rPr>
-          <w:rFonts w:asciiTheme="minorHAnsi" w:hAnsiTheme="minorHAnsi" w:cstheme="minorHAnsi"/>
-          <w:i/>
-          <w:iCs/>
-        </w:rPr>
-        <w:t>ProSalud</w:t>
-      </w:r>
-      <w:r>
-        <w:rPr>
-          <w:rFonts w:asciiTheme="minorHAnsi" w:hAnsiTheme="minorHAnsi" w:cstheme="minorHAnsi"/>
-          <w:i/>
-          <w:iCs/>
-        </w:rPr>
-        <w:t>) RUT. 900.</w:t>
-      </w:r>
-      <w:r>
-        <w:rPr>
-          <w:rFonts w:asciiTheme="minorHAnsi" w:hAnsiTheme="minorHAnsi" w:cstheme="minorHAnsi"/>
-          <w:i/>
-          <w:iCs/>
-        </w:rPr>
-        <w:t>444</w:t>
-      </w:r>
-      <w:r>
-        <w:rPr>
-          <w:rFonts w:asciiTheme="minorHAnsi" w:hAnsiTheme="minorHAnsi" w:cstheme="minorHAnsi"/>
-          <w:i/>
-          <w:iCs/>
-        </w:rPr>
-        <w:t>.</w:t>
-      </w:r>
-      <w:r>
-        <w:rPr>
-          <w:rFonts w:asciiTheme="minorHAnsi" w:hAnsiTheme="minorHAnsi" w:cstheme="minorHAnsi"/>
-          <w:i/>
-          <w:iCs/>
-        </w:rPr>
-        <w:t>737</w:t>
-      </w:r>
-      <w:r>
-        <w:rPr>
-          <w:rFonts w:asciiTheme="minorHAnsi" w:hAnsiTheme="minorHAnsi" w:cstheme="minorHAnsi"/>
-          <w:i/>
-          <w:iCs/>
-        </w:rPr>
-        <w:t xml:space="preserve"> – 1, </w:t>
+        <w:t xml:space="preserve">El Sindicato de Profesionales de la Salud (ProSalud) RUT. 900.444.737 – 1, </w:t>
       </w:r>
       <w:bookmarkStart w:id="2" w:name="_Hlk93414168"/>
       <w:r>
@@ -389,15 +156,60 @@
           <w:i/>
           <w:iCs/>
         </w:rPr>
+        <w:t xml:space="preserve"> la persona </w:t>
+      </w:r>
+      <w:r>
+        <w:rPr>
+          <w:rFonts w:asciiTheme="minorHAnsi" w:hAnsiTheme="minorHAnsi" w:cstheme="minorHAnsi"/>
+          <w:b/>
+          <w:bCs/>
+          <w:i/>
+          <w:iCs/>
+        </w:rPr>
+        <w:t>${NOMBRE_COMPLETO}</w:t>
+      </w:r>
+      <w:r>
+        <w:rPr>
+          <w:rFonts w:asciiTheme="minorHAnsi" w:hAnsiTheme="minorHAnsi" w:cstheme="minorHAnsi"/>
+          <w:bCs/>
+          <w:i/>
+          <w:iCs/>
+        </w:rPr>
+        <w:t>,</w:t>
+      </w:r>
+      <w:r>
+        <w:rPr>
+          <w:rFonts w:asciiTheme="minorHAnsi" w:hAnsiTheme="minorHAnsi" w:cstheme="minorHAnsi"/>
+          <w:b/>
+          <w:i/>
+          <w:iCs/>
+        </w:rPr>
         <w:t xml:space="preserve"> </w:t>
       </w:r>
       <w:r>
         <w:rPr>
           <w:rFonts w:asciiTheme="minorHAnsi" w:hAnsiTheme="minorHAnsi" w:cstheme="minorHAnsi"/>
-          <w:i/>
-          <w:iCs/>
-        </w:rPr>
-        <w:t>la persona</w:t>
+          <w:bCs/>
+          <w:i/>
+          <w:iCs/>
+        </w:rPr>
+        <w:t xml:space="preserve">identificada </w:t>
+      </w:r>
+      <w:r>
+        <w:rPr>
+          <w:rFonts w:asciiTheme="minorHAnsi" w:hAnsiTheme="minorHAnsi" w:cstheme="minorHAnsi"/>
+          <w:i/>
+          <w:iCs/>
+        </w:rPr>
+        <w:t xml:space="preserve">con documento de identidad </w:t>
+      </w:r>
+      <w:r>
+        <w:rPr>
+          <w:rFonts w:asciiTheme="minorHAnsi" w:hAnsiTheme="minorHAnsi" w:cstheme="minorHAnsi"/>
+          <w:i/>
+          <w:iCs/>
+        </w:rPr>
+        <w:t>${DOCUMENTO},</w:t>
       </w:r>
       <w:r>
         <w:rPr>
@@ -409,118 +221,300 @@
       </w:r>
       <w:r>
         <w:rPr>
-          <w:rFonts w:asciiTheme="minorHAnsi" w:hAnsiTheme="minorHAnsi" w:cstheme="minorHAnsi"/>
+          <w:i/>
+          <w:iCs/>
+        </w:rPr>
+        <w:t>${SE_ENCUENTRA_ESTUVO}</w:t>
+      </w:r>
+      <w:r>
+        <w:t xml:space="preserve"> </w:t>
+      </w:r>
+      <w:r>
+        <w:rPr>
+          <w:rFonts w:asciiTheme="minorHAnsi" w:hAnsiTheme="minorHAnsi" w:cstheme="minorHAnsi"/>
+          <w:i/>
+          <w:iCs/>
+        </w:rPr>
+        <w:t xml:space="preserve">afiliada </w:t>
+      </w:r>
+      <w:r>
+        <w:rPr>
+          <w:rFonts w:asciiTheme="minorHAnsi" w:hAnsiTheme="minorHAnsi" w:cstheme="minorHAnsi"/>
+          <w:i/>
+          <w:iCs/>
+        </w:rPr>
+        <w:fldChar w:fldCharType="begin"/>
+      </w:r>
+      <w:r>
+        <w:rPr>
+          <w:rFonts w:asciiTheme="minorHAnsi" w:hAnsiTheme="minorHAnsi" w:cstheme="minorHAnsi"/>
+          <w:i/>
+          <w:iCs/>
+        </w:rPr>
+        <w:instrText xml:space="preserve"> IF </w:instrText>
+      </w:r>
+      <w:r>
+        <w:rPr>
+          <w:rFonts w:asciiTheme="minorHAnsi" w:hAnsiTheme="minorHAnsi" w:cstheme="minorHAnsi"/>
+          <w:i/>
+          <w:iCs/>
+        </w:rPr>
+        <w:fldChar w:fldCharType="begin"/>
+      </w:r>
+      <w:r>
+        <w:rPr>
+          <w:rFonts w:asciiTheme="minorHAnsi" w:hAnsiTheme="minorHAnsi" w:cstheme="minorHAnsi"/>
+          <w:i/>
+          <w:iCs/>
+        </w:rPr>
+        <w:instrText xml:space="preserve"> MERGEFIELD SEXO </w:instrText>
+      </w:r>
+      <w:r>
+        <w:rPr>
+          <w:rFonts w:asciiTheme="minorHAnsi" w:hAnsiTheme="minorHAnsi" w:cstheme="minorHAnsi"/>
+          <w:i/>
+          <w:iCs/>
+        </w:rPr>
+        <w:fldChar w:fldCharType="separate"/>
+      </w:r>
+      <w:r>
+        <w:rPr>
+          <w:rFonts w:asciiTheme="minorHAnsi" w:hAnsiTheme="minorHAnsi" w:cstheme="minorHAnsi"/>
+          <w:i/>
+          <w:iCs/>
+          <w:noProof/>
+        </w:rPr>
+        <w:instrText>M</w:instrText>
+      </w:r>
+      <w:r>
+        <w:rPr>
+          <w:rFonts w:asciiTheme="minorHAnsi" w:hAnsiTheme="minorHAnsi" w:cstheme="minorHAnsi"/>
+          <w:i/>
+          <w:iCs/>
+        </w:rPr>
+        <w:fldChar w:fldCharType="end"/>
+      </w:r>
+      <w:r>
+        <w:rPr>
+          <w:rFonts w:asciiTheme="minorHAnsi" w:hAnsiTheme="minorHAnsi" w:cstheme="minorHAnsi"/>
+          <w:i/>
+          <w:iCs/>
+        </w:rPr>
+        <w:instrText xml:space="preserve"> = "F" "afiliada" "" </w:instrText>
+      </w:r>
+      <w:r>
+        <w:rPr>
+          <w:rFonts w:asciiTheme="minorHAnsi" w:hAnsiTheme="minorHAnsi" w:cstheme="minorHAnsi"/>
+          <w:i/>
+          <w:iCs/>
+        </w:rPr>
+        <w:fldChar w:fldCharType="end"/>
+      </w:r>
+      <w:r>
+        <w:rPr>
+          <w:rFonts w:asciiTheme="minorHAnsi" w:hAnsiTheme="minorHAnsi" w:cstheme="minorHAnsi"/>
+          <w:i/>
+          <w:iCs/>
+        </w:rPr>
+        <w:t>al Sindicato</w:t>
+      </w:r>
+      <w:r>
+        <w:rPr>
+          <w:rFonts w:asciiTheme="minorHAnsi" w:hAnsiTheme="minorHAnsi" w:cstheme="minorHAnsi"/>
+          <w:i/>
+          <w:iCs/>
+        </w:rPr>
+        <w:t>,</w:t>
+      </w:r>
+      <w:r>
+        <w:rPr>
+          <w:rFonts w:asciiTheme="minorHAnsi" w:hAnsiTheme="minorHAnsi" w:cstheme="minorHAnsi"/>
+          <w:i/>
+          <w:iCs/>
+        </w:rPr>
+        <w:t xml:space="preserve"> a</w:t>
+      </w:r>
+      <w:r>
+        <w:rPr>
+          <w:rFonts w:asciiTheme="minorHAnsi" w:hAnsiTheme="minorHAnsi" w:cstheme="minorHAnsi"/>
+          <w:i/>
+          <w:iCs/>
+        </w:rPr>
+        <w:t xml:space="preserve"> través de</w:t>
+      </w:r>
+      <w:r>
+        <w:rPr>
+          <w:rFonts w:asciiTheme="minorHAnsi" w:hAnsiTheme="minorHAnsi" w:cstheme="minorHAnsi"/>
+          <w:i/>
+          <w:iCs/>
+        </w:rPr>
+        <w:t xml:space="preserve"> </w:t>
+      </w:r>
+      <w:r>
+        <w:rPr>
           <w:b/>
           <w:bCs/>
           <w:i/>
           <w:iCs/>
         </w:rPr>
-        <w:t>${NOMBRE_COMPLETO}</w:t>
-      </w:r>
-      <w:r>
-        <w:rPr>
-          <w:rFonts w:asciiTheme="minorHAnsi" w:hAnsiTheme="minorHAnsi" w:cstheme="minorHAnsi"/>
+        <w:t>${UN_CONVENIO_VARIOS_CONVENIOS}</w:t>
+      </w:r>
+      <w:r>
+        <w:t xml:space="preserve"> </w:t>
+      </w:r>
+      <w:r>
+        <w:rPr>
+          <w:rFonts w:asciiTheme="minorHAnsi" w:hAnsiTheme="minorHAnsi" w:cstheme="minorHAnsi"/>
+          <w:b/>
           <w:bCs/>
           <w:i/>
           <w:iCs/>
         </w:rPr>
-        <w:t>,</w:t>
-      </w:r>
-      <w:r>
-        <w:rPr>
-          <w:rFonts w:asciiTheme="minorHAnsi" w:hAnsiTheme="minorHAnsi" w:cstheme="minorHAnsi"/>
-          <w:b/>
-          <w:i/>
-          <w:iCs/>
-        </w:rPr>
-        <w:t xml:space="preserve"> </w:t>
-      </w:r>
-      <w:r>
-        <w:rPr>
-          <w:rFonts w:asciiTheme="minorHAnsi" w:hAnsiTheme="minorHAnsi" w:cstheme="minorHAnsi"/>
+        <w:t>de Ejecución Sindical</w:t>
+      </w:r>
+      <w:bookmarkEnd w:id="2"/>
+      <w:r>
+        <w:rPr>
+          <w:rFonts w:asciiTheme="minorHAnsi" w:hAnsiTheme="minorHAnsi" w:cstheme="minorHAnsi"/>
+          <w:i/>
+          <w:iCs/>
+        </w:rPr>
+        <w:t xml:space="preserve">, </w:t>
+      </w:r>
+      <w:r>
+        <w:rPr>
+          <w:rFonts w:asciiTheme="minorHAnsi" w:hAnsiTheme="minorHAnsi" w:cstheme="minorHAnsi"/>
+          <w:i/>
+          <w:iCs/>
+        </w:rPr>
+        <w:t xml:space="preserve">que </w:t>
+      </w:r>
+      <w:r>
+        <w:rPr>
+          <w:i/>
+          <w:iCs/>
+        </w:rPr>
+        <w:t>${DESARROLLA_ACTUALMENTE_DESARROLLO}</w:t>
+      </w:r>
+      <w:r>
+        <w:rPr>
+          <w:rFonts w:asciiTheme="minorHAnsi" w:hAnsiTheme="minorHAnsi" w:cstheme="minorHAnsi"/>
+          <w:i/>
+          <w:iCs/>
+        </w:rPr>
+        <w:fldChar w:fldCharType="begin"/>
+      </w:r>
+      <w:r>
+        <w:rPr>
+          <w:rFonts w:asciiTheme="minorHAnsi" w:hAnsiTheme="minorHAnsi" w:cstheme="minorHAnsi"/>
+          <w:i/>
+          <w:iCs/>
+        </w:rPr>
+        <w:instrText xml:space="preserve"> IF </w:instrText>
+      </w:r>
+      <w:r>
+        <w:rPr>
+          <w:rFonts w:asciiTheme="minorHAnsi" w:hAnsiTheme="minorHAnsi" w:cstheme="minorHAnsi"/>
+          <w:i/>
+          <w:iCs/>
+        </w:rPr>
+        <w:fldChar w:fldCharType="begin"/>
+      </w:r>
+      <w:r>
+        <w:rPr>
+          <w:rFonts w:asciiTheme="minorHAnsi" w:hAnsiTheme="minorHAnsi" w:cstheme="minorHAnsi"/>
+          <w:i/>
+          <w:iCs/>
+        </w:rPr>
+        <w:instrText xml:space="preserve"> MERGEFIELD ESTADO </w:instrText>
+      </w:r>
+      <w:r>
+        <w:rPr>
+          <w:rFonts w:asciiTheme="minorHAnsi" w:hAnsiTheme="minorHAnsi" w:cstheme="minorHAnsi"/>
+          <w:i/>
+          <w:iCs/>
+        </w:rPr>
+        <w:fldChar w:fldCharType="separate"/>
+      </w:r>
+      <w:r>
+        <w:rPr>
+          <w:rFonts w:asciiTheme="minorHAnsi" w:hAnsiTheme="minorHAnsi" w:cstheme="minorHAnsi"/>
+          <w:i/>
+          <w:iCs/>
+          <w:noProof/>
+        </w:rPr>
+        <w:instrText>ACTIVO</w:instrText>
+      </w:r>
+      <w:r>
+        <w:rPr>
+          <w:rFonts w:asciiTheme="minorHAnsi" w:hAnsiTheme="minorHAnsi" w:cstheme="minorHAnsi"/>
+          <w:i/>
+          <w:iCs/>
+        </w:rPr>
+        <w:fldChar w:fldCharType="end"/>
+      </w:r>
+      <w:r>
+        <w:rPr>
+          <w:rFonts w:asciiTheme="minorHAnsi" w:hAnsiTheme="minorHAnsi" w:cstheme="minorHAnsi"/>
+          <w:i/>
+          <w:iCs/>
+        </w:rPr>
+        <w:instrText xml:space="preserve"> = "NO ACTIVO" "desarrolló" "" </w:instrText>
+      </w:r>
+      <w:r>
+        <w:rPr>
+          <w:rFonts w:asciiTheme="minorHAnsi" w:hAnsiTheme="minorHAnsi" w:cstheme="minorHAnsi"/>
+          <w:i/>
+          <w:iCs/>
+        </w:rPr>
+        <w:fldChar w:fldCharType="end"/>
+      </w:r>
+      <w:r>
+        <w:rPr>
+          <w:rFonts w:asciiTheme="minorHAnsi" w:hAnsiTheme="minorHAnsi" w:cstheme="minorHAnsi"/>
+          <w:i/>
+          <w:iCs/>
+        </w:rPr>
+        <w:t xml:space="preserve"> en </w:t>
+      </w:r>
+      <w:r>
+        <w:rPr>
+          <w:rFonts w:asciiTheme="minorHAnsi" w:hAnsiTheme="minorHAnsi" w:cstheme="minorHAnsi"/>
+          <w:b/>
           <w:bCs/>
-          <w:i/>
-          <w:iCs/>
-        </w:rPr>
-        <w:t xml:space="preserve">identificada </w:t>
-      </w:r>
-      <w:r>
-        <w:rPr>
-          <w:rFonts w:asciiTheme="minorHAnsi" w:hAnsiTheme="minorHAnsi" w:cstheme="minorHAnsi"/>
-          <w:i/>
-          <w:iCs/>
-        </w:rPr>
-        <w:t xml:space="preserve">con </w:t>
-      </w:r>
-      <w:r>
-        <w:rPr>
-          <w:rFonts w:asciiTheme="minorHAnsi" w:hAnsiTheme="minorHAnsi" w:cstheme="minorHAnsi"/>
-          <w:i/>
-          <w:iCs/>
-        </w:rPr>
-        <w:t xml:space="preserve">documento de identidad </w:t>
-      </w:r>
-      <w:r>
-        <w:rPr>
-          <w:rFonts w:asciiTheme="minorHAnsi" w:hAnsiTheme="minorHAnsi" w:cstheme="minorHAnsi"/>
-          <w:i/>
-          <w:iCs/>
-        </w:rPr>
-        <w:t>${DOCUMENTO}</w:t>
-      </w:r>
-      <w:r>
-        <w:rPr>
-          <w:rFonts w:asciiTheme="minorHAnsi" w:hAnsiTheme="minorHAnsi" w:cstheme="minorHAnsi"/>
-          <w:i/>
-          <w:iCs/>
-        </w:rPr>
-        <w:t>,</w:t>
-      </w:r>
-      <w:r>
-        <w:rPr>
-          <w:rFonts w:asciiTheme="minorHAnsi" w:hAnsiTheme="minorHAnsi" w:cstheme="minorHAnsi"/>
-          <w:i/>
-          <w:iCs/>
-        </w:rPr>
-        <w:t xml:space="preserve"> </w:t>
-      </w:r>
-      <w:r>
-        <w:rPr>
-          <w:i/>
-          <w:iCs/>
-        </w:rPr>
-        <w:t>${SE_ENCUENTRA_ESTUVO}</w:t>
-      </w:r>
-      <w:r>
-        <w:t xml:space="preserve"> </w:t>
-      </w:r>
-      <w:r>
-        <w:rPr>
-          <w:rFonts w:asciiTheme="minorHAnsi" w:hAnsiTheme="minorHAnsi" w:cstheme="minorHAnsi"/>
-          <w:i/>
-          <w:iCs/>
-        </w:rPr>
-        <w:t>afiliada</w:t>
-      </w:r>
-      <w:r>
-        <w:rPr>
-          <w:rFonts w:asciiTheme="minorHAnsi" w:hAnsiTheme="minorHAnsi" w:cstheme="minorHAnsi"/>
-          <w:i/>
-          <w:iCs/>
-        </w:rPr>
-        <w:t xml:space="preserve"> </w:t>
-      </w:r>
-      <w:r>
-        <w:rPr>
-          <w:rFonts w:asciiTheme="minorHAnsi" w:hAnsiTheme="minorHAnsi" w:cstheme="minorHAnsi"/>
-          <w:i/>
-          <w:iCs/>
-        </w:rPr>
-        <w:fldChar w:fldCharType="begin"/>
-      </w:r>
-      <w:r>
-        <w:rPr>
-          <w:rFonts w:asciiTheme="minorHAnsi" w:hAnsiTheme="minorHAnsi" w:cstheme="minorHAnsi"/>
+        </w:rPr>
+        <w:t>${</w:t>
+      </w:r>
+      <w:r>
+        <w:rPr>
+          <w:b/>
+          <w:bCs/>
+          <w:i/>
+          <w:iCs/>
+        </w:rPr>
+        <w:t>HOSPITAL</w:t>
+      </w:r>
+      <w:r>
+        <w:rPr>
+          <w:rFonts w:asciiTheme="minorHAnsi" w:hAnsiTheme="minorHAnsi" w:cstheme="minorHAnsi"/>
+          <w:b/>
+          <w:bCs/>
+        </w:rPr>
+        <w:t>}</w:t>
+      </w:r>
+      <w:r>
+        <w:rPr>
+          <w:rFonts w:asciiTheme="minorHAnsi" w:hAnsiTheme="minorHAnsi" w:cstheme="minorHAnsi"/>
+          <w:b/>
+          <w:i/>
+          <w:iCs/>
+        </w:rPr>
+        <w:fldChar w:fldCharType="begin"/>
+      </w:r>
+      <w:r>
+        <w:rPr>
+          <w:rFonts w:asciiTheme="minorHAnsi" w:hAnsiTheme="minorHAnsi" w:cstheme="minorHAnsi"/>
+          <w:b/>
           <w:i/>
           <w:iCs/>
         </w:rPr>
@@ -529,22 +523,25 @@
       <w:r>
         <w:rPr>
           <w:rFonts w:asciiTheme="minorHAnsi" w:hAnsiTheme="minorHAnsi" w:cstheme="minorHAnsi"/>
-          <w:i/>
-          <w:iCs/>
-        </w:rPr>
-        <w:fldChar w:fldCharType="begin"/>
-      </w:r>
-      <w:r>
-        <w:rPr>
-          <w:rFonts w:asciiTheme="minorHAnsi" w:hAnsiTheme="minorHAnsi" w:cstheme="minorHAnsi"/>
-          <w:i/>
-          <w:iCs/>
-        </w:rPr>
-        <w:instrText xml:space="preserve"> MERGEFIELD SEXO </w:instrText>
-      </w:r>
-      <w:r>
-        <w:rPr>
-          <w:rFonts w:asciiTheme="minorHAnsi" w:hAnsiTheme="minorHAnsi" w:cstheme="minorHAnsi"/>
+          <w:b/>
+          <w:i/>
+          <w:iCs/>
+        </w:rPr>
+        <w:fldChar w:fldCharType="begin"/>
+      </w:r>
+      <w:r>
+        <w:rPr>
+          <w:rFonts w:asciiTheme="minorHAnsi" w:hAnsiTheme="minorHAnsi" w:cstheme="minorHAnsi"/>
+          <w:b/>
+          <w:i/>
+          <w:iCs/>
+        </w:rPr>
+        <w:instrText xml:space="preserve"> MERGEFIELD HOSPITAL </w:instrText>
+      </w:r>
+      <w:r>
+        <w:rPr>
+          <w:rFonts w:asciiTheme="minorHAnsi" w:hAnsiTheme="minorHAnsi" w:cstheme="minorHAnsi"/>
+          <w:b/>
           <w:i/>
           <w:iCs/>
         </w:rPr>
@@ -553,189 +550,53 @@
       <w:r>
         <w:rPr>
           <w:rFonts w:asciiTheme="minorHAnsi" w:hAnsiTheme="minorHAnsi" w:cstheme="minorHAnsi"/>
+          <w:b/>
           <w:i/>
           <w:iCs/>
           <w:noProof/>
         </w:rPr>
-        <w:instrText>M</w:instrText>
-      </w:r>
-      <w:r>
-        <w:rPr>
-          <w:rFonts w:asciiTheme="minorHAnsi" w:hAnsiTheme="minorHAnsi" w:cstheme="minorHAnsi"/>
-          <w:i/>
-          <w:iCs/>
-        </w:rPr>
-        <w:fldChar w:fldCharType="end"/>
-      </w:r>
-      <w:r>
-        <w:rPr>
-          <w:rFonts w:asciiTheme="minorHAnsi" w:hAnsiTheme="minorHAnsi" w:cstheme="minorHAnsi"/>
-          <w:i/>
-          <w:iCs/>
-        </w:rPr>
-        <w:instrText xml:space="preserve"> = "F" "afiliada" "" </w:instrText>
-      </w:r>
-      <w:r>
-        <w:rPr>
-          <w:rFonts w:asciiTheme="minorHAnsi" w:hAnsiTheme="minorHAnsi" w:cstheme="minorHAnsi"/>
-          <w:i/>
-          <w:iCs/>
-        </w:rPr>
-        <w:fldChar w:fldCharType="end"/>
-      </w:r>
-      <w:r>
-        <w:rPr>
-          <w:rFonts w:asciiTheme="minorHAnsi" w:hAnsiTheme="minorHAnsi" w:cstheme="minorHAnsi"/>
-          <w:i/>
-          <w:iCs/>
-        </w:rPr>
-        <w:t>al Sindicato</w:t>
-      </w:r>
-      <w:r>
-        <w:rPr>
-          <w:rFonts w:asciiTheme="minorHAnsi" w:hAnsiTheme="minorHAnsi" w:cstheme="minorHAnsi"/>
-          <w:i/>
-          <w:iCs/>
-        </w:rPr>
-        <w:t>,</w:t>
-      </w:r>
-      <w:r>
-        <w:rPr>
-          <w:rFonts w:asciiTheme="minorHAnsi" w:hAnsiTheme="minorHAnsi" w:cstheme="minorHAnsi"/>
-          <w:i/>
-          <w:iCs/>
-        </w:rPr>
-        <w:t xml:space="preserve"> </w:t>
-      </w:r>
-      <w:r>
-        <w:rPr>
-          <w:rFonts w:asciiTheme="minorHAnsi" w:hAnsiTheme="minorHAnsi" w:cstheme="minorHAnsi"/>
-          <w:i/>
-          <w:iCs/>
-        </w:rPr>
-        <w:t>a</w:t>
-      </w:r>
-      <w:r>
-        <w:rPr>
-          <w:rFonts w:asciiTheme="minorHAnsi" w:hAnsiTheme="minorHAnsi" w:cstheme="minorHAnsi"/>
-          <w:i/>
-          <w:iCs/>
-        </w:rPr>
-        <w:t xml:space="preserve"> través de</w:t>
-      </w:r>
-      <w:r>
-        <w:rPr>
-          <w:rFonts w:asciiTheme="minorHAnsi" w:hAnsiTheme="minorHAnsi" w:cstheme="minorHAnsi"/>
-          <w:i/>
-          <w:iCs/>
-        </w:rPr>
-        <w:t xml:space="preserve"> </w:t>
-      </w:r>
-      <w:r>
-        <w:rPr>
-          <w:b/>
-          <w:bCs/>
-          <w:i/>
-          <w:iCs/>
-        </w:rPr>
-        <w:t>${UN_CONVENIO_VARIOS_CONVENIOS}</w:t>
-      </w:r>
-      <w:r>
-        <w:t xml:space="preserve"> </w:t>
-      </w:r>
-      <w:r>
-        <w:rPr>
-          <w:rFonts w:asciiTheme="minorHAnsi" w:hAnsiTheme="minorHAnsi" w:cstheme="minorHAnsi"/>
-          <w:b/>
-          <w:bCs/>
-          <w:i/>
-          <w:iCs/>
-        </w:rPr>
-        <w:t xml:space="preserve">de </w:t>
-      </w:r>
-      <w:r>
-        <w:rPr>
-          <w:rFonts w:asciiTheme="minorHAnsi" w:hAnsiTheme="minorHAnsi" w:cstheme="minorHAnsi"/>
-          <w:b/>
-          <w:bCs/>
-          <w:i/>
-          <w:iCs/>
-        </w:rPr>
-        <w:t>E</w:t>
-      </w:r>
-      <w:r>
-        <w:rPr>
-          <w:rFonts w:asciiTheme="minorHAnsi" w:hAnsiTheme="minorHAnsi" w:cstheme="minorHAnsi"/>
-          <w:b/>
-          <w:bCs/>
-          <w:i/>
-          <w:iCs/>
-        </w:rPr>
-        <w:t xml:space="preserve">jecución </w:t>
-      </w:r>
-      <w:r>
-        <w:rPr>
-          <w:rFonts w:asciiTheme="minorHAnsi" w:hAnsiTheme="minorHAnsi" w:cstheme="minorHAnsi"/>
-          <w:b/>
-          <w:bCs/>
-          <w:i/>
-          <w:iCs/>
-        </w:rPr>
-        <w:t>S</w:t>
-      </w:r>
-      <w:r>
-        <w:rPr>
-          <w:rFonts w:asciiTheme="minorHAnsi" w:hAnsiTheme="minorHAnsi" w:cstheme="minorHAnsi"/>
-          <w:b/>
-          <w:bCs/>
-          <w:i/>
-          <w:iCs/>
-        </w:rPr>
-        <w:t>indical</w:t>
-      </w:r>
-      <w:bookmarkEnd w:id="2"/>
-      <w:r>
-        <w:rPr>
-          <w:rFonts w:asciiTheme="minorHAnsi" w:hAnsiTheme="minorHAnsi" w:cstheme="minorHAnsi"/>
-          <w:i/>
-          <w:iCs/>
-        </w:rPr>
-        <w:t xml:space="preserve">, </w:t>
-      </w:r>
-      <w:r>
-        <w:rPr>
-          <w:rFonts w:asciiTheme="minorHAnsi" w:hAnsiTheme="minorHAnsi" w:cstheme="minorHAnsi"/>
-          <w:i/>
-          <w:iCs/>
-        </w:rPr>
-        <w:t>que</w:t>
-      </w:r>
-      <w:r>
-        <w:rPr>
-          <w:rFonts w:asciiTheme="minorHAnsi" w:hAnsiTheme="minorHAnsi" w:cstheme="minorHAnsi"/>
-          <w:i/>
-          <w:iCs/>
-        </w:rPr>
-        <w:t xml:space="preserve"> </w:t>
-      </w:r>
-      <w:r>
-        <w:rPr>
-          <w:i/>
-          <w:iCs/>
-        </w:rPr>
-        <w:t>${DESARROLLA_ACTUALMENTE_DESARROLLO}</w:t>
-      </w:r>
-      <w:r>
-        <w:rPr>
-          <w:rFonts w:asciiTheme="minorHAnsi" w:hAnsiTheme="minorHAnsi" w:cstheme="minorHAnsi"/>
-          <w:i/>
-          <w:iCs/>
-        </w:rPr>
-        <w:fldChar w:fldCharType="begin"/>
-      </w:r>
-      <w:r>
-        <w:rPr>
-          <w:rFonts w:asciiTheme="minorHAnsi" w:hAnsiTheme="minorHAnsi" w:cstheme="minorHAnsi"/>
+        <w:instrText>HSJDRionegro</w:instrText>
+      </w:r>
+      <w:r>
+        <w:rPr>
+          <w:rFonts w:asciiTheme="minorHAnsi" w:hAnsiTheme="minorHAnsi" w:cstheme="minorHAnsi"/>
+          <w:b/>
+          <w:i/>
+          <w:iCs/>
+        </w:rPr>
+        <w:fldChar w:fldCharType="end"/>
+      </w:r>
+      <w:r>
+        <w:rPr>
+          <w:rFonts w:asciiTheme="minorHAnsi" w:hAnsiTheme="minorHAnsi" w:cstheme="minorHAnsi"/>
+          <w:b/>
+          <w:i/>
+          <w:iCs/>
+        </w:rPr>
+        <w:instrText xml:space="preserve"> = "BARBOSA" "E.S.E. Hospital San Vicente de Paul - Barbosa (Ant)" </w:instrText>
+      </w:r>
+      <w:r>
+        <w:rPr>
+          <w:rFonts w:asciiTheme="minorHAnsi" w:hAnsiTheme="minorHAnsi" w:cstheme="minorHAnsi"/>
+          <w:b/>
+          <w:i/>
+          <w:iCs/>
+        </w:rPr>
+        <w:fldChar w:fldCharType="end"/>
+      </w:r>
+      <w:r>
+        <w:rPr>
+          <w:rFonts w:asciiTheme="minorHAnsi" w:hAnsiTheme="minorHAnsi" w:cstheme="minorHAnsi"/>
+          <w:b/>
+          <w:i/>
+          <w:iCs/>
+        </w:rPr>
+        <w:fldChar w:fldCharType="begin"/>
+      </w:r>
+      <w:r>
+        <w:rPr>
+          <w:rFonts w:asciiTheme="minorHAnsi" w:hAnsiTheme="minorHAnsi" w:cstheme="minorHAnsi"/>
+          <w:b/>
           <w:i/>
           <w:iCs/>
         </w:rPr>
@@ -744,22 +605,25 @@
       <w:r>
         <w:rPr>
           <w:rFonts w:asciiTheme="minorHAnsi" w:hAnsiTheme="minorHAnsi" w:cstheme="minorHAnsi"/>
-          <w:i/>
-          <w:iCs/>
-        </w:rPr>
-        <w:fldChar w:fldCharType="begin"/>
-      </w:r>
-      <w:r>
-        <w:rPr>
-          <w:rFonts w:asciiTheme="minorHAnsi" w:hAnsiTheme="minorHAnsi" w:cstheme="minorHAnsi"/>
-          <w:i/>
-          <w:iCs/>
-        </w:rPr>
-        <w:instrText xml:space="preserve"> MERGEFIELD ESTADO </w:instrText>
-      </w:r>
-      <w:r>
-        <w:rPr>
-          <w:rFonts w:asciiTheme="minorHAnsi" w:hAnsiTheme="minorHAnsi" w:cstheme="minorHAnsi"/>
+          <w:b/>
+          <w:i/>
+          <w:iCs/>
+        </w:rPr>
+        <w:fldChar w:fldCharType="begin"/>
+      </w:r>
+      <w:r>
+        <w:rPr>
+          <w:rFonts w:asciiTheme="minorHAnsi" w:hAnsiTheme="minorHAnsi" w:cstheme="minorHAnsi"/>
+          <w:b/>
+          <w:i/>
+          <w:iCs/>
+        </w:rPr>
+        <w:instrText xml:space="preserve"> MERGEFIELD HOSPITAL </w:instrText>
+      </w:r>
+      <w:r>
+        <w:rPr>
+          <w:rFonts w:asciiTheme="minorHAnsi" w:hAnsiTheme="minorHAnsi" w:cstheme="minorHAnsi"/>
+          <w:b/>
           <w:i/>
           <w:iCs/>
         </w:rPr>
@@ -768,68 +632,39 @@
       <w:r>
         <w:rPr>
           <w:rFonts w:asciiTheme="minorHAnsi" w:hAnsiTheme="minorHAnsi" w:cstheme="minorHAnsi"/>
+          <w:b/>
           <w:i/>
           <w:iCs/>
           <w:noProof/>
         </w:rPr>
-        <w:instrText>ACTIVO</w:instrText>
-      </w:r>
-      <w:r>
-        <w:rPr>
-          <w:rFonts w:asciiTheme="minorHAnsi" w:hAnsiTheme="minorHAnsi" w:cstheme="minorHAnsi"/>
-          <w:i/>
-          <w:iCs/>
-        </w:rPr>
-        <w:fldChar w:fldCharType="end"/>
-      </w:r>
-      <w:r>
-        <w:rPr>
-          <w:rFonts w:asciiTheme="minorHAnsi" w:hAnsiTheme="minorHAnsi" w:cstheme="minorHAnsi"/>
-          <w:i/>
-          <w:iCs/>
-        </w:rPr>
-        <w:instrText xml:space="preserve"> = "NO ACTIVO" "desarrolló" "" </w:instrText>
-      </w:r>
-      <w:r>
-        <w:rPr>
-          <w:rFonts w:asciiTheme="minorHAnsi" w:hAnsiTheme="minorHAnsi" w:cstheme="minorHAnsi"/>
-          <w:i/>
-          <w:iCs/>
-        </w:rPr>
-        <w:fldChar w:fldCharType="end"/>
-      </w:r>
-      <w:r>
-        <w:rPr>
-          <w:rFonts w:asciiTheme="minorHAnsi" w:hAnsiTheme="minorHAnsi" w:cstheme="minorHAnsi"/>
-          <w:i/>
-          <w:iCs/>
-        </w:rPr>
-        <w:t xml:space="preserve"> en </w:t>
-      </w:r>
-      <w:r>
-        <w:rPr>
-          <w:rFonts w:asciiTheme="minorHAnsi" w:hAnsiTheme="minorHAnsi" w:cstheme="minorHAnsi"/>
-          <w:b/>
-          <w:bCs/>
-        </w:rPr>
-        <w:t>${</w:t>
-      </w:r>
-      <w:r>
-        <w:rPr>
-          <w:b/>
-          <w:bCs/>
-          <w:i/>
-          <w:iCs/>
-        </w:rPr>
-        <w:t>HOSPITAL</w:t>
-      </w:r>
-      <w:r>
-        <w:rPr>
-          <w:rFonts w:asciiTheme="minorHAnsi" w:hAnsiTheme="minorHAnsi" w:cstheme="minorHAnsi"/>
-          <w:b/>
-          <w:bCs/>
-        </w:rPr>
-        <w:t>}</w:t>
+        <w:instrText>HSJDRionegro</w:instrText>
+      </w:r>
+      <w:r>
+        <w:rPr>
+          <w:rFonts w:asciiTheme="minorHAnsi" w:hAnsiTheme="minorHAnsi" w:cstheme="minorHAnsi"/>
+          <w:b/>
+          <w:i/>
+          <w:iCs/>
+        </w:rPr>
+        <w:fldChar w:fldCharType="end"/>
+      </w:r>
+      <w:r>
+        <w:rPr>
+          <w:rFonts w:asciiTheme="minorHAnsi" w:hAnsiTheme="minorHAnsi" w:cstheme="minorHAnsi"/>
+          <w:b/>
+          <w:i/>
+          <w:iCs/>
+        </w:rPr>
+        <w:instrText xml:space="preserve"> = "PUERTO BERRIO" "E.S.E. Hospital La Cruz" </w:instrText>
+      </w:r>
+      <w:r>
+        <w:rPr>
+          <w:rFonts w:asciiTheme="minorHAnsi" w:hAnsiTheme="minorHAnsi" w:cstheme="minorHAnsi"/>
+          <w:b/>
+          <w:i/>
+          <w:iCs/>
+        </w:rPr>
+        <w:fldChar w:fldCharType="end"/>
       </w:r>
       <w:r>
         <w:rPr>
@@ -902,7 +737,7 @@
           <w:i/>
           <w:iCs/>
         </w:rPr>
-        <w:instrText xml:space="preserve"> = "BARBOSA" "E.S.E. Hospital San Vicente de Paul - Barbosa (Ant)" </w:instrText>
+        <w:instrText xml:space="preserve"> = "ABEJORRAL SP" "E.S.E. Hospital San Juan De Dios Abejorral" </w:instrText>
       </w:r>
       <w:r>
         <w:rPr>
@@ -984,16 +819,364 @@
           <w:i/>
           <w:iCs/>
         </w:rPr>
-        <w:instrText xml:space="preserve"> = "PUERTO BERRIO" "E.S.E. Hospital </w:instrText>
-      </w:r>
-      <w:r>
-        <w:rPr>
-          <w:rFonts w:asciiTheme="minorHAnsi" w:hAnsiTheme="minorHAnsi" w:cstheme="minorHAnsi"/>
-          <w:b/>
-          <w:i/>
-          <w:iCs/>
-        </w:rPr>
-        <w:instrText>La Cruz</w:instrText>
+        <w:instrText xml:space="preserve"> = "ABEJORRAL - BUEN COMIENZO" "E.S.E. Hospital San Juan de Dios Abejorral - Programa Buen Comienzo" </w:instrText>
+      </w:r>
+      <w:r>
+        <w:rPr>
+          <w:rFonts w:asciiTheme="minorHAnsi" w:hAnsiTheme="minorHAnsi" w:cstheme="minorHAnsi"/>
+          <w:b/>
+          <w:i/>
+          <w:iCs/>
+        </w:rPr>
+        <w:fldChar w:fldCharType="end"/>
+      </w:r>
+      <w:r>
+        <w:rPr>
+          <w:rFonts w:asciiTheme="minorHAnsi" w:hAnsiTheme="minorHAnsi" w:cstheme="minorHAnsi"/>
+          <w:b/>
+          <w:i/>
+          <w:iCs/>
+        </w:rPr>
+        <w:fldChar w:fldCharType="begin"/>
+      </w:r>
+      <w:r>
+        <w:rPr>
+          <w:rFonts w:asciiTheme="minorHAnsi" w:hAnsiTheme="minorHAnsi" w:cstheme="minorHAnsi"/>
+          <w:b/>
+          <w:i/>
+          <w:iCs/>
+        </w:rPr>
+        <w:instrText xml:space="preserve"> IF </w:instrText>
+      </w:r>
+      <w:r>
+        <w:rPr>
+          <w:rFonts w:asciiTheme="minorHAnsi" w:hAnsiTheme="minorHAnsi" w:cstheme="minorHAnsi"/>
+          <w:b/>
+          <w:i/>
+          <w:iCs/>
+        </w:rPr>
+        <w:fldChar w:fldCharType="begin"/>
+      </w:r>
+      <w:r>
+        <w:rPr>
+          <w:rFonts w:asciiTheme="minorHAnsi" w:hAnsiTheme="minorHAnsi" w:cstheme="minorHAnsi"/>
+          <w:b/>
+          <w:i/>
+          <w:iCs/>
+        </w:rPr>
+        <w:instrText xml:space="preserve"> MERGEFIELD HOSPITAL </w:instrText>
+      </w:r>
+      <w:r>
+        <w:rPr>
+          <w:rFonts w:asciiTheme="minorHAnsi" w:hAnsiTheme="minorHAnsi" w:cstheme="minorHAnsi"/>
+          <w:b/>
+          <w:i/>
+          <w:iCs/>
+        </w:rPr>
+        <w:fldChar w:fldCharType="separate"/>
+      </w:r>
+      <w:r>
+        <w:rPr>
+          <w:rFonts w:asciiTheme="minorHAnsi" w:hAnsiTheme="minorHAnsi" w:cstheme="minorHAnsi"/>
+          <w:b/>
+          <w:i/>
+          <w:iCs/>
+          <w:noProof/>
+        </w:rPr>
+        <w:instrText>HSJDRionegro</w:instrText>
+      </w:r>
+      <w:r>
+        <w:rPr>
+          <w:rFonts w:asciiTheme="minorHAnsi" w:hAnsiTheme="minorHAnsi" w:cstheme="minorHAnsi"/>
+          <w:b/>
+          <w:i/>
+          <w:iCs/>
+        </w:rPr>
+        <w:fldChar w:fldCharType="end"/>
+      </w:r>
+      <w:r>
+        <w:rPr>
+          <w:rFonts w:asciiTheme="minorHAnsi" w:hAnsiTheme="minorHAnsi" w:cstheme="minorHAnsi"/>
+          <w:b/>
+          <w:i/>
+          <w:iCs/>
+        </w:rPr>
+        <w:instrText xml:space="preserve"> = "ABEJORRAL - SALUD P." "E.S.E. Hospital San Juan de Dios Abejorral - Programa Salud Pública" </w:instrText>
+      </w:r>
+      <w:r>
+        <w:rPr>
+          <w:rFonts w:asciiTheme="minorHAnsi" w:hAnsiTheme="minorHAnsi" w:cstheme="minorHAnsi"/>
+          <w:b/>
+          <w:i/>
+          <w:iCs/>
+        </w:rPr>
+        <w:fldChar w:fldCharType="end"/>
+      </w:r>
+      <w:r>
+        <w:rPr>
+          <w:rFonts w:asciiTheme="minorHAnsi" w:hAnsiTheme="minorHAnsi" w:cstheme="minorHAnsi"/>
+          <w:b/>
+          <w:i/>
+          <w:iCs/>
+        </w:rPr>
+        <w:fldChar w:fldCharType="begin"/>
+      </w:r>
+      <w:r>
+        <w:rPr>
+          <w:rFonts w:asciiTheme="minorHAnsi" w:hAnsiTheme="minorHAnsi" w:cstheme="minorHAnsi"/>
+          <w:b/>
+          <w:i/>
+          <w:iCs/>
+        </w:rPr>
+        <w:instrText xml:space="preserve"> IF </w:instrText>
+      </w:r>
+      <w:r>
+        <w:rPr>
+          <w:rFonts w:asciiTheme="minorHAnsi" w:hAnsiTheme="minorHAnsi" w:cstheme="minorHAnsi"/>
+          <w:b/>
+          <w:i/>
+          <w:iCs/>
+        </w:rPr>
+        <w:fldChar w:fldCharType="begin"/>
+      </w:r>
+      <w:r>
+        <w:rPr>
+          <w:rFonts w:asciiTheme="minorHAnsi" w:hAnsiTheme="minorHAnsi" w:cstheme="minorHAnsi"/>
+          <w:b/>
+          <w:i/>
+          <w:iCs/>
+        </w:rPr>
+        <w:instrText xml:space="preserve"> MERGEFIELD HOSPITAL </w:instrText>
+      </w:r>
+      <w:r>
+        <w:rPr>
+          <w:rFonts w:asciiTheme="minorHAnsi" w:hAnsiTheme="minorHAnsi" w:cstheme="minorHAnsi"/>
+          <w:b/>
+          <w:i/>
+          <w:iCs/>
+        </w:rPr>
+        <w:fldChar w:fldCharType="separate"/>
+      </w:r>
+      <w:r>
+        <w:rPr>
+          <w:rFonts w:asciiTheme="minorHAnsi" w:hAnsiTheme="minorHAnsi" w:cstheme="minorHAnsi"/>
+          <w:b/>
+          <w:i/>
+          <w:iCs/>
+          <w:noProof/>
+        </w:rPr>
+        <w:instrText>HSJDRionegro</w:instrText>
+      </w:r>
+      <w:r>
+        <w:rPr>
+          <w:rFonts w:asciiTheme="minorHAnsi" w:hAnsiTheme="minorHAnsi" w:cstheme="minorHAnsi"/>
+          <w:b/>
+          <w:i/>
+          <w:iCs/>
+        </w:rPr>
+        <w:fldChar w:fldCharType="end"/>
+      </w:r>
+      <w:r>
+        <w:rPr>
+          <w:rFonts w:asciiTheme="minorHAnsi" w:hAnsiTheme="minorHAnsi" w:cstheme="minorHAnsi"/>
+          <w:b/>
+          <w:i/>
+          <w:iCs/>
+        </w:rPr>
+        <w:instrText xml:space="preserve"> = "BETANIA" "E.S.E. Hospital San Antonio de Betania" </w:instrText>
+      </w:r>
+      <w:r>
+        <w:rPr>
+          <w:rFonts w:asciiTheme="minorHAnsi" w:hAnsiTheme="minorHAnsi" w:cstheme="minorHAnsi"/>
+          <w:b/>
+          <w:i/>
+          <w:iCs/>
+        </w:rPr>
+        <w:fldChar w:fldCharType="end"/>
+      </w:r>
+      <w:r>
+        <w:rPr>
+          <w:rFonts w:asciiTheme="minorHAnsi" w:hAnsiTheme="minorHAnsi" w:cstheme="minorHAnsi"/>
+          <w:b/>
+          <w:i/>
+          <w:iCs/>
+        </w:rPr>
+        <w:fldChar w:fldCharType="begin"/>
+      </w:r>
+      <w:r>
+        <w:rPr>
+          <w:rFonts w:asciiTheme="minorHAnsi" w:hAnsiTheme="minorHAnsi" w:cstheme="minorHAnsi"/>
+          <w:b/>
+          <w:i/>
+          <w:iCs/>
+        </w:rPr>
+        <w:instrText xml:space="preserve"> IF </w:instrText>
+      </w:r>
+      <w:r>
+        <w:rPr>
+          <w:rFonts w:asciiTheme="minorHAnsi" w:hAnsiTheme="minorHAnsi" w:cstheme="minorHAnsi"/>
+          <w:b/>
+          <w:i/>
+          <w:iCs/>
+        </w:rPr>
+        <w:fldChar w:fldCharType="begin"/>
+      </w:r>
+      <w:r>
+        <w:rPr>
+          <w:rFonts w:asciiTheme="minorHAnsi" w:hAnsiTheme="minorHAnsi" w:cstheme="minorHAnsi"/>
+          <w:b/>
+          <w:i/>
+          <w:iCs/>
+        </w:rPr>
+        <w:instrText xml:space="preserve"> MERGEFIELD HOSPITAL </w:instrText>
+      </w:r>
+      <w:r>
+        <w:rPr>
+          <w:rFonts w:asciiTheme="minorHAnsi" w:hAnsiTheme="minorHAnsi" w:cstheme="minorHAnsi"/>
+          <w:b/>
+          <w:i/>
+          <w:iCs/>
+        </w:rPr>
+        <w:fldChar w:fldCharType="separate"/>
+      </w:r>
+      <w:r>
+        <w:rPr>
+          <w:rFonts w:asciiTheme="minorHAnsi" w:hAnsiTheme="minorHAnsi" w:cstheme="minorHAnsi"/>
+          <w:b/>
+          <w:i/>
+          <w:iCs/>
+          <w:noProof/>
+        </w:rPr>
+        <w:instrText>HSJDRionegro</w:instrText>
+      </w:r>
+      <w:r>
+        <w:rPr>
+          <w:rFonts w:asciiTheme="minorHAnsi" w:hAnsiTheme="minorHAnsi" w:cstheme="minorHAnsi"/>
+          <w:b/>
+          <w:i/>
+          <w:iCs/>
+        </w:rPr>
+        <w:fldChar w:fldCharType="end"/>
+      </w:r>
+      <w:r>
+        <w:rPr>
+          <w:rFonts w:asciiTheme="minorHAnsi" w:hAnsiTheme="minorHAnsi" w:cstheme="minorHAnsi"/>
+          <w:b/>
+          <w:i/>
+          <w:iCs/>
+        </w:rPr>
+        <w:instrText xml:space="preserve"> = "BETANIA - BUEN COMIENZO" "E.S.E. Hospital San Antonio de Betania" </w:instrText>
+      </w:r>
+      <w:r>
+        <w:rPr>
+          <w:rFonts w:asciiTheme="minorHAnsi" w:hAnsiTheme="minorHAnsi" w:cstheme="minorHAnsi"/>
+          <w:b/>
+          <w:i/>
+          <w:iCs/>
+        </w:rPr>
+        <w:fldChar w:fldCharType="end"/>
+      </w:r>
+      <w:r>
+        <w:rPr>
+          <w:rFonts w:asciiTheme="minorHAnsi" w:hAnsiTheme="minorHAnsi" w:cstheme="minorHAnsi"/>
+          <w:b/>
+          <w:i/>
+          <w:iCs/>
+        </w:rPr>
+        <w:fldChar w:fldCharType="begin"/>
+      </w:r>
+      <w:r>
+        <w:rPr>
+          <w:rFonts w:asciiTheme="minorHAnsi" w:hAnsiTheme="minorHAnsi" w:cstheme="minorHAnsi"/>
+          <w:b/>
+          <w:i/>
+          <w:iCs/>
+        </w:rPr>
+        <w:instrText xml:space="preserve"> IF </w:instrText>
+      </w:r>
+      <w:r>
+        <w:rPr>
+          <w:rFonts w:asciiTheme="minorHAnsi" w:hAnsiTheme="minorHAnsi" w:cstheme="minorHAnsi"/>
+          <w:b/>
+          <w:i/>
+          <w:iCs/>
+        </w:rPr>
+        <w:fldChar w:fldCharType="begin"/>
+      </w:r>
+      <w:r>
+        <w:rPr>
+          <w:rFonts w:asciiTheme="minorHAnsi" w:hAnsiTheme="minorHAnsi" w:cstheme="minorHAnsi"/>
+          <w:b/>
+          <w:i/>
+          <w:iCs/>
+        </w:rPr>
+        <w:instrText xml:space="preserve"> MERGEFIELD HOSPITAL </w:instrText>
+      </w:r>
+      <w:r>
+        <w:rPr>
+          <w:rFonts w:asciiTheme="minorHAnsi" w:hAnsiTheme="minorHAnsi" w:cstheme="minorHAnsi"/>
+          <w:b/>
+          <w:i/>
+          <w:iCs/>
+        </w:rPr>
+        <w:fldChar w:fldCharType="separate"/>
+      </w:r>
+      <w:r>
+        <w:rPr>
+          <w:rFonts w:asciiTheme="minorHAnsi" w:hAnsiTheme="minorHAnsi" w:cstheme="minorHAnsi"/>
+          <w:b/>
+          <w:i/>
+          <w:iCs/>
+          <w:noProof/>
+        </w:rPr>
+        <w:instrText>HSJDRionegro</w:instrText>
+      </w:r>
+      <w:r>
+        <w:rPr>
+          <w:rFonts w:asciiTheme="minorHAnsi" w:hAnsiTheme="minorHAnsi" w:cstheme="minorHAnsi"/>
+          <w:b/>
+          <w:i/>
+          <w:iCs/>
+        </w:rPr>
+        <w:fldChar w:fldCharType="end"/>
+      </w:r>
+      <w:r>
+        <w:rPr>
+          <w:rFonts w:asciiTheme="minorHAnsi" w:hAnsiTheme="minorHAnsi" w:cstheme="minorHAnsi"/>
+          <w:b/>
+          <w:i/>
+          <w:iCs/>
+        </w:rPr>
+        <w:instrText xml:space="preserve"> = "</w:instrText>
+      </w:r>
+      <w:r>
+        <w:rPr>
+          <w:rFonts w:asciiTheme="minorHAnsi" w:hAnsiTheme="minorHAnsi" w:cstheme="minorHAnsi"/>
+          <w:b/>
+          <w:i/>
+          <w:iCs/>
+          <w:color w:val="000000"/>
+        </w:rPr>
+        <w:instrText>COPACABANA</w:instrText>
+      </w:r>
+      <w:r>
+        <w:rPr>
+          <w:rFonts w:asciiTheme="minorHAnsi" w:hAnsiTheme="minorHAnsi" w:cstheme="minorHAnsi"/>
+          <w:b/>
+          <w:i/>
+          <w:iCs/>
+        </w:rPr>
+        <w:instrText>" "</w:instrText>
+      </w:r>
+      <w:r>
+        <w:rPr>
+          <w:rFonts w:asciiTheme="minorHAnsi" w:hAnsiTheme="minorHAnsi" w:cstheme="minorHAnsi"/>
+          <w:b/>
+          <w:i/>
+          <w:iCs/>
+          <w:color w:val="000000"/>
+        </w:rPr>
+        <w:instrText>E.S.E. Hospital Santa Margarita</w:instrText>
       </w:r>
       <w:r>
         <w:rPr>
@@ -1084,25 +1267,45 @@
           <w:i/>
           <w:iCs/>
         </w:rPr>
-        <w:instrText xml:space="preserve"> = "ABEJORRAL</w:instrText>
-      </w:r>
-      <w:r>
-        <w:rPr>
-          <w:rFonts w:asciiTheme="minorHAnsi" w:hAnsiTheme="minorHAnsi" w:cstheme="minorHAnsi"/>
-          <w:b/>
-          <w:i/>
-          <w:iCs/>
-        </w:rPr>
-        <w:instrText xml:space="preserve"> SP</w:instrText>
-      </w:r>
-      <w:r>
-        <w:rPr>
-          <w:rFonts w:asciiTheme="minorHAnsi" w:hAnsiTheme="minorHAnsi" w:cstheme="minorHAnsi"/>
-          <w:b/>
-          <w:i/>
-          <w:iCs/>
-        </w:rPr>
-        <w:instrText xml:space="preserve">" "E.S.E. Hospital San Juan De Dios Abejorral" </w:instrText>
+        <w:instrText xml:space="preserve"> = "</w:instrText>
+      </w:r>
+      <w:r>
+        <w:rPr>
+          <w:rFonts w:asciiTheme="minorHAnsi" w:hAnsiTheme="minorHAnsi" w:cstheme="minorHAnsi"/>
+          <w:b/>
+          <w:i/>
+          <w:iCs/>
+          <w:color w:val="000000"/>
+        </w:rPr>
+        <w:instrText>COPACABANA - SALUD P.</w:instrText>
+      </w:r>
+      <w:r>
+        <w:rPr>
+          <w:rFonts w:asciiTheme="minorHAnsi" w:hAnsiTheme="minorHAnsi" w:cstheme="minorHAnsi"/>
+          <w:b/>
+          <w:i/>
+          <w:iCs/>
+        </w:rPr>
+        <w:instrText>" "</w:instrText>
+      </w:r>
+      <w:r>
+        <w:rPr>
+          <w:rFonts w:asciiTheme="minorHAnsi" w:hAnsiTheme="minorHAnsi" w:cstheme="minorHAnsi"/>
+          <w:b/>
+          <w:i/>
+          <w:iCs/>
+          <w:color w:val="000000"/>
+        </w:rPr>
+        <w:instrText>E.S.E. Hospital Santa Margarita - Programa Salud Pública</w:instrText>
+      </w:r>
+      <w:r>
+        <w:rPr>
+          <w:rFonts w:asciiTheme="minorHAnsi" w:hAnsiTheme="minorHAnsi" w:cstheme="minorHAnsi"/>
+          <w:b/>
+          <w:i/>
+          <w:iCs/>
+        </w:rPr>
+        <w:instrText xml:space="preserve">" </w:instrText>
       </w:r>
       <w:r>
         <w:rPr>
@@ -1184,16 +1387,36 @@
           <w:i/>
           <w:iCs/>
         </w:rPr>
-        <w:instrText xml:space="preserve"> = "ABEJORRAL - BUEN COMIENZO" "E.S.E. Hospital San Juan de Dios Abejorral</w:instrText>
-      </w:r>
-      <w:r>
-        <w:rPr>
-          <w:rFonts w:asciiTheme="minorHAnsi" w:hAnsiTheme="minorHAnsi" w:cstheme="minorHAnsi"/>
-          <w:b/>
-          <w:i/>
-          <w:iCs/>
-        </w:rPr>
-        <w:instrText xml:space="preserve"> - Programa Buen Comienzo</w:instrText>
+        <w:instrText xml:space="preserve"> = "</w:instrText>
+      </w:r>
+      <w:r>
+        <w:rPr>
+          <w:rFonts w:asciiTheme="minorHAnsi" w:hAnsiTheme="minorHAnsi" w:cstheme="minorHAnsi"/>
+          <w:b/>
+          <w:i/>
+          <w:iCs/>
+          <w:color w:val="000000"/>
+        </w:rPr>
+        <w:instrText>ITAGUI</w:instrText>
+      </w:r>
+      <w:r>
+        <w:rPr>
+          <w:rFonts w:asciiTheme="minorHAnsi" w:hAnsiTheme="minorHAnsi" w:cstheme="minorHAnsi"/>
+          <w:b/>
+          <w:i/>
+          <w:iCs/>
+        </w:rPr>
+        <w:instrText>" "</w:instrText>
+      </w:r>
+      <w:r>
+        <w:rPr>
+          <w:rFonts w:asciiTheme="minorHAnsi" w:hAnsiTheme="minorHAnsi" w:cstheme="minorHAnsi"/>
+          <w:b/>
+          <w:i/>
+          <w:iCs/>
+          <w:color w:val="000000"/>
+        </w:rPr>
+        <w:instrText>E.S.E. Hospital San Rafael Itagui</w:instrText>
       </w:r>
       <w:r>
         <w:rPr>
@@ -1284,16 +1507,36 @@
           <w:i/>
           <w:iCs/>
         </w:rPr>
-        <w:instrText xml:space="preserve"> = "ABEJORRAL - SALUD P." "E.S.E. Hospital San Juan de Dios Abejorral</w:instrText>
-      </w:r>
-      <w:r>
-        <w:rPr>
-          <w:rFonts w:asciiTheme="minorHAnsi" w:hAnsiTheme="minorHAnsi" w:cstheme="minorHAnsi"/>
-          <w:b/>
-          <w:i/>
-          <w:iCs/>
-        </w:rPr>
-        <w:instrText xml:space="preserve"> - Programa Salud Pública</w:instrText>
+        <w:instrText xml:space="preserve"> = "</w:instrText>
+      </w:r>
+      <w:r>
+        <w:rPr>
+          <w:rFonts w:asciiTheme="minorHAnsi" w:hAnsiTheme="minorHAnsi" w:cstheme="minorHAnsi"/>
+          <w:b/>
+          <w:i/>
+          <w:iCs/>
+          <w:color w:val="000000"/>
+        </w:rPr>
+        <w:instrText>SAMEIN</w:instrText>
+      </w:r>
+      <w:r>
+        <w:rPr>
+          <w:rFonts w:asciiTheme="minorHAnsi" w:hAnsiTheme="minorHAnsi" w:cstheme="minorHAnsi"/>
+          <w:b/>
+          <w:i/>
+          <w:iCs/>
+        </w:rPr>
+        <w:instrText>" "</w:instrText>
+      </w:r>
+      <w:r>
+        <w:rPr>
+          <w:rFonts w:asciiTheme="minorHAnsi" w:hAnsiTheme="minorHAnsi" w:cstheme="minorHAnsi"/>
+          <w:b/>
+          <w:i/>
+          <w:iCs/>
+          <w:color w:val="000000"/>
+        </w:rPr>
+        <w:instrText>I.P.S. Samein S.A.</w:instrText>
       </w:r>
       <w:r>
         <w:rPr>
@@ -1384,7 +1627,26 @@
           <w:i/>
           <w:iCs/>
         </w:rPr>
-        <w:instrText xml:space="preserve"> = "BETANIA" "E.S.E. Hospital San Antonio de Betania" </w:instrText>
+        <w:instrText xml:space="preserve"> = "</w:instrText>
+      </w:r>
+      <w:r>
+        <w:rPr>
+          <w:rFonts w:asciiTheme="minorHAnsi" w:hAnsiTheme="minorHAnsi" w:cstheme="minorHAnsi"/>
+          <w:b/>
+          <w:i/>
+          <w:iCs/>
+          <w:color w:val="000000"/>
+        </w:rPr>
+        <w:instrText>STA GERTRUDIS</w:instrText>
+      </w:r>
+      <w:r>
+        <w:rPr>
+          <w:rFonts w:asciiTheme="minorHAnsi" w:hAnsiTheme="minorHAnsi" w:cstheme="minorHAnsi"/>
+          <w:b/>
+          <w:i/>
+          <w:iCs/>
+        </w:rPr>
+        <w:instrText xml:space="preserve">" "E.S.E. Santa Gertrudis" </w:instrText>
       </w:r>
       <w:r>
         <w:rPr>
@@ -1466,7 +1728,26 @@
           <w:i/>
           <w:iCs/>
         </w:rPr>
-        <w:instrText xml:space="preserve"> = "BETANIA - BUEN COMIENZO" "E.S.E. Hospital San Antonio de Betania" </w:instrText>
+        <w:instrText xml:space="preserve"> = "</w:instrText>
+      </w:r>
+      <w:r>
+        <w:rPr>
+          <w:rFonts w:asciiTheme="minorHAnsi" w:hAnsiTheme="minorHAnsi" w:cstheme="minorHAnsi"/>
+          <w:b/>
+          <w:i/>
+          <w:iCs/>
+          <w:color w:val="000000"/>
+        </w:rPr>
+        <w:instrText>SAN LUIS</w:instrText>
+      </w:r>
+      <w:r>
+        <w:rPr>
+          <w:rFonts w:asciiTheme="minorHAnsi" w:hAnsiTheme="minorHAnsi" w:cstheme="minorHAnsi"/>
+          <w:b/>
+          <w:i/>
+          <w:iCs/>
+        </w:rPr>
+        <w:instrText xml:space="preserve">" "E.S.E. Hospital San Rafael de San Luis" </w:instrText>
       </w:r>
       <w:r>
         <w:rPr>
@@ -1558,16 +1839,98 @@
           <w:iCs/>
           <w:color w:val="000000"/>
         </w:rPr>
-        <w:instrText>COPACABANA</w:instrText>
-      </w:r>
-      <w:r>
-        <w:rPr>
-          <w:rFonts w:asciiTheme="minorHAnsi" w:hAnsiTheme="minorHAnsi" w:cstheme="minorHAnsi"/>
-          <w:b/>
-          <w:i/>
-          <w:iCs/>
-        </w:rPr>
-        <w:instrText>" "</w:instrText>
+        <w:instrText>STA GERTRUDIS - ENTORNO S.</w:instrText>
+      </w:r>
+      <w:r>
+        <w:rPr>
+          <w:rFonts w:asciiTheme="minorHAnsi" w:hAnsiTheme="minorHAnsi" w:cstheme="minorHAnsi"/>
+          <w:b/>
+          <w:i/>
+          <w:iCs/>
+        </w:rPr>
+        <w:instrText xml:space="preserve">" "E.S.E. Santa Gertrudis - con el rograma Entorno Saludable" </w:instrText>
+      </w:r>
+      <w:r>
+        <w:rPr>
+          <w:rFonts w:asciiTheme="minorHAnsi" w:hAnsiTheme="minorHAnsi" w:cstheme="minorHAnsi"/>
+          <w:b/>
+          <w:i/>
+          <w:iCs/>
+        </w:rPr>
+        <w:fldChar w:fldCharType="end"/>
+      </w:r>
+      <w:r>
+        <w:rPr>
+          <w:rFonts w:asciiTheme="minorHAnsi" w:hAnsiTheme="minorHAnsi" w:cstheme="minorHAnsi"/>
+          <w:b/>
+          <w:i/>
+          <w:iCs/>
+        </w:rPr>
+        <w:fldChar w:fldCharType="begin"/>
+      </w:r>
+      <w:r>
+        <w:rPr>
+          <w:rFonts w:asciiTheme="minorHAnsi" w:hAnsiTheme="minorHAnsi" w:cstheme="minorHAnsi"/>
+          <w:b/>
+          <w:i/>
+          <w:iCs/>
+        </w:rPr>
+        <w:instrText xml:space="preserve"> IF </w:instrText>
+      </w:r>
+      <w:r>
+        <w:rPr>
+          <w:rFonts w:asciiTheme="minorHAnsi" w:hAnsiTheme="minorHAnsi" w:cstheme="minorHAnsi"/>
+          <w:b/>
+          <w:i/>
+          <w:iCs/>
+        </w:rPr>
+        <w:fldChar w:fldCharType="begin"/>
+      </w:r>
+      <w:r>
+        <w:rPr>
+          <w:rFonts w:asciiTheme="minorHAnsi" w:hAnsiTheme="minorHAnsi" w:cstheme="minorHAnsi"/>
+          <w:b/>
+          <w:i/>
+          <w:iCs/>
+        </w:rPr>
+        <w:instrText xml:space="preserve"> MERGEFIELD HOSPITAL </w:instrText>
+      </w:r>
+      <w:r>
+        <w:rPr>
+          <w:rFonts w:asciiTheme="minorHAnsi" w:hAnsiTheme="minorHAnsi" w:cstheme="minorHAnsi"/>
+          <w:b/>
+          <w:i/>
+          <w:iCs/>
+        </w:rPr>
+        <w:fldChar w:fldCharType="separate"/>
+      </w:r>
+      <w:r>
+        <w:rPr>
+          <w:rFonts w:asciiTheme="minorHAnsi" w:hAnsiTheme="minorHAnsi" w:cstheme="minorHAnsi"/>
+          <w:b/>
+          <w:i/>
+          <w:iCs/>
+          <w:noProof/>
+        </w:rPr>
+        <w:instrText>HSJDRionegro</w:instrText>
+      </w:r>
+      <w:r>
+        <w:rPr>
+          <w:rFonts w:asciiTheme="minorHAnsi" w:hAnsiTheme="minorHAnsi" w:cstheme="minorHAnsi"/>
+          <w:b/>
+          <w:i/>
+          <w:iCs/>
+        </w:rPr>
+        <w:fldChar w:fldCharType="end"/>
+      </w:r>
+      <w:r>
+        <w:rPr>
+          <w:rFonts w:asciiTheme="minorHAnsi" w:hAnsiTheme="minorHAnsi" w:cstheme="minorHAnsi"/>
+          <w:b/>
+          <w:i/>
+          <w:iCs/>
+        </w:rPr>
+        <w:instrText xml:space="preserve"> = "</w:instrText>
       </w:r>
       <w:r>
         <w:rPr>
@@ -1577,16 +1940,16 @@
           <w:iCs/>
           <w:color w:val="000000"/>
         </w:rPr>
-        <w:instrText>E.S.E. Hospital Santa Margarita</w:instrText>
-      </w:r>
-      <w:r>
-        <w:rPr>
-          <w:rFonts w:asciiTheme="minorHAnsi" w:hAnsiTheme="minorHAnsi" w:cstheme="minorHAnsi"/>
-          <w:b/>
-          <w:i/>
-          <w:iCs/>
-        </w:rPr>
-        <w:instrText xml:space="preserve">" </w:instrText>
+        <w:instrText>URRAO</w:instrText>
+      </w:r>
+      <w:r>
+        <w:rPr>
+          <w:rFonts w:asciiTheme="minorHAnsi" w:hAnsiTheme="minorHAnsi" w:cstheme="minorHAnsi"/>
+          <w:b/>
+          <w:i/>
+          <w:iCs/>
+        </w:rPr>
+        <w:instrText xml:space="preserve">" "E.S.E. Hospital Ivan Restrepo Gomez" </w:instrText>
       </w:r>
       <w:r>
         <w:rPr>
@@ -1678,807 +2041,6 @@
           <w:iCs/>
           <w:color w:val="000000"/>
         </w:rPr>
-        <w:instrText>COPACABANA - SALUD P.</w:instrText>
-      </w:r>
-      <w:r>
-        <w:rPr>
-          <w:rFonts w:asciiTheme="minorHAnsi" w:hAnsiTheme="minorHAnsi" w:cstheme="minorHAnsi"/>
-          <w:b/>
-          <w:i/>
-          <w:iCs/>
-        </w:rPr>
-        <w:instrText>" "</w:instrText>
-      </w:r>
-      <w:r>
-        <w:rPr>
-          <w:rFonts w:asciiTheme="minorHAnsi" w:hAnsiTheme="minorHAnsi" w:cstheme="minorHAnsi"/>
-          <w:b/>
-          <w:i/>
-          <w:iCs/>
-          <w:color w:val="000000"/>
-        </w:rPr>
-        <w:instrText>E.S.E. Hospital Santa Margarita</w:instrText>
-      </w:r>
-      <w:r>
-        <w:rPr>
-          <w:rFonts w:asciiTheme="minorHAnsi" w:hAnsiTheme="minorHAnsi" w:cstheme="minorHAnsi"/>
-          <w:b/>
-          <w:i/>
-          <w:iCs/>
-          <w:color w:val="000000"/>
-        </w:rPr>
-        <w:instrText xml:space="preserve"> - Programa Salud Pública</w:instrText>
-      </w:r>
-      <w:r>
-        <w:rPr>
-          <w:rFonts w:asciiTheme="minorHAnsi" w:hAnsiTheme="minorHAnsi" w:cstheme="minorHAnsi"/>
-          <w:b/>
-          <w:i/>
-          <w:iCs/>
-        </w:rPr>
-        <w:instrText xml:space="preserve">" </w:instrText>
-      </w:r>
-      <w:r>
-        <w:rPr>
-          <w:rFonts w:asciiTheme="minorHAnsi" w:hAnsiTheme="minorHAnsi" w:cstheme="minorHAnsi"/>
-          <w:b/>
-          <w:i/>
-          <w:iCs/>
-        </w:rPr>
-        <w:fldChar w:fldCharType="end"/>
-      </w:r>
-      <w:r>
-        <w:rPr>
-          <w:rFonts w:asciiTheme="minorHAnsi" w:hAnsiTheme="minorHAnsi" w:cstheme="minorHAnsi"/>
-          <w:b/>
-          <w:i/>
-          <w:iCs/>
-        </w:rPr>
-        <w:fldChar w:fldCharType="begin"/>
-      </w:r>
-      <w:r>
-        <w:rPr>
-          <w:rFonts w:asciiTheme="minorHAnsi" w:hAnsiTheme="minorHAnsi" w:cstheme="minorHAnsi"/>
-          <w:b/>
-          <w:i/>
-          <w:iCs/>
-        </w:rPr>
-        <w:instrText xml:space="preserve"> IF </w:instrText>
-      </w:r>
-      <w:r>
-        <w:rPr>
-          <w:rFonts w:asciiTheme="minorHAnsi" w:hAnsiTheme="minorHAnsi" w:cstheme="minorHAnsi"/>
-          <w:b/>
-          <w:i/>
-          <w:iCs/>
-        </w:rPr>
-        <w:fldChar w:fldCharType="begin"/>
-      </w:r>
-      <w:r>
-        <w:rPr>
-          <w:rFonts w:asciiTheme="minorHAnsi" w:hAnsiTheme="minorHAnsi" w:cstheme="minorHAnsi"/>
-          <w:b/>
-          <w:i/>
-          <w:iCs/>
-        </w:rPr>
-        <w:instrText xml:space="preserve"> MERGEFIELD HOSPITAL </w:instrText>
-      </w:r>
-      <w:r>
-        <w:rPr>
-          <w:rFonts w:asciiTheme="minorHAnsi" w:hAnsiTheme="minorHAnsi" w:cstheme="minorHAnsi"/>
-          <w:b/>
-          <w:i/>
-          <w:iCs/>
-        </w:rPr>
-        <w:fldChar w:fldCharType="separate"/>
-      </w:r>
-      <w:r>
-        <w:rPr>
-          <w:rFonts w:asciiTheme="minorHAnsi" w:hAnsiTheme="minorHAnsi" w:cstheme="minorHAnsi"/>
-          <w:b/>
-          <w:i/>
-          <w:iCs/>
-          <w:noProof/>
-        </w:rPr>
-        <w:instrText>HSJDRionegro</w:instrText>
-      </w:r>
-      <w:r>
-        <w:rPr>
-          <w:rFonts w:asciiTheme="minorHAnsi" w:hAnsiTheme="minorHAnsi" w:cstheme="minorHAnsi"/>
-          <w:b/>
-          <w:i/>
-          <w:iCs/>
-        </w:rPr>
-        <w:fldChar w:fldCharType="end"/>
-      </w:r>
-      <w:r>
-        <w:rPr>
-          <w:rFonts w:asciiTheme="minorHAnsi" w:hAnsiTheme="minorHAnsi" w:cstheme="minorHAnsi"/>
-          <w:b/>
-          <w:i/>
-          <w:iCs/>
-        </w:rPr>
-        <w:instrText xml:space="preserve"> = "</w:instrText>
-      </w:r>
-      <w:r>
-        <w:rPr>
-          <w:rFonts w:asciiTheme="minorHAnsi" w:hAnsiTheme="minorHAnsi" w:cstheme="minorHAnsi"/>
-          <w:b/>
-          <w:i/>
-          <w:iCs/>
-          <w:color w:val="000000"/>
-        </w:rPr>
-        <w:instrText>ITAGUI</w:instrText>
-      </w:r>
-      <w:r>
-        <w:rPr>
-          <w:rFonts w:asciiTheme="minorHAnsi" w:hAnsiTheme="minorHAnsi" w:cstheme="minorHAnsi"/>
-          <w:b/>
-          <w:i/>
-          <w:iCs/>
-        </w:rPr>
-        <w:instrText>" "</w:instrText>
-      </w:r>
-      <w:r>
-        <w:rPr>
-          <w:rFonts w:asciiTheme="minorHAnsi" w:hAnsiTheme="minorHAnsi" w:cstheme="minorHAnsi"/>
-          <w:b/>
-          <w:i/>
-          <w:iCs/>
-          <w:color w:val="000000"/>
-        </w:rPr>
-        <w:instrText>E.S.E. Hospital San Rafael Itagui</w:instrText>
-      </w:r>
-      <w:r>
-        <w:rPr>
-          <w:rFonts w:asciiTheme="minorHAnsi" w:hAnsiTheme="minorHAnsi" w:cstheme="minorHAnsi"/>
-          <w:b/>
-          <w:i/>
-          <w:iCs/>
-        </w:rPr>
-        <w:instrText xml:space="preserve">" </w:instrText>
-      </w:r>
-      <w:r>
-        <w:rPr>
-          <w:rFonts w:asciiTheme="minorHAnsi" w:hAnsiTheme="minorHAnsi" w:cstheme="minorHAnsi"/>
-          <w:b/>
-          <w:i/>
-          <w:iCs/>
-        </w:rPr>
-        <w:fldChar w:fldCharType="end"/>
-      </w:r>
-      <w:r>
-        <w:rPr>
-          <w:rFonts w:asciiTheme="minorHAnsi" w:hAnsiTheme="minorHAnsi" w:cstheme="minorHAnsi"/>
-          <w:b/>
-          <w:i/>
-          <w:iCs/>
-        </w:rPr>
-        <w:fldChar w:fldCharType="begin"/>
-      </w:r>
-      <w:r>
-        <w:rPr>
-          <w:rFonts w:asciiTheme="minorHAnsi" w:hAnsiTheme="minorHAnsi" w:cstheme="minorHAnsi"/>
-          <w:b/>
-          <w:i/>
-          <w:iCs/>
-        </w:rPr>
-        <w:instrText xml:space="preserve"> IF </w:instrText>
-      </w:r>
-      <w:r>
-        <w:rPr>
-          <w:rFonts w:asciiTheme="minorHAnsi" w:hAnsiTheme="minorHAnsi" w:cstheme="minorHAnsi"/>
-          <w:b/>
-          <w:i/>
-          <w:iCs/>
-        </w:rPr>
-        <w:fldChar w:fldCharType="begin"/>
-      </w:r>
-      <w:r>
-        <w:rPr>
-          <w:rFonts w:asciiTheme="minorHAnsi" w:hAnsiTheme="minorHAnsi" w:cstheme="minorHAnsi"/>
-          <w:b/>
-          <w:i/>
-          <w:iCs/>
-        </w:rPr>
-        <w:instrText xml:space="preserve"> MERGEFIELD HOSPITAL </w:instrText>
-      </w:r>
-      <w:r>
-        <w:rPr>
-          <w:rFonts w:asciiTheme="minorHAnsi" w:hAnsiTheme="minorHAnsi" w:cstheme="minorHAnsi"/>
-          <w:b/>
-          <w:i/>
-          <w:iCs/>
-        </w:rPr>
-        <w:fldChar w:fldCharType="separate"/>
-      </w:r>
-      <w:r>
-        <w:rPr>
-          <w:rFonts w:asciiTheme="minorHAnsi" w:hAnsiTheme="minorHAnsi" w:cstheme="minorHAnsi"/>
-          <w:b/>
-          <w:i/>
-          <w:iCs/>
-          <w:noProof/>
-        </w:rPr>
-        <w:instrText>HSJDRionegro</w:instrText>
-      </w:r>
-      <w:r>
-        <w:rPr>
-          <w:rFonts w:asciiTheme="minorHAnsi" w:hAnsiTheme="minorHAnsi" w:cstheme="minorHAnsi"/>
-          <w:b/>
-          <w:i/>
-          <w:iCs/>
-        </w:rPr>
-        <w:fldChar w:fldCharType="end"/>
-      </w:r>
-      <w:r>
-        <w:rPr>
-          <w:rFonts w:asciiTheme="minorHAnsi" w:hAnsiTheme="minorHAnsi" w:cstheme="minorHAnsi"/>
-          <w:b/>
-          <w:i/>
-          <w:iCs/>
-        </w:rPr>
-        <w:instrText xml:space="preserve"> = "</w:instrText>
-      </w:r>
-      <w:r>
-        <w:rPr>
-          <w:rFonts w:asciiTheme="minorHAnsi" w:hAnsiTheme="minorHAnsi" w:cstheme="minorHAnsi"/>
-          <w:b/>
-          <w:i/>
-          <w:iCs/>
-          <w:color w:val="000000"/>
-        </w:rPr>
-        <w:instrText>SAMEIN</w:instrText>
-      </w:r>
-      <w:r>
-        <w:rPr>
-          <w:rFonts w:asciiTheme="minorHAnsi" w:hAnsiTheme="minorHAnsi" w:cstheme="minorHAnsi"/>
-          <w:b/>
-          <w:i/>
-          <w:iCs/>
-        </w:rPr>
-        <w:instrText>" "</w:instrText>
-      </w:r>
-      <w:r>
-        <w:rPr>
-          <w:rFonts w:asciiTheme="minorHAnsi" w:hAnsiTheme="minorHAnsi" w:cstheme="minorHAnsi"/>
-          <w:b/>
-          <w:i/>
-          <w:iCs/>
-          <w:color w:val="000000"/>
-        </w:rPr>
-        <w:instrText>I.P.S. Samein S.A.</w:instrText>
-      </w:r>
-      <w:r>
-        <w:rPr>
-          <w:rFonts w:asciiTheme="minorHAnsi" w:hAnsiTheme="minorHAnsi" w:cstheme="minorHAnsi"/>
-          <w:b/>
-          <w:i/>
-          <w:iCs/>
-        </w:rPr>
-        <w:instrText xml:space="preserve">" </w:instrText>
-      </w:r>
-      <w:r>
-        <w:rPr>
-          <w:rFonts w:asciiTheme="minorHAnsi" w:hAnsiTheme="minorHAnsi" w:cstheme="minorHAnsi"/>
-          <w:b/>
-          <w:i/>
-          <w:iCs/>
-        </w:rPr>
-        <w:fldChar w:fldCharType="end"/>
-      </w:r>
-      <w:r>
-        <w:rPr>
-          <w:rFonts w:asciiTheme="minorHAnsi" w:hAnsiTheme="minorHAnsi" w:cstheme="minorHAnsi"/>
-          <w:b/>
-          <w:i/>
-          <w:iCs/>
-        </w:rPr>
-        <w:fldChar w:fldCharType="begin"/>
-      </w:r>
-      <w:r>
-        <w:rPr>
-          <w:rFonts w:asciiTheme="minorHAnsi" w:hAnsiTheme="minorHAnsi" w:cstheme="minorHAnsi"/>
-          <w:b/>
-          <w:i/>
-          <w:iCs/>
-        </w:rPr>
-        <w:instrText xml:space="preserve"> IF </w:instrText>
-      </w:r>
-      <w:r>
-        <w:rPr>
-          <w:rFonts w:asciiTheme="minorHAnsi" w:hAnsiTheme="minorHAnsi" w:cstheme="minorHAnsi"/>
-          <w:b/>
-          <w:i/>
-          <w:iCs/>
-        </w:rPr>
-        <w:fldChar w:fldCharType="begin"/>
-      </w:r>
-      <w:r>
-        <w:rPr>
-          <w:rFonts w:asciiTheme="minorHAnsi" w:hAnsiTheme="minorHAnsi" w:cstheme="minorHAnsi"/>
-          <w:b/>
-          <w:i/>
-          <w:iCs/>
-        </w:rPr>
-        <w:instrText xml:space="preserve"> MERGEFIELD HOSPITAL </w:instrText>
-      </w:r>
-      <w:r>
-        <w:rPr>
-          <w:rFonts w:asciiTheme="minorHAnsi" w:hAnsiTheme="minorHAnsi" w:cstheme="minorHAnsi"/>
-          <w:b/>
-          <w:i/>
-          <w:iCs/>
-        </w:rPr>
-        <w:fldChar w:fldCharType="separate"/>
-      </w:r>
-      <w:r>
-        <w:rPr>
-          <w:rFonts w:asciiTheme="minorHAnsi" w:hAnsiTheme="minorHAnsi" w:cstheme="minorHAnsi"/>
-          <w:b/>
-          <w:i/>
-          <w:iCs/>
-          <w:noProof/>
-        </w:rPr>
-        <w:instrText>HSJDRionegro</w:instrText>
-      </w:r>
-      <w:r>
-        <w:rPr>
-          <w:rFonts w:asciiTheme="minorHAnsi" w:hAnsiTheme="minorHAnsi" w:cstheme="minorHAnsi"/>
-          <w:b/>
-          <w:i/>
-          <w:iCs/>
-        </w:rPr>
-        <w:fldChar w:fldCharType="end"/>
-      </w:r>
-      <w:r>
-        <w:rPr>
-          <w:rFonts w:asciiTheme="minorHAnsi" w:hAnsiTheme="minorHAnsi" w:cstheme="minorHAnsi"/>
-          <w:b/>
-          <w:i/>
-          <w:iCs/>
-        </w:rPr>
-        <w:instrText xml:space="preserve"> = "</w:instrText>
-      </w:r>
-      <w:r>
-        <w:rPr>
-          <w:rFonts w:asciiTheme="minorHAnsi" w:hAnsiTheme="minorHAnsi" w:cstheme="minorHAnsi"/>
-          <w:b/>
-          <w:i/>
-          <w:iCs/>
-          <w:color w:val="000000"/>
-        </w:rPr>
-        <w:instrText>STA GERTRUDIS</w:instrText>
-      </w:r>
-      <w:r>
-        <w:rPr>
-          <w:rFonts w:asciiTheme="minorHAnsi" w:hAnsiTheme="minorHAnsi" w:cstheme="minorHAnsi"/>
-          <w:b/>
-          <w:i/>
-          <w:iCs/>
-        </w:rPr>
-        <w:instrText>" "E.S.E. Santa Gertrudis</w:instrText>
-      </w:r>
-      <w:r>
-        <w:rPr>
-          <w:rFonts w:asciiTheme="minorHAnsi" w:hAnsiTheme="minorHAnsi" w:cstheme="minorHAnsi"/>
-          <w:b/>
-          <w:i/>
-          <w:iCs/>
-        </w:rPr>
-        <w:instrText xml:space="preserve">" </w:instrText>
-      </w:r>
-      <w:r>
-        <w:rPr>
-          <w:rFonts w:asciiTheme="minorHAnsi" w:hAnsiTheme="minorHAnsi" w:cstheme="minorHAnsi"/>
-          <w:b/>
-          <w:i/>
-          <w:iCs/>
-        </w:rPr>
-        <w:fldChar w:fldCharType="end"/>
-      </w:r>
-      <w:r>
-        <w:rPr>
-          <w:rFonts w:asciiTheme="minorHAnsi" w:hAnsiTheme="minorHAnsi" w:cstheme="minorHAnsi"/>
-          <w:b/>
-          <w:i/>
-          <w:iCs/>
-        </w:rPr>
-        <w:fldChar w:fldCharType="begin"/>
-      </w:r>
-      <w:r>
-        <w:rPr>
-          <w:rFonts w:asciiTheme="minorHAnsi" w:hAnsiTheme="minorHAnsi" w:cstheme="minorHAnsi"/>
-          <w:b/>
-          <w:i/>
-          <w:iCs/>
-        </w:rPr>
-        <w:instrText xml:space="preserve"> IF </w:instrText>
-      </w:r>
-      <w:r>
-        <w:rPr>
-          <w:rFonts w:asciiTheme="minorHAnsi" w:hAnsiTheme="minorHAnsi" w:cstheme="minorHAnsi"/>
-          <w:b/>
-          <w:i/>
-          <w:iCs/>
-        </w:rPr>
-        <w:fldChar w:fldCharType="begin"/>
-      </w:r>
-      <w:r>
-        <w:rPr>
-          <w:rFonts w:asciiTheme="minorHAnsi" w:hAnsiTheme="minorHAnsi" w:cstheme="minorHAnsi"/>
-          <w:b/>
-          <w:i/>
-          <w:iCs/>
-        </w:rPr>
-        <w:instrText xml:space="preserve"> MERGEFIELD HOSPITAL </w:instrText>
-      </w:r>
-      <w:r>
-        <w:rPr>
-          <w:rFonts w:asciiTheme="minorHAnsi" w:hAnsiTheme="minorHAnsi" w:cstheme="minorHAnsi"/>
-          <w:b/>
-          <w:i/>
-          <w:iCs/>
-        </w:rPr>
-        <w:fldChar w:fldCharType="separate"/>
-      </w:r>
-      <w:r>
-        <w:rPr>
-          <w:rFonts w:asciiTheme="minorHAnsi" w:hAnsiTheme="minorHAnsi" w:cstheme="minorHAnsi"/>
-          <w:b/>
-          <w:i/>
-          <w:iCs/>
-          <w:noProof/>
-        </w:rPr>
-        <w:instrText>HSJDRionegro</w:instrText>
-      </w:r>
-      <w:r>
-        <w:rPr>
-          <w:rFonts w:asciiTheme="minorHAnsi" w:hAnsiTheme="minorHAnsi" w:cstheme="minorHAnsi"/>
-          <w:b/>
-          <w:i/>
-          <w:iCs/>
-        </w:rPr>
-        <w:fldChar w:fldCharType="end"/>
-      </w:r>
-      <w:r>
-        <w:rPr>
-          <w:rFonts w:asciiTheme="minorHAnsi" w:hAnsiTheme="minorHAnsi" w:cstheme="minorHAnsi"/>
-          <w:b/>
-          <w:i/>
-          <w:iCs/>
-        </w:rPr>
-        <w:instrText xml:space="preserve"> = "</w:instrText>
-      </w:r>
-      <w:r>
-        <w:rPr>
-          <w:rFonts w:asciiTheme="minorHAnsi" w:hAnsiTheme="minorHAnsi" w:cstheme="minorHAnsi"/>
-          <w:b/>
-          <w:i/>
-          <w:iCs/>
-          <w:color w:val="000000"/>
-        </w:rPr>
-        <w:instrText>SAN LUIS</w:instrText>
-      </w:r>
-      <w:r>
-        <w:rPr>
-          <w:rFonts w:asciiTheme="minorHAnsi" w:hAnsiTheme="minorHAnsi" w:cstheme="minorHAnsi"/>
-          <w:b/>
-          <w:i/>
-          <w:iCs/>
-        </w:rPr>
-        <w:instrText xml:space="preserve">" "E.S.E. Hospital San Rafael de San Luis" </w:instrText>
-      </w:r>
-      <w:r>
-        <w:rPr>
-          <w:rFonts w:asciiTheme="minorHAnsi" w:hAnsiTheme="minorHAnsi" w:cstheme="minorHAnsi"/>
-          <w:b/>
-          <w:i/>
-          <w:iCs/>
-        </w:rPr>
-        <w:fldChar w:fldCharType="end"/>
-      </w:r>
-      <w:r>
-        <w:rPr>
-          <w:rFonts w:asciiTheme="minorHAnsi" w:hAnsiTheme="minorHAnsi" w:cstheme="minorHAnsi"/>
-          <w:b/>
-          <w:i/>
-          <w:iCs/>
-        </w:rPr>
-        <w:fldChar w:fldCharType="begin"/>
-      </w:r>
-      <w:r>
-        <w:rPr>
-          <w:rFonts w:asciiTheme="minorHAnsi" w:hAnsiTheme="minorHAnsi" w:cstheme="minorHAnsi"/>
-          <w:b/>
-          <w:i/>
-          <w:iCs/>
-        </w:rPr>
-        <w:instrText xml:space="preserve"> IF </w:instrText>
-      </w:r>
-      <w:r>
-        <w:rPr>
-          <w:rFonts w:asciiTheme="minorHAnsi" w:hAnsiTheme="minorHAnsi" w:cstheme="minorHAnsi"/>
-          <w:b/>
-          <w:i/>
-          <w:iCs/>
-        </w:rPr>
-        <w:fldChar w:fldCharType="begin"/>
-      </w:r>
-      <w:r>
-        <w:rPr>
-          <w:rFonts w:asciiTheme="minorHAnsi" w:hAnsiTheme="minorHAnsi" w:cstheme="minorHAnsi"/>
-          <w:b/>
-          <w:i/>
-          <w:iCs/>
-        </w:rPr>
-        <w:instrText xml:space="preserve"> MERGEFIELD HOSPITAL </w:instrText>
-      </w:r>
-      <w:r>
-        <w:rPr>
-          <w:rFonts w:asciiTheme="minorHAnsi" w:hAnsiTheme="minorHAnsi" w:cstheme="minorHAnsi"/>
-          <w:b/>
-          <w:i/>
-          <w:iCs/>
-        </w:rPr>
-        <w:fldChar w:fldCharType="separate"/>
-      </w:r>
-      <w:r>
-        <w:rPr>
-          <w:rFonts w:asciiTheme="minorHAnsi" w:hAnsiTheme="minorHAnsi" w:cstheme="minorHAnsi"/>
-          <w:b/>
-          <w:i/>
-          <w:iCs/>
-          <w:noProof/>
-        </w:rPr>
-        <w:instrText>HSJDRionegro</w:instrText>
-      </w:r>
-      <w:r>
-        <w:rPr>
-          <w:rFonts w:asciiTheme="minorHAnsi" w:hAnsiTheme="minorHAnsi" w:cstheme="minorHAnsi"/>
-          <w:b/>
-          <w:i/>
-          <w:iCs/>
-        </w:rPr>
-        <w:fldChar w:fldCharType="end"/>
-      </w:r>
-      <w:r>
-        <w:rPr>
-          <w:rFonts w:asciiTheme="minorHAnsi" w:hAnsiTheme="minorHAnsi" w:cstheme="minorHAnsi"/>
-          <w:b/>
-          <w:i/>
-          <w:iCs/>
-        </w:rPr>
-        <w:instrText xml:space="preserve"> = "</w:instrText>
-      </w:r>
-      <w:r>
-        <w:rPr>
-          <w:rFonts w:asciiTheme="minorHAnsi" w:hAnsiTheme="minorHAnsi" w:cstheme="minorHAnsi"/>
-          <w:b/>
-          <w:i/>
-          <w:iCs/>
-          <w:color w:val="000000"/>
-        </w:rPr>
-        <w:instrText>STA GERTRUDIS - ENTORNO S.</w:instrText>
-      </w:r>
-      <w:r>
-        <w:rPr>
-          <w:rFonts w:asciiTheme="minorHAnsi" w:hAnsiTheme="minorHAnsi" w:cstheme="minorHAnsi"/>
-          <w:b/>
-          <w:i/>
-          <w:iCs/>
-        </w:rPr>
-        <w:instrText xml:space="preserve">" "E.S.E. Santa Gertrudis - </w:instrText>
-      </w:r>
-      <w:r>
-        <w:rPr>
-          <w:rFonts w:asciiTheme="minorHAnsi" w:hAnsiTheme="minorHAnsi" w:cstheme="minorHAnsi"/>
-          <w:b/>
-          <w:i/>
-          <w:iCs/>
-        </w:rPr>
-        <w:instrText xml:space="preserve">con el </w:instrText>
-      </w:r>
-      <w:r>
-        <w:rPr>
-          <w:rFonts w:asciiTheme="minorHAnsi" w:hAnsiTheme="minorHAnsi" w:cstheme="minorHAnsi"/>
-          <w:b/>
-          <w:i/>
-          <w:iCs/>
-        </w:rPr>
-        <w:instrText xml:space="preserve">rograma Entorno Saludable" </w:instrText>
-      </w:r>
-      <w:r>
-        <w:rPr>
-          <w:rFonts w:asciiTheme="minorHAnsi" w:hAnsiTheme="minorHAnsi" w:cstheme="minorHAnsi"/>
-          <w:b/>
-          <w:i/>
-          <w:iCs/>
-        </w:rPr>
-        <w:fldChar w:fldCharType="end"/>
-      </w:r>
-      <w:r>
-        <w:rPr>
-          <w:rFonts w:asciiTheme="minorHAnsi" w:hAnsiTheme="minorHAnsi" w:cstheme="minorHAnsi"/>
-          <w:b/>
-          <w:i/>
-          <w:iCs/>
-        </w:rPr>
-        <w:fldChar w:fldCharType="begin"/>
-      </w:r>
-      <w:r>
-        <w:rPr>
-          <w:rFonts w:asciiTheme="minorHAnsi" w:hAnsiTheme="minorHAnsi" w:cstheme="minorHAnsi"/>
-          <w:b/>
-          <w:i/>
-          <w:iCs/>
-        </w:rPr>
-        <w:instrText xml:space="preserve"> IF </w:instrText>
-      </w:r>
-      <w:r>
-        <w:rPr>
-          <w:rFonts w:asciiTheme="minorHAnsi" w:hAnsiTheme="minorHAnsi" w:cstheme="minorHAnsi"/>
-          <w:b/>
-          <w:i/>
-          <w:iCs/>
-        </w:rPr>
-        <w:fldChar w:fldCharType="begin"/>
-      </w:r>
-      <w:r>
-        <w:rPr>
-          <w:rFonts w:asciiTheme="minorHAnsi" w:hAnsiTheme="minorHAnsi" w:cstheme="minorHAnsi"/>
-          <w:b/>
-          <w:i/>
-          <w:iCs/>
-        </w:rPr>
-        <w:instrText xml:space="preserve"> MERGEFIELD HOSPITAL </w:instrText>
-      </w:r>
-      <w:r>
-        <w:rPr>
-          <w:rFonts w:asciiTheme="minorHAnsi" w:hAnsiTheme="minorHAnsi" w:cstheme="minorHAnsi"/>
-          <w:b/>
-          <w:i/>
-          <w:iCs/>
-        </w:rPr>
-        <w:fldChar w:fldCharType="separate"/>
-      </w:r>
-      <w:r>
-        <w:rPr>
-          <w:rFonts w:asciiTheme="minorHAnsi" w:hAnsiTheme="minorHAnsi" w:cstheme="minorHAnsi"/>
-          <w:b/>
-          <w:i/>
-          <w:iCs/>
-          <w:noProof/>
-        </w:rPr>
-        <w:instrText>HSJDRionegro</w:instrText>
-      </w:r>
-      <w:r>
-        <w:rPr>
-          <w:rFonts w:asciiTheme="minorHAnsi" w:hAnsiTheme="minorHAnsi" w:cstheme="minorHAnsi"/>
-          <w:b/>
-          <w:i/>
-          <w:iCs/>
-        </w:rPr>
-        <w:fldChar w:fldCharType="end"/>
-      </w:r>
-      <w:r>
-        <w:rPr>
-          <w:rFonts w:asciiTheme="minorHAnsi" w:hAnsiTheme="minorHAnsi" w:cstheme="minorHAnsi"/>
-          <w:b/>
-          <w:i/>
-          <w:iCs/>
-        </w:rPr>
-        <w:instrText xml:space="preserve"> = "</w:instrText>
-      </w:r>
-      <w:r>
-        <w:rPr>
-          <w:rFonts w:asciiTheme="minorHAnsi" w:hAnsiTheme="minorHAnsi" w:cstheme="minorHAnsi"/>
-          <w:b/>
-          <w:i/>
-          <w:iCs/>
-          <w:color w:val="000000"/>
-        </w:rPr>
-        <w:instrText>URRAO</w:instrText>
-      </w:r>
-      <w:r>
-        <w:rPr>
-          <w:rFonts w:asciiTheme="minorHAnsi" w:hAnsiTheme="minorHAnsi" w:cstheme="minorHAnsi"/>
-          <w:b/>
-          <w:i/>
-          <w:iCs/>
-        </w:rPr>
-        <w:instrText xml:space="preserve">" "E.S.E. Hospital Ivan Restrepo Gomez" </w:instrText>
-      </w:r>
-      <w:r>
-        <w:rPr>
-          <w:rFonts w:asciiTheme="minorHAnsi" w:hAnsiTheme="minorHAnsi" w:cstheme="minorHAnsi"/>
-          <w:b/>
-          <w:i/>
-          <w:iCs/>
-        </w:rPr>
-        <w:fldChar w:fldCharType="end"/>
-      </w:r>
-      <w:r>
-        <w:rPr>
-          <w:rFonts w:asciiTheme="minorHAnsi" w:hAnsiTheme="minorHAnsi" w:cstheme="minorHAnsi"/>
-          <w:b/>
-          <w:i/>
-          <w:iCs/>
-        </w:rPr>
-        <w:fldChar w:fldCharType="begin"/>
-      </w:r>
-      <w:r>
-        <w:rPr>
-          <w:rFonts w:asciiTheme="minorHAnsi" w:hAnsiTheme="minorHAnsi" w:cstheme="minorHAnsi"/>
-          <w:b/>
-          <w:i/>
-          <w:iCs/>
-        </w:rPr>
-        <w:instrText xml:space="preserve"> IF </w:instrText>
-      </w:r>
-      <w:r>
-        <w:rPr>
-          <w:rFonts w:asciiTheme="minorHAnsi" w:hAnsiTheme="minorHAnsi" w:cstheme="minorHAnsi"/>
-          <w:b/>
-          <w:i/>
-          <w:iCs/>
-        </w:rPr>
-        <w:fldChar w:fldCharType="begin"/>
-      </w:r>
-      <w:r>
-        <w:rPr>
-          <w:rFonts w:asciiTheme="minorHAnsi" w:hAnsiTheme="minorHAnsi" w:cstheme="minorHAnsi"/>
-          <w:b/>
-          <w:i/>
-          <w:iCs/>
-        </w:rPr>
-        <w:instrText xml:space="preserve"> MERGEFIELD HOSPITAL </w:instrText>
-      </w:r>
-      <w:r>
-        <w:rPr>
-          <w:rFonts w:asciiTheme="minorHAnsi" w:hAnsiTheme="minorHAnsi" w:cstheme="minorHAnsi"/>
-          <w:b/>
-          <w:i/>
-          <w:iCs/>
-        </w:rPr>
-        <w:fldChar w:fldCharType="separate"/>
-      </w:r>
-      <w:r>
-        <w:rPr>
-          <w:rFonts w:asciiTheme="minorHAnsi" w:hAnsiTheme="minorHAnsi" w:cstheme="minorHAnsi"/>
-          <w:b/>
-          <w:i/>
-          <w:iCs/>
-          <w:noProof/>
-        </w:rPr>
-        <w:instrText>HSJDRionegro</w:instrText>
-      </w:r>
-      <w:r>
-        <w:rPr>
-          <w:rFonts w:asciiTheme="minorHAnsi" w:hAnsiTheme="minorHAnsi" w:cstheme="minorHAnsi"/>
-          <w:b/>
-          <w:i/>
-          <w:iCs/>
-        </w:rPr>
-        <w:fldChar w:fldCharType="end"/>
-      </w:r>
-      <w:r>
-        <w:rPr>
-          <w:rFonts w:asciiTheme="minorHAnsi" w:hAnsiTheme="minorHAnsi" w:cstheme="minorHAnsi"/>
-          <w:b/>
-          <w:i/>
-          <w:iCs/>
-        </w:rPr>
-        <w:instrText xml:space="preserve"> = "</w:instrText>
-      </w:r>
-      <w:r>
-        <w:rPr>
-          <w:rFonts w:asciiTheme="minorHAnsi" w:hAnsiTheme="minorHAnsi" w:cstheme="minorHAnsi"/>
-          <w:b/>
-          <w:i/>
-          <w:iCs/>
-          <w:color w:val="000000"/>
-        </w:rPr>
         <w:instrText>CIUDAD BOLIVAR</w:instrText>
       </w:r>
       <w:r>
@@ -2488,25 +2050,7 @@
           <w:i/>
           <w:iCs/>
         </w:rPr>
-        <w:instrText>" "E.S.E. Hospital La Merced</w:instrText>
-      </w:r>
-      <w:r>
-        <w:rPr>
-          <w:rFonts w:asciiTheme="minorHAnsi" w:hAnsiTheme="minorHAnsi" w:cstheme="minorHAnsi"/>
-          <w:b/>
-          <w:i/>
-          <w:iCs/>
-        </w:rPr>
-        <w:instrText xml:space="preserve"> - Ciudad Bolivar (Ant)</w:instrText>
-      </w:r>
-      <w:r>
-        <w:rPr>
-          <w:rFonts w:asciiTheme="minorHAnsi" w:hAnsiTheme="minorHAnsi" w:cstheme="minorHAnsi"/>
-          <w:b/>
-          <w:i/>
-          <w:iCs/>
-        </w:rPr>
-        <w:instrText xml:space="preserve">" </w:instrText>
+        <w:instrText xml:space="preserve">" "E.S.E. Hospital La Merced - Ciudad Bolivar (Ant)" </w:instrText>
       </w:r>
       <w:r>
         <w:rPr>
@@ -3770,7 +3314,6 @@
     <w:p>
       <w:pPr>
         <w:spacing w:afterLines="120" w:after="288" w:line="240" w:lineRule="auto"/>
-        <w:ind w:left="708"/>
         <w:jc w:val="both"/>
         <w:rPr>
           <w:rFonts w:asciiTheme="minorHAnsi" w:hAnsiTheme="minorHAnsi" w:cstheme="minorHAnsi"/>
@@ -6243,6 +5786,8 @@
           <w:rFonts w:asciiTheme="minorHAnsi" w:hAnsiTheme="minorHAnsi" w:cstheme="minorHAnsi"/>
           <w:i/>
           <w:iCs/>
+          <w:sz w:val="20"/>
+          <w:szCs w:val="20"/>
         </w:rPr>
       </w:pPr>
       <w:r>
@@ -6250,24 +5795,10 @@
           <w:rFonts w:asciiTheme="minorHAnsi" w:hAnsiTheme="minorHAnsi" w:cstheme="minorHAnsi"/>
           <w:i/>
           <w:iCs/>
-        </w:rPr>
-        <w:t>${</w:t>
-      </w:r>
-      <w:r>
-        <w:rPr>
-          <w:rFonts w:asciiTheme="minorHAnsi" w:hAnsiTheme="minorHAnsi" w:cstheme="minorHAnsi"/>
-          <w:i/>
-          <w:iCs/>
-        </w:rPr>
-        <w:t>LISTA_ACTIVIDADES</w:t>
-      </w:r>
-      <w:r>
-        <w:rPr>
-          <w:rFonts w:asciiTheme="minorHAnsi" w:hAnsiTheme="minorHAnsi" w:cstheme="minorHAnsi"/>
-          <w:i/>
-          <w:iCs/>
-        </w:rPr>
-        <w:t>}</w:t>
+          <w:sz w:val="20"/>
+          <w:szCs w:val="20"/>
+        </w:rPr>
+        <w:t>${LISTA_ACTIVIDADES}</w:t>
       </w:r>
     </w:p>
     <w:p>
@@ -15290,7 +14821,7 @@
         <v:path o:extrusionok="f" gradientshapeok="t" o:connecttype="rect"/>
         <o:lock v:ext="edit" aspectratio="t"/>
       </v:shapetype>
-      <v:shape id="Imagen 1302488667" o:spid="_x0000_i1025" type="#_x0000_t75" style="width:11.65pt;height:11.65pt;visibility:visible;mso-wrap-style:square" o:bullet="t">
+      <v:shape id="Imagen 1302488667" o:spid="_x0000_i1025" type="#_x0000_t75" style="width:11.7pt;height:11.7pt;visibility:visible;mso-wrap-style:square" o:bullet="t">
         <v:imagedata r:id="rId1" o:title=""/>
       </v:shape>
     </w:pict>

</xml_diff>

<commit_message>
refactor: adjust italics in agreement certificate template
</commit_message>
<xml_diff>
--- a/resources/templates/certificado_convenio_actividades_template.docx
+++ b/resources/templates/certificado_convenio_actividades_template.docx
@@ -6,6 +6,8 @@
       <w:pPr>
         <w:rPr>
           <w:rFonts w:asciiTheme="minorHAnsi" w:hAnsiTheme="minorHAnsi" w:cstheme="minorHAnsi"/>
+          <w:i/>
+          <w:iCs/>
         </w:rPr>
       </w:pPr>
       <w:r>
@@ -46,6 +48,8 @@
       <w:r>
         <w:rPr>
           <w:rFonts w:asciiTheme="minorHAnsi" w:hAnsiTheme="minorHAnsi" w:cstheme="minorHAnsi"/>
+          <w:i/>
+          <w:iCs/>
         </w:rPr>
         <w:t>${FECHA_CERTIFICADO}</w:t>
       </w:r>
@@ -77,6 +81,8 @@
           <w:rFonts w:asciiTheme="minorHAnsi" w:hAnsiTheme="minorHAnsi" w:cstheme="minorHAnsi"/>
           <w:b/>
           <w:bCs/>
+          <w:i/>
+          <w:iCs/>
         </w:rPr>
       </w:pPr>
     </w:p>
@@ -98,16 +104,7 @@
           <w:i/>
           <w:iCs/>
         </w:rPr>
-        <w:t>CERTIFICADO</w:t>
-      </w:r>
-      <w:r>
-        <w:rPr>
-          <w:rFonts w:asciiTheme="minorHAnsi" w:hAnsiTheme="minorHAnsi"/>
-          <w:b/>
-          <w:i/>
-          <w:iCs/>
-        </w:rPr>
-        <w:t xml:space="preserve"> CONVENIO DE EJECUCION SINDICAL</w:t>
+        <w:t>CERTIFICADO CONVENIO DE EJECUCION SINDICAL</w:t>
       </w:r>
     </w:p>
     <w:p>
@@ -148,15 +145,7 @@
           <w:i/>
           <w:iCs/>
         </w:rPr>
-        <w:t>certifica que</w:t>
-      </w:r>
-      <w:r>
-        <w:rPr>
-          <w:rFonts w:asciiTheme="minorHAnsi" w:hAnsiTheme="minorHAnsi" w:cstheme="minorHAnsi"/>
-          <w:i/>
-          <w:iCs/>
-        </w:rPr>
-        <w:t xml:space="preserve"> la persona </w:t>
+        <w:t xml:space="preserve">certifica que la persona </w:t>
       </w:r>
       <w:r>
         <w:rPr>
@@ -201,19 +190,115 @@
           <w:i/>
           <w:iCs/>
         </w:rPr>
-        <w:t xml:space="preserve">con documento de identidad </w:t>
-      </w:r>
-      <w:r>
-        <w:rPr>
-          <w:rFonts w:asciiTheme="minorHAnsi" w:hAnsiTheme="minorHAnsi" w:cstheme="minorHAnsi"/>
-          <w:i/>
-          <w:iCs/>
-        </w:rPr>
-        <w:t>${DOCUMENTO},</w:t>
-      </w:r>
-      <w:r>
-        <w:rPr>
-          <w:rFonts w:asciiTheme="minorHAnsi" w:hAnsiTheme="minorHAnsi" w:cstheme="minorHAnsi"/>
+        <w:t xml:space="preserve">con documento de identidad ${DOCUMENTO}, </w:t>
+      </w:r>
+      <w:r>
+        <w:rPr>
+          <w:i/>
+          <w:iCs/>
+        </w:rPr>
+        <w:t xml:space="preserve">${SE_ENCUENTRA_ESTUVO} </w:t>
+      </w:r>
+      <w:r>
+        <w:rPr>
+          <w:rFonts w:asciiTheme="minorHAnsi" w:hAnsiTheme="minorHAnsi" w:cstheme="minorHAnsi"/>
+          <w:i/>
+          <w:iCs/>
+        </w:rPr>
+        <w:t xml:space="preserve">afiliada </w:t>
+      </w:r>
+      <w:r>
+        <w:rPr>
+          <w:rFonts w:asciiTheme="minorHAnsi" w:hAnsiTheme="minorHAnsi" w:cstheme="minorHAnsi"/>
+          <w:i/>
+          <w:iCs/>
+        </w:rPr>
+        <w:fldChar w:fldCharType="begin"/>
+      </w:r>
+      <w:r>
+        <w:rPr>
+          <w:rFonts w:asciiTheme="minorHAnsi" w:hAnsiTheme="minorHAnsi" w:cstheme="minorHAnsi"/>
+          <w:i/>
+          <w:iCs/>
+        </w:rPr>
+        <w:instrText xml:space="preserve"> IF </w:instrText>
+      </w:r>
+      <w:r>
+        <w:rPr>
+          <w:rFonts w:asciiTheme="minorHAnsi" w:hAnsiTheme="minorHAnsi" w:cstheme="minorHAnsi"/>
+          <w:i/>
+          <w:iCs/>
+        </w:rPr>
+        <w:fldChar w:fldCharType="begin"/>
+      </w:r>
+      <w:r>
+        <w:rPr>
+          <w:rFonts w:asciiTheme="minorHAnsi" w:hAnsiTheme="minorHAnsi" w:cstheme="minorHAnsi"/>
+          <w:i/>
+          <w:iCs/>
+        </w:rPr>
+        <w:instrText xml:space="preserve"> MERGEFIELD SEXO </w:instrText>
+      </w:r>
+      <w:r>
+        <w:rPr>
+          <w:rFonts w:asciiTheme="minorHAnsi" w:hAnsiTheme="minorHAnsi" w:cstheme="minorHAnsi"/>
+          <w:i/>
+          <w:iCs/>
+        </w:rPr>
+        <w:fldChar w:fldCharType="separate"/>
+      </w:r>
+      <w:r>
+        <w:rPr>
+          <w:rFonts w:asciiTheme="minorHAnsi" w:hAnsiTheme="minorHAnsi" w:cstheme="minorHAnsi"/>
+          <w:i/>
+          <w:iCs/>
+          <w:noProof/>
+        </w:rPr>
+        <w:instrText>M</w:instrText>
+      </w:r>
+      <w:r>
+        <w:rPr>
+          <w:rFonts w:asciiTheme="minorHAnsi" w:hAnsiTheme="minorHAnsi" w:cstheme="minorHAnsi"/>
+          <w:i/>
+          <w:iCs/>
+        </w:rPr>
+        <w:fldChar w:fldCharType="end"/>
+      </w:r>
+      <w:r>
+        <w:rPr>
+          <w:rFonts w:asciiTheme="minorHAnsi" w:hAnsiTheme="minorHAnsi" w:cstheme="minorHAnsi"/>
+          <w:i/>
+          <w:iCs/>
+        </w:rPr>
+        <w:instrText xml:space="preserve"> = "F" "afiliada" "" </w:instrText>
+      </w:r>
+      <w:r>
+        <w:rPr>
+          <w:rFonts w:asciiTheme="minorHAnsi" w:hAnsiTheme="minorHAnsi" w:cstheme="minorHAnsi"/>
+          <w:i/>
+          <w:iCs/>
+        </w:rPr>
+        <w:fldChar w:fldCharType="end"/>
+      </w:r>
+      <w:r>
+        <w:rPr>
+          <w:rFonts w:asciiTheme="minorHAnsi" w:hAnsiTheme="minorHAnsi" w:cstheme="minorHAnsi"/>
+          <w:i/>
+          <w:iCs/>
+        </w:rPr>
+        <w:t xml:space="preserve">al Sindicato, a través de </w:t>
+      </w:r>
+      <w:r>
+        <w:rPr>
+          <w:b/>
+          <w:bCs/>
+          <w:i/>
+          <w:iCs/>
+        </w:rPr>
+        <w:t>${UN_CONVENIO_VARIOS_CONVENIOS}</w:t>
+      </w:r>
+      <w:r>
+        <w:rPr>
           <w:i/>
           <w:iCs/>
         </w:rPr>
@@ -221,21 +306,29 @@
       </w:r>
       <w:r>
         <w:rPr>
-          <w:i/>
-          <w:iCs/>
-        </w:rPr>
-        <w:t>${SE_ENCUENTRA_ESTUVO}</w:t>
-      </w:r>
-      <w:r>
-        <w:t xml:space="preserve"> </w:t>
-      </w:r>
-      <w:r>
-        <w:rPr>
-          <w:rFonts w:asciiTheme="minorHAnsi" w:hAnsiTheme="minorHAnsi" w:cstheme="minorHAnsi"/>
-          <w:i/>
-          <w:iCs/>
-        </w:rPr>
-        <w:t xml:space="preserve">afiliada </w:t>
+          <w:rFonts w:asciiTheme="minorHAnsi" w:hAnsiTheme="minorHAnsi" w:cstheme="minorHAnsi"/>
+          <w:b/>
+          <w:bCs/>
+          <w:i/>
+          <w:iCs/>
+        </w:rPr>
+        <w:t>de Ejecución Sindical</w:t>
+      </w:r>
+      <w:bookmarkEnd w:id="2"/>
+      <w:r>
+        <w:rPr>
+          <w:rFonts w:asciiTheme="minorHAnsi" w:hAnsiTheme="minorHAnsi" w:cstheme="minorHAnsi"/>
+          <w:i/>
+          <w:iCs/>
+        </w:rPr>
+        <w:t xml:space="preserve">, que </w:t>
+      </w:r>
+      <w:r>
+        <w:rPr>
+          <w:i/>
+          <w:iCs/>
+        </w:rPr>
+        <w:t>${DESARROLLA_ACTUALMENTE_DESARROLLO}</w:t>
       </w:r>
       <w:r>
         <w:rPr>
@@ -267,7 +360,7 @@
           <w:i/>
           <w:iCs/>
         </w:rPr>
-        <w:instrText xml:space="preserve"> MERGEFIELD SEXO </w:instrText>
+        <w:instrText xml:space="preserve"> MERGEFIELD ESTADO </w:instrText>
       </w:r>
       <w:r>
         <w:rPr>
@@ -284,129 +377,82 @@
           <w:iCs/>
           <w:noProof/>
         </w:rPr>
-        <w:instrText>M</w:instrText>
-      </w:r>
-      <w:r>
-        <w:rPr>
-          <w:rFonts w:asciiTheme="minorHAnsi" w:hAnsiTheme="minorHAnsi" w:cstheme="minorHAnsi"/>
-          <w:i/>
-          <w:iCs/>
-        </w:rPr>
-        <w:fldChar w:fldCharType="end"/>
-      </w:r>
-      <w:r>
-        <w:rPr>
-          <w:rFonts w:asciiTheme="minorHAnsi" w:hAnsiTheme="minorHAnsi" w:cstheme="minorHAnsi"/>
-          <w:i/>
-          <w:iCs/>
-        </w:rPr>
-        <w:instrText xml:space="preserve"> = "F" "afiliada" "" </w:instrText>
-      </w:r>
-      <w:r>
-        <w:rPr>
-          <w:rFonts w:asciiTheme="minorHAnsi" w:hAnsiTheme="minorHAnsi" w:cstheme="minorHAnsi"/>
-          <w:i/>
-          <w:iCs/>
-        </w:rPr>
-        <w:fldChar w:fldCharType="end"/>
-      </w:r>
-      <w:r>
-        <w:rPr>
-          <w:rFonts w:asciiTheme="minorHAnsi" w:hAnsiTheme="minorHAnsi" w:cstheme="minorHAnsi"/>
-          <w:i/>
-          <w:iCs/>
-        </w:rPr>
-        <w:t>al Sindicato</w:t>
-      </w:r>
-      <w:r>
-        <w:rPr>
-          <w:rFonts w:asciiTheme="minorHAnsi" w:hAnsiTheme="minorHAnsi" w:cstheme="minorHAnsi"/>
-          <w:i/>
-          <w:iCs/>
-        </w:rPr>
-        <w:t>,</w:t>
-      </w:r>
-      <w:r>
-        <w:rPr>
-          <w:rFonts w:asciiTheme="minorHAnsi" w:hAnsiTheme="minorHAnsi" w:cstheme="minorHAnsi"/>
-          <w:i/>
-          <w:iCs/>
-        </w:rPr>
-        <w:t xml:space="preserve"> a</w:t>
-      </w:r>
-      <w:r>
-        <w:rPr>
-          <w:rFonts w:asciiTheme="minorHAnsi" w:hAnsiTheme="minorHAnsi" w:cstheme="minorHAnsi"/>
-          <w:i/>
-          <w:iCs/>
-        </w:rPr>
-        <w:t xml:space="preserve"> través de</w:t>
-      </w:r>
-      <w:r>
-        <w:rPr>
-          <w:rFonts w:asciiTheme="minorHAnsi" w:hAnsiTheme="minorHAnsi" w:cstheme="minorHAnsi"/>
-          <w:i/>
-          <w:iCs/>
-        </w:rPr>
-        <w:t xml:space="preserve"> </w:t>
-      </w:r>
-      <w:r>
-        <w:rPr>
+        <w:instrText>ACTIVO</w:instrText>
+      </w:r>
+      <w:r>
+        <w:rPr>
+          <w:rFonts w:asciiTheme="minorHAnsi" w:hAnsiTheme="minorHAnsi" w:cstheme="minorHAnsi"/>
+          <w:i/>
+          <w:iCs/>
+        </w:rPr>
+        <w:fldChar w:fldCharType="end"/>
+      </w:r>
+      <w:r>
+        <w:rPr>
+          <w:rFonts w:asciiTheme="minorHAnsi" w:hAnsiTheme="minorHAnsi" w:cstheme="minorHAnsi"/>
+          <w:i/>
+          <w:iCs/>
+        </w:rPr>
+        <w:instrText xml:space="preserve"> = "NO ACTIVO" "desarrolló" "" </w:instrText>
+      </w:r>
+      <w:r>
+        <w:rPr>
+          <w:rFonts w:asciiTheme="minorHAnsi" w:hAnsiTheme="minorHAnsi" w:cstheme="minorHAnsi"/>
+          <w:i/>
+          <w:iCs/>
+        </w:rPr>
+        <w:fldChar w:fldCharType="end"/>
+      </w:r>
+      <w:r>
+        <w:rPr>
+          <w:rFonts w:asciiTheme="minorHAnsi" w:hAnsiTheme="minorHAnsi" w:cstheme="minorHAnsi"/>
+          <w:i/>
+          <w:iCs/>
+        </w:rPr>
+        <w:t xml:space="preserve"> en </w:t>
+      </w:r>
+      <w:r>
+        <w:rPr>
+          <w:rFonts w:asciiTheme="minorHAnsi" w:hAnsiTheme="minorHAnsi" w:cstheme="minorHAnsi"/>
           <w:b/>
           <w:bCs/>
           <w:i/>
           <w:iCs/>
         </w:rPr>
-        <w:t>${UN_CONVENIO_VARIOS_CONVENIOS}</w:t>
-      </w:r>
-      <w:r>
-        <w:t xml:space="preserve"> </w:t>
-      </w:r>
-      <w:r>
-        <w:rPr>
-          <w:rFonts w:asciiTheme="minorHAnsi" w:hAnsiTheme="minorHAnsi" w:cstheme="minorHAnsi"/>
+        <w:t>${</w:t>
+      </w:r>
+      <w:r>
+        <w:rPr>
           <w:b/>
           <w:bCs/>
           <w:i/>
           <w:iCs/>
         </w:rPr>
-        <w:t>de Ejecución Sindical</w:t>
-      </w:r>
-      <w:bookmarkEnd w:id="2"/>
-      <w:r>
-        <w:rPr>
-          <w:rFonts w:asciiTheme="minorHAnsi" w:hAnsiTheme="minorHAnsi" w:cstheme="minorHAnsi"/>
-          <w:i/>
-          <w:iCs/>
-        </w:rPr>
-        <w:t xml:space="preserve">, </w:t>
-      </w:r>
-      <w:r>
-        <w:rPr>
-          <w:rFonts w:asciiTheme="minorHAnsi" w:hAnsiTheme="minorHAnsi" w:cstheme="minorHAnsi"/>
-          <w:i/>
-          <w:iCs/>
-        </w:rPr>
-        <w:t xml:space="preserve">que </w:t>
-      </w:r>
-      <w:r>
-        <w:rPr>
-          <w:i/>
-          <w:iCs/>
-        </w:rPr>
-        <w:t>${DESARROLLA_ACTUALMENTE_DESARROLLO}</w:t>
-      </w:r>
-      <w:r>
-        <w:rPr>
-          <w:rFonts w:asciiTheme="minorHAnsi" w:hAnsiTheme="minorHAnsi" w:cstheme="minorHAnsi"/>
-          <w:i/>
-          <w:iCs/>
-        </w:rPr>
-        <w:fldChar w:fldCharType="begin"/>
-      </w:r>
-      <w:r>
-        <w:rPr>
-          <w:rFonts w:asciiTheme="minorHAnsi" w:hAnsiTheme="minorHAnsi" w:cstheme="minorHAnsi"/>
+        <w:t>HOSPITAL</w:t>
+      </w:r>
+      <w:r>
+        <w:rPr>
+          <w:rFonts w:asciiTheme="minorHAnsi" w:hAnsiTheme="minorHAnsi" w:cstheme="minorHAnsi"/>
+          <w:b/>
+          <w:bCs/>
+          <w:i/>
+          <w:iCs/>
+        </w:rPr>
+        <w:t>}</w:t>
+      </w:r>
+      <w:r>
+        <w:rPr>
+          <w:rFonts w:asciiTheme="minorHAnsi" w:hAnsiTheme="minorHAnsi" w:cstheme="minorHAnsi"/>
+          <w:b/>
+          <w:i/>
+          <w:iCs/>
+        </w:rPr>
+        <w:fldChar w:fldCharType="begin"/>
+      </w:r>
+      <w:r>
+        <w:rPr>
+          <w:rFonts w:asciiTheme="minorHAnsi" w:hAnsiTheme="minorHAnsi" w:cstheme="minorHAnsi"/>
+          <w:b/>
           <w:i/>
           <w:iCs/>
         </w:rPr>
@@ -415,22 +461,25 @@
       <w:r>
         <w:rPr>
           <w:rFonts w:asciiTheme="minorHAnsi" w:hAnsiTheme="minorHAnsi" w:cstheme="minorHAnsi"/>
-          <w:i/>
-          <w:iCs/>
-        </w:rPr>
-        <w:fldChar w:fldCharType="begin"/>
-      </w:r>
-      <w:r>
-        <w:rPr>
-          <w:rFonts w:asciiTheme="minorHAnsi" w:hAnsiTheme="minorHAnsi" w:cstheme="minorHAnsi"/>
-          <w:i/>
-          <w:iCs/>
-        </w:rPr>
-        <w:instrText xml:space="preserve"> MERGEFIELD ESTADO </w:instrText>
-      </w:r>
-      <w:r>
-        <w:rPr>
-          <w:rFonts w:asciiTheme="minorHAnsi" w:hAnsiTheme="minorHAnsi" w:cstheme="minorHAnsi"/>
+          <w:b/>
+          <w:i/>
+          <w:iCs/>
+        </w:rPr>
+        <w:fldChar w:fldCharType="begin"/>
+      </w:r>
+      <w:r>
+        <w:rPr>
+          <w:rFonts w:asciiTheme="minorHAnsi" w:hAnsiTheme="minorHAnsi" w:cstheme="minorHAnsi"/>
+          <w:b/>
+          <w:i/>
+          <w:iCs/>
+        </w:rPr>
+        <w:instrText xml:space="preserve"> MERGEFIELD HOSPITAL </w:instrText>
+      </w:r>
+      <w:r>
+        <w:rPr>
+          <w:rFonts w:asciiTheme="minorHAnsi" w:hAnsiTheme="minorHAnsi" w:cstheme="minorHAnsi"/>
+          <w:b/>
           <w:i/>
           <w:iCs/>
         </w:rPr>
@@ -439,68 +488,1635 @@
       <w:r>
         <w:rPr>
           <w:rFonts w:asciiTheme="minorHAnsi" w:hAnsiTheme="minorHAnsi" w:cstheme="minorHAnsi"/>
+          <w:b/>
           <w:i/>
           <w:iCs/>
           <w:noProof/>
         </w:rPr>
-        <w:instrText>ACTIVO</w:instrText>
-      </w:r>
-      <w:r>
-        <w:rPr>
-          <w:rFonts w:asciiTheme="minorHAnsi" w:hAnsiTheme="minorHAnsi" w:cstheme="minorHAnsi"/>
-          <w:i/>
-          <w:iCs/>
-        </w:rPr>
-        <w:fldChar w:fldCharType="end"/>
-      </w:r>
-      <w:r>
-        <w:rPr>
-          <w:rFonts w:asciiTheme="minorHAnsi" w:hAnsiTheme="minorHAnsi" w:cstheme="minorHAnsi"/>
-          <w:i/>
-          <w:iCs/>
-        </w:rPr>
-        <w:instrText xml:space="preserve"> = "NO ACTIVO" "desarrolló" "" </w:instrText>
-      </w:r>
-      <w:r>
-        <w:rPr>
-          <w:rFonts w:asciiTheme="minorHAnsi" w:hAnsiTheme="minorHAnsi" w:cstheme="minorHAnsi"/>
-          <w:i/>
-          <w:iCs/>
-        </w:rPr>
-        <w:fldChar w:fldCharType="end"/>
-      </w:r>
-      <w:r>
-        <w:rPr>
-          <w:rFonts w:asciiTheme="minorHAnsi" w:hAnsiTheme="minorHAnsi" w:cstheme="minorHAnsi"/>
-          <w:i/>
-          <w:iCs/>
-        </w:rPr>
-        <w:t xml:space="preserve"> en </w:t>
-      </w:r>
-      <w:r>
-        <w:rPr>
-          <w:rFonts w:asciiTheme="minorHAnsi" w:hAnsiTheme="minorHAnsi" w:cstheme="minorHAnsi"/>
-          <w:b/>
+        <w:instrText>HSJDRionegro</w:instrText>
+      </w:r>
+      <w:r>
+        <w:rPr>
+          <w:rFonts w:asciiTheme="minorHAnsi" w:hAnsiTheme="minorHAnsi" w:cstheme="minorHAnsi"/>
+          <w:b/>
+          <w:i/>
+          <w:iCs/>
+        </w:rPr>
+        <w:fldChar w:fldCharType="end"/>
+      </w:r>
+      <w:r>
+        <w:rPr>
+          <w:rFonts w:asciiTheme="minorHAnsi" w:hAnsiTheme="minorHAnsi" w:cstheme="minorHAnsi"/>
+          <w:b/>
+          <w:i/>
+          <w:iCs/>
+        </w:rPr>
+        <w:instrText xml:space="preserve"> = "BARBOSA" "E.S.E. Hospital San Vicente de Paul - Barbosa (Ant)" </w:instrText>
+      </w:r>
+      <w:r>
+        <w:rPr>
+          <w:rFonts w:asciiTheme="minorHAnsi" w:hAnsiTheme="minorHAnsi" w:cstheme="minorHAnsi"/>
+          <w:b/>
+          <w:i/>
+          <w:iCs/>
+        </w:rPr>
+        <w:fldChar w:fldCharType="end"/>
+      </w:r>
+      <w:r>
+        <w:rPr>
+          <w:rFonts w:asciiTheme="minorHAnsi" w:hAnsiTheme="minorHAnsi" w:cstheme="minorHAnsi"/>
+          <w:b/>
+          <w:i/>
+          <w:iCs/>
+        </w:rPr>
+        <w:fldChar w:fldCharType="begin"/>
+      </w:r>
+      <w:r>
+        <w:rPr>
+          <w:rFonts w:asciiTheme="minorHAnsi" w:hAnsiTheme="minorHAnsi" w:cstheme="minorHAnsi"/>
+          <w:b/>
+          <w:i/>
+          <w:iCs/>
+        </w:rPr>
+        <w:instrText xml:space="preserve"> IF </w:instrText>
+      </w:r>
+      <w:r>
+        <w:rPr>
+          <w:rFonts w:asciiTheme="minorHAnsi" w:hAnsiTheme="minorHAnsi" w:cstheme="minorHAnsi"/>
+          <w:b/>
+          <w:i/>
+          <w:iCs/>
+        </w:rPr>
+        <w:fldChar w:fldCharType="begin"/>
+      </w:r>
+      <w:r>
+        <w:rPr>
+          <w:rFonts w:asciiTheme="minorHAnsi" w:hAnsiTheme="minorHAnsi" w:cstheme="minorHAnsi"/>
+          <w:b/>
+          <w:i/>
+          <w:iCs/>
+        </w:rPr>
+        <w:instrText xml:space="preserve"> MERGEFIELD HOSPITAL </w:instrText>
+      </w:r>
+      <w:r>
+        <w:rPr>
+          <w:rFonts w:asciiTheme="minorHAnsi" w:hAnsiTheme="minorHAnsi" w:cstheme="minorHAnsi"/>
+          <w:b/>
+          <w:i/>
+          <w:iCs/>
+        </w:rPr>
+        <w:fldChar w:fldCharType="separate"/>
+      </w:r>
+      <w:r>
+        <w:rPr>
+          <w:rFonts w:asciiTheme="minorHAnsi" w:hAnsiTheme="minorHAnsi" w:cstheme="minorHAnsi"/>
+          <w:b/>
+          <w:i/>
+          <w:iCs/>
+          <w:noProof/>
+        </w:rPr>
+        <w:instrText>HSJDRionegro</w:instrText>
+      </w:r>
+      <w:r>
+        <w:rPr>
+          <w:rFonts w:asciiTheme="minorHAnsi" w:hAnsiTheme="minorHAnsi" w:cstheme="minorHAnsi"/>
+          <w:b/>
+          <w:i/>
+          <w:iCs/>
+        </w:rPr>
+        <w:fldChar w:fldCharType="end"/>
+      </w:r>
+      <w:r>
+        <w:rPr>
+          <w:rFonts w:asciiTheme="minorHAnsi" w:hAnsiTheme="minorHAnsi" w:cstheme="minorHAnsi"/>
+          <w:b/>
+          <w:i/>
+          <w:iCs/>
+        </w:rPr>
+        <w:instrText xml:space="preserve"> = "PUERTO BERRIO" "E.S.E. Hospital La Cruz" </w:instrText>
+      </w:r>
+      <w:r>
+        <w:rPr>
+          <w:rFonts w:asciiTheme="minorHAnsi" w:hAnsiTheme="minorHAnsi" w:cstheme="minorHAnsi"/>
+          <w:b/>
+          <w:i/>
+          <w:iCs/>
+        </w:rPr>
+        <w:fldChar w:fldCharType="end"/>
+      </w:r>
+      <w:r>
+        <w:rPr>
+          <w:rFonts w:asciiTheme="minorHAnsi" w:hAnsiTheme="minorHAnsi" w:cstheme="minorHAnsi"/>
+          <w:b/>
+          <w:i/>
+          <w:iCs/>
+        </w:rPr>
+        <w:fldChar w:fldCharType="begin"/>
+      </w:r>
+      <w:r>
+        <w:rPr>
+          <w:rFonts w:asciiTheme="minorHAnsi" w:hAnsiTheme="minorHAnsi" w:cstheme="minorHAnsi"/>
+          <w:b/>
+          <w:i/>
+          <w:iCs/>
+        </w:rPr>
+        <w:instrText xml:space="preserve"> IF </w:instrText>
+      </w:r>
+      <w:r>
+        <w:rPr>
+          <w:rFonts w:asciiTheme="minorHAnsi" w:hAnsiTheme="minorHAnsi" w:cstheme="minorHAnsi"/>
+          <w:b/>
+          <w:i/>
+          <w:iCs/>
+        </w:rPr>
+        <w:fldChar w:fldCharType="begin"/>
+      </w:r>
+      <w:r>
+        <w:rPr>
+          <w:rFonts w:asciiTheme="minorHAnsi" w:hAnsiTheme="minorHAnsi" w:cstheme="minorHAnsi"/>
+          <w:b/>
+          <w:i/>
+          <w:iCs/>
+        </w:rPr>
+        <w:instrText xml:space="preserve"> MERGEFIELD HOSPITAL </w:instrText>
+      </w:r>
+      <w:r>
+        <w:rPr>
+          <w:rFonts w:asciiTheme="minorHAnsi" w:hAnsiTheme="minorHAnsi" w:cstheme="minorHAnsi"/>
+          <w:b/>
+          <w:i/>
+          <w:iCs/>
+        </w:rPr>
+        <w:fldChar w:fldCharType="separate"/>
+      </w:r>
+      <w:r>
+        <w:rPr>
+          <w:rFonts w:asciiTheme="minorHAnsi" w:hAnsiTheme="minorHAnsi" w:cstheme="minorHAnsi"/>
+          <w:b/>
+          <w:i/>
+          <w:iCs/>
+          <w:noProof/>
+        </w:rPr>
+        <w:instrText>HSJDRionegro</w:instrText>
+      </w:r>
+      <w:r>
+        <w:rPr>
+          <w:rFonts w:asciiTheme="minorHAnsi" w:hAnsiTheme="minorHAnsi" w:cstheme="minorHAnsi"/>
+          <w:b/>
+          <w:i/>
+          <w:iCs/>
+        </w:rPr>
+        <w:fldChar w:fldCharType="end"/>
+      </w:r>
+      <w:r>
+        <w:rPr>
+          <w:rFonts w:asciiTheme="minorHAnsi" w:hAnsiTheme="minorHAnsi" w:cstheme="minorHAnsi"/>
+          <w:b/>
+          <w:i/>
+          <w:iCs/>
+        </w:rPr>
+        <w:instrText xml:space="preserve"> = "ABEJORRAL SP" "E.S.E. Hospital San Juan De Dios Abejorral" </w:instrText>
+      </w:r>
+      <w:r>
+        <w:rPr>
+          <w:rFonts w:asciiTheme="minorHAnsi" w:hAnsiTheme="minorHAnsi" w:cstheme="minorHAnsi"/>
+          <w:b/>
+          <w:i/>
+          <w:iCs/>
+        </w:rPr>
+        <w:fldChar w:fldCharType="end"/>
+      </w:r>
+      <w:r>
+        <w:rPr>
+          <w:rFonts w:asciiTheme="minorHAnsi" w:hAnsiTheme="minorHAnsi" w:cstheme="minorHAnsi"/>
+          <w:b/>
+          <w:i/>
+          <w:iCs/>
+        </w:rPr>
+        <w:fldChar w:fldCharType="begin"/>
+      </w:r>
+      <w:r>
+        <w:rPr>
+          <w:rFonts w:asciiTheme="minorHAnsi" w:hAnsiTheme="minorHAnsi" w:cstheme="minorHAnsi"/>
+          <w:b/>
+          <w:i/>
+          <w:iCs/>
+        </w:rPr>
+        <w:instrText xml:space="preserve"> IF </w:instrText>
+      </w:r>
+      <w:r>
+        <w:rPr>
+          <w:rFonts w:asciiTheme="minorHAnsi" w:hAnsiTheme="minorHAnsi" w:cstheme="minorHAnsi"/>
+          <w:b/>
+          <w:i/>
+          <w:iCs/>
+        </w:rPr>
+        <w:fldChar w:fldCharType="begin"/>
+      </w:r>
+      <w:r>
+        <w:rPr>
+          <w:rFonts w:asciiTheme="minorHAnsi" w:hAnsiTheme="minorHAnsi" w:cstheme="minorHAnsi"/>
+          <w:b/>
+          <w:i/>
+          <w:iCs/>
+        </w:rPr>
+        <w:instrText xml:space="preserve"> MERGEFIELD HOSPITAL </w:instrText>
+      </w:r>
+      <w:r>
+        <w:rPr>
+          <w:rFonts w:asciiTheme="minorHAnsi" w:hAnsiTheme="minorHAnsi" w:cstheme="minorHAnsi"/>
+          <w:b/>
+          <w:i/>
+          <w:iCs/>
+        </w:rPr>
+        <w:fldChar w:fldCharType="separate"/>
+      </w:r>
+      <w:r>
+        <w:rPr>
+          <w:rFonts w:asciiTheme="minorHAnsi" w:hAnsiTheme="minorHAnsi" w:cstheme="minorHAnsi"/>
+          <w:b/>
+          <w:i/>
+          <w:iCs/>
+          <w:noProof/>
+        </w:rPr>
+        <w:instrText>HSJDRionegro</w:instrText>
+      </w:r>
+      <w:r>
+        <w:rPr>
+          <w:rFonts w:asciiTheme="minorHAnsi" w:hAnsiTheme="minorHAnsi" w:cstheme="minorHAnsi"/>
+          <w:b/>
+          <w:i/>
+          <w:iCs/>
+        </w:rPr>
+        <w:fldChar w:fldCharType="end"/>
+      </w:r>
+      <w:r>
+        <w:rPr>
+          <w:rFonts w:asciiTheme="minorHAnsi" w:hAnsiTheme="minorHAnsi" w:cstheme="minorHAnsi"/>
+          <w:b/>
+          <w:i/>
+          <w:iCs/>
+        </w:rPr>
+        <w:instrText xml:space="preserve"> = "ABEJORRAL - BUEN COMIENZO" "E.S.E. Hospital San Juan de Dios Abejorral - Programa Buen Comienzo" </w:instrText>
+      </w:r>
+      <w:r>
+        <w:rPr>
+          <w:rFonts w:asciiTheme="minorHAnsi" w:hAnsiTheme="minorHAnsi" w:cstheme="minorHAnsi"/>
+          <w:b/>
+          <w:i/>
+          <w:iCs/>
+        </w:rPr>
+        <w:fldChar w:fldCharType="end"/>
+      </w:r>
+      <w:r>
+        <w:rPr>
+          <w:rFonts w:asciiTheme="minorHAnsi" w:hAnsiTheme="minorHAnsi" w:cstheme="minorHAnsi"/>
+          <w:b/>
+          <w:i/>
+          <w:iCs/>
+        </w:rPr>
+        <w:fldChar w:fldCharType="begin"/>
+      </w:r>
+      <w:r>
+        <w:rPr>
+          <w:rFonts w:asciiTheme="minorHAnsi" w:hAnsiTheme="minorHAnsi" w:cstheme="minorHAnsi"/>
+          <w:b/>
+          <w:i/>
+          <w:iCs/>
+        </w:rPr>
+        <w:instrText xml:space="preserve"> IF </w:instrText>
+      </w:r>
+      <w:r>
+        <w:rPr>
+          <w:rFonts w:asciiTheme="minorHAnsi" w:hAnsiTheme="minorHAnsi" w:cstheme="minorHAnsi"/>
+          <w:b/>
+          <w:i/>
+          <w:iCs/>
+        </w:rPr>
+        <w:fldChar w:fldCharType="begin"/>
+      </w:r>
+      <w:r>
+        <w:rPr>
+          <w:rFonts w:asciiTheme="minorHAnsi" w:hAnsiTheme="minorHAnsi" w:cstheme="minorHAnsi"/>
+          <w:b/>
+          <w:i/>
+          <w:iCs/>
+        </w:rPr>
+        <w:instrText xml:space="preserve"> MERGEFIELD HOSPITAL </w:instrText>
+      </w:r>
+      <w:r>
+        <w:rPr>
+          <w:rFonts w:asciiTheme="minorHAnsi" w:hAnsiTheme="minorHAnsi" w:cstheme="minorHAnsi"/>
+          <w:b/>
+          <w:i/>
+          <w:iCs/>
+        </w:rPr>
+        <w:fldChar w:fldCharType="separate"/>
+      </w:r>
+      <w:r>
+        <w:rPr>
+          <w:rFonts w:asciiTheme="minorHAnsi" w:hAnsiTheme="minorHAnsi" w:cstheme="minorHAnsi"/>
+          <w:b/>
+          <w:i/>
+          <w:iCs/>
+          <w:noProof/>
+        </w:rPr>
+        <w:instrText>HSJDRionegro</w:instrText>
+      </w:r>
+      <w:r>
+        <w:rPr>
+          <w:rFonts w:asciiTheme="minorHAnsi" w:hAnsiTheme="minorHAnsi" w:cstheme="minorHAnsi"/>
+          <w:b/>
+          <w:i/>
+          <w:iCs/>
+        </w:rPr>
+        <w:fldChar w:fldCharType="end"/>
+      </w:r>
+      <w:r>
+        <w:rPr>
+          <w:rFonts w:asciiTheme="minorHAnsi" w:hAnsiTheme="minorHAnsi" w:cstheme="minorHAnsi"/>
+          <w:b/>
+          <w:i/>
+          <w:iCs/>
+        </w:rPr>
+        <w:instrText xml:space="preserve"> = "ABEJORRAL - SALUD P." "E.S.E. Hospital San Juan de Dios Abejorral - Programa Salud Pública" </w:instrText>
+      </w:r>
+      <w:r>
+        <w:rPr>
+          <w:rFonts w:asciiTheme="minorHAnsi" w:hAnsiTheme="minorHAnsi" w:cstheme="minorHAnsi"/>
+          <w:b/>
+          <w:i/>
+          <w:iCs/>
+        </w:rPr>
+        <w:fldChar w:fldCharType="end"/>
+      </w:r>
+      <w:r>
+        <w:rPr>
+          <w:rFonts w:asciiTheme="minorHAnsi" w:hAnsiTheme="minorHAnsi" w:cstheme="minorHAnsi"/>
+          <w:b/>
+          <w:i/>
+          <w:iCs/>
+        </w:rPr>
+        <w:fldChar w:fldCharType="begin"/>
+      </w:r>
+      <w:r>
+        <w:rPr>
+          <w:rFonts w:asciiTheme="minorHAnsi" w:hAnsiTheme="minorHAnsi" w:cstheme="minorHAnsi"/>
+          <w:b/>
+          <w:i/>
+          <w:iCs/>
+        </w:rPr>
+        <w:instrText xml:space="preserve"> IF </w:instrText>
+      </w:r>
+      <w:r>
+        <w:rPr>
+          <w:rFonts w:asciiTheme="minorHAnsi" w:hAnsiTheme="minorHAnsi" w:cstheme="minorHAnsi"/>
+          <w:b/>
+          <w:i/>
+          <w:iCs/>
+        </w:rPr>
+        <w:fldChar w:fldCharType="begin"/>
+      </w:r>
+      <w:r>
+        <w:rPr>
+          <w:rFonts w:asciiTheme="minorHAnsi" w:hAnsiTheme="minorHAnsi" w:cstheme="minorHAnsi"/>
+          <w:b/>
+          <w:i/>
+          <w:iCs/>
+        </w:rPr>
+        <w:instrText xml:space="preserve"> MERGEFIELD HOSPITAL </w:instrText>
+      </w:r>
+      <w:r>
+        <w:rPr>
+          <w:rFonts w:asciiTheme="minorHAnsi" w:hAnsiTheme="minorHAnsi" w:cstheme="minorHAnsi"/>
+          <w:b/>
+          <w:i/>
+          <w:iCs/>
+        </w:rPr>
+        <w:fldChar w:fldCharType="separate"/>
+      </w:r>
+      <w:r>
+        <w:rPr>
+          <w:rFonts w:asciiTheme="minorHAnsi" w:hAnsiTheme="minorHAnsi" w:cstheme="minorHAnsi"/>
+          <w:b/>
+          <w:i/>
+          <w:iCs/>
+          <w:noProof/>
+        </w:rPr>
+        <w:instrText>HSJDRionegro</w:instrText>
+      </w:r>
+      <w:r>
+        <w:rPr>
+          <w:rFonts w:asciiTheme="minorHAnsi" w:hAnsiTheme="minorHAnsi" w:cstheme="minorHAnsi"/>
+          <w:b/>
+          <w:i/>
+          <w:iCs/>
+        </w:rPr>
+        <w:fldChar w:fldCharType="end"/>
+      </w:r>
+      <w:r>
+        <w:rPr>
+          <w:rFonts w:asciiTheme="minorHAnsi" w:hAnsiTheme="minorHAnsi" w:cstheme="minorHAnsi"/>
+          <w:b/>
+          <w:i/>
+          <w:iCs/>
+        </w:rPr>
+        <w:instrText xml:space="preserve"> = "BETANIA" "E.S.E. Hospital San Antonio de Betania" </w:instrText>
+      </w:r>
+      <w:r>
+        <w:rPr>
+          <w:rFonts w:asciiTheme="minorHAnsi" w:hAnsiTheme="minorHAnsi" w:cstheme="minorHAnsi"/>
+          <w:b/>
+          <w:i/>
+          <w:iCs/>
+        </w:rPr>
+        <w:fldChar w:fldCharType="end"/>
+      </w:r>
+      <w:r>
+        <w:rPr>
+          <w:rFonts w:asciiTheme="minorHAnsi" w:hAnsiTheme="minorHAnsi" w:cstheme="minorHAnsi"/>
+          <w:b/>
+          <w:i/>
+          <w:iCs/>
+        </w:rPr>
+        <w:fldChar w:fldCharType="begin"/>
+      </w:r>
+      <w:r>
+        <w:rPr>
+          <w:rFonts w:asciiTheme="minorHAnsi" w:hAnsiTheme="minorHAnsi" w:cstheme="minorHAnsi"/>
+          <w:b/>
+          <w:i/>
+          <w:iCs/>
+        </w:rPr>
+        <w:instrText xml:space="preserve"> IF </w:instrText>
+      </w:r>
+      <w:r>
+        <w:rPr>
+          <w:rFonts w:asciiTheme="minorHAnsi" w:hAnsiTheme="minorHAnsi" w:cstheme="minorHAnsi"/>
+          <w:b/>
+          <w:i/>
+          <w:iCs/>
+        </w:rPr>
+        <w:fldChar w:fldCharType="begin"/>
+      </w:r>
+      <w:r>
+        <w:rPr>
+          <w:rFonts w:asciiTheme="minorHAnsi" w:hAnsiTheme="minorHAnsi" w:cstheme="minorHAnsi"/>
+          <w:b/>
+          <w:i/>
+          <w:iCs/>
+        </w:rPr>
+        <w:instrText xml:space="preserve"> MERGEFIELD HOSPITAL </w:instrText>
+      </w:r>
+      <w:r>
+        <w:rPr>
+          <w:rFonts w:asciiTheme="minorHAnsi" w:hAnsiTheme="minorHAnsi" w:cstheme="minorHAnsi"/>
+          <w:b/>
+          <w:i/>
+          <w:iCs/>
+        </w:rPr>
+        <w:fldChar w:fldCharType="separate"/>
+      </w:r>
+      <w:r>
+        <w:rPr>
+          <w:rFonts w:asciiTheme="minorHAnsi" w:hAnsiTheme="minorHAnsi" w:cstheme="minorHAnsi"/>
+          <w:b/>
+          <w:i/>
+          <w:iCs/>
+          <w:noProof/>
+        </w:rPr>
+        <w:instrText>HSJDRionegro</w:instrText>
+      </w:r>
+      <w:r>
+        <w:rPr>
+          <w:rFonts w:asciiTheme="minorHAnsi" w:hAnsiTheme="minorHAnsi" w:cstheme="minorHAnsi"/>
+          <w:b/>
+          <w:i/>
+          <w:iCs/>
+        </w:rPr>
+        <w:fldChar w:fldCharType="end"/>
+      </w:r>
+      <w:r>
+        <w:rPr>
+          <w:rFonts w:asciiTheme="minorHAnsi" w:hAnsiTheme="minorHAnsi" w:cstheme="minorHAnsi"/>
+          <w:b/>
+          <w:i/>
+          <w:iCs/>
+        </w:rPr>
+        <w:instrText xml:space="preserve"> = "BETANIA - BUEN COMIENZO" "E.S.E. Hospital San Antonio de Betania" </w:instrText>
+      </w:r>
+      <w:r>
+        <w:rPr>
+          <w:rFonts w:asciiTheme="minorHAnsi" w:hAnsiTheme="minorHAnsi" w:cstheme="minorHAnsi"/>
+          <w:b/>
+          <w:i/>
+          <w:iCs/>
+        </w:rPr>
+        <w:fldChar w:fldCharType="end"/>
+      </w:r>
+      <w:r>
+        <w:rPr>
+          <w:rFonts w:asciiTheme="minorHAnsi" w:hAnsiTheme="minorHAnsi" w:cstheme="minorHAnsi"/>
+          <w:b/>
+          <w:i/>
+          <w:iCs/>
+        </w:rPr>
+        <w:fldChar w:fldCharType="begin"/>
+      </w:r>
+      <w:r>
+        <w:rPr>
+          <w:rFonts w:asciiTheme="minorHAnsi" w:hAnsiTheme="minorHAnsi" w:cstheme="minorHAnsi"/>
+          <w:b/>
+          <w:i/>
+          <w:iCs/>
+        </w:rPr>
+        <w:instrText xml:space="preserve"> IF </w:instrText>
+      </w:r>
+      <w:r>
+        <w:rPr>
+          <w:rFonts w:asciiTheme="minorHAnsi" w:hAnsiTheme="minorHAnsi" w:cstheme="minorHAnsi"/>
+          <w:b/>
+          <w:i/>
+          <w:iCs/>
+        </w:rPr>
+        <w:fldChar w:fldCharType="begin"/>
+      </w:r>
+      <w:r>
+        <w:rPr>
+          <w:rFonts w:asciiTheme="minorHAnsi" w:hAnsiTheme="minorHAnsi" w:cstheme="minorHAnsi"/>
+          <w:b/>
+          <w:i/>
+          <w:iCs/>
+        </w:rPr>
+        <w:instrText xml:space="preserve"> MERGEFIELD HOSPITAL </w:instrText>
+      </w:r>
+      <w:r>
+        <w:rPr>
+          <w:rFonts w:asciiTheme="minorHAnsi" w:hAnsiTheme="minorHAnsi" w:cstheme="minorHAnsi"/>
+          <w:b/>
+          <w:i/>
+          <w:iCs/>
+        </w:rPr>
+        <w:fldChar w:fldCharType="separate"/>
+      </w:r>
+      <w:r>
+        <w:rPr>
+          <w:rFonts w:asciiTheme="minorHAnsi" w:hAnsiTheme="minorHAnsi" w:cstheme="minorHAnsi"/>
+          <w:b/>
+          <w:i/>
+          <w:iCs/>
+          <w:noProof/>
+        </w:rPr>
+        <w:instrText>HSJDRionegro</w:instrText>
+      </w:r>
+      <w:r>
+        <w:rPr>
+          <w:rFonts w:asciiTheme="minorHAnsi" w:hAnsiTheme="minorHAnsi" w:cstheme="minorHAnsi"/>
+          <w:b/>
+          <w:i/>
+          <w:iCs/>
+        </w:rPr>
+        <w:fldChar w:fldCharType="end"/>
+      </w:r>
+      <w:r>
+        <w:rPr>
+          <w:rFonts w:asciiTheme="minorHAnsi" w:hAnsiTheme="minorHAnsi" w:cstheme="minorHAnsi"/>
+          <w:b/>
+          <w:i/>
+          <w:iCs/>
+        </w:rPr>
+        <w:instrText xml:space="preserve"> = "</w:instrText>
+      </w:r>
+      <w:r>
+        <w:rPr>
+          <w:rFonts w:asciiTheme="minorHAnsi" w:hAnsiTheme="minorHAnsi" w:cstheme="minorHAnsi"/>
+          <w:b/>
+          <w:i/>
+          <w:iCs/>
+          <w:color w:val="000000"/>
+        </w:rPr>
+        <w:instrText>COPACABANA</w:instrText>
+      </w:r>
+      <w:r>
+        <w:rPr>
+          <w:rFonts w:asciiTheme="minorHAnsi" w:hAnsiTheme="minorHAnsi" w:cstheme="minorHAnsi"/>
+          <w:b/>
+          <w:i/>
+          <w:iCs/>
+        </w:rPr>
+        <w:instrText>" "</w:instrText>
+      </w:r>
+      <w:r>
+        <w:rPr>
+          <w:rFonts w:asciiTheme="minorHAnsi" w:hAnsiTheme="minorHAnsi" w:cstheme="minorHAnsi"/>
+          <w:b/>
+          <w:i/>
+          <w:iCs/>
+          <w:color w:val="000000"/>
+        </w:rPr>
+        <w:instrText>E.S.E. Hospital Santa Margarita</w:instrText>
+      </w:r>
+      <w:r>
+        <w:rPr>
+          <w:rFonts w:asciiTheme="minorHAnsi" w:hAnsiTheme="minorHAnsi" w:cstheme="minorHAnsi"/>
+          <w:b/>
+          <w:i/>
+          <w:iCs/>
+        </w:rPr>
+        <w:instrText xml:space="preserve">" </w:instrText>
+      </w:r>
+      <w:r>
+        <w:rPr>
+          <w:rFonts w:asciiTheme="minorHAnsi" w:hAnsiTheme="minorHAnsi" w:cstheme="minorHAnsi"/>
+          <w:b/>
+          <w:i/>
+          <w:iCs/>
+        </w:rPr>
+        <w:fldChar w:fldCharType="end"/>
+      </w:r>
+      <w:r>
+        <w:rPr>
+          <w:rFonts w:asciiTheme="minorHAnsi" w:hAnsiTheme="minorHAnsi" w:cstheme="minorHAnsi"/>
+          <w:b/>
+          <w:i/>
+          <w:iCs/>
+        </w:rPr>
+        <w:fldChar w:fldCharType="begin"/>
+      </w:r>
+      <w:r>
+        <w:rPr>
+          <w:rFonts w:asciiTheme="minorHAnsi" w:hAnsiTheme="minorHAnsi" w:cstheme="minorHAnsi"/>
+          <w:b/>
+          <w:i/>
+          <w:iCs/>
+        </w:rPr>
+        <w:instrText xml:space="preserve"> IF </w:instrText>
+      </w:r>
+      <w:r>
+        <w:rPr>
+          <w:rFonts w:asciiTheme="minorHAnsi" w:hAnsiTheme="minorHAnsi" w:cstheme="minorHAnsi"/>
+          <w:b/>
+          <w:i/>
+          <w:iCs/>
+        </w:rPr>
+        <w:fldChar w:fldCharType="begin"/>
+      </w:r>
+      <w:r>
+        <w:rPr>
+          <w:rFonts w:asciiTheme="minorHAnsi" w:hAnsiTheme="minorHAnsi" w:cstheme="minorHAnsi"/>
+          <w:b/>
+          <w:i/>
+          <w:iCs/>
+        </w:rPr>
+        <w:instrText xml:space="preserve"> MERGEFIELD HOSPITAL </w:instrText>
+      </w:r>
+      <w:r>
+        <w:rPr>
+          <w:rFonts w:asciiTheme="minorHAnsi" w:hAnsiTheme="minorHAnsi" w:cstheme="minorHAnsi"/>
+          <w:b/>
+          <w:i/>
+          <w:iCs/>
+        </w:rPr>
+        <w:fldChar w:fldCharType="separate"/>
+      </w:r>
+      <w:r>
+        <w:rPr>
+          <w:rFonts w:asciiTheme="minorHAnsi" w:hAnsiTheme="minorHAnsi" w:cstheme="minorHAnsi"/>
+          <w:b/>
+          <w:i/>
+          <w:iCs/>
+          <w:noProof/>
+        </w:rPr>
+        <w:instrText>HSJDRionegro</w:instrText>
+      </w:r>
+      <w:r>
+        <w:rPr>
+          <w:rFonts w:asciiTheme="minorHAnsi" w:hAnsiTheme="minorHAnsi" w:cstheme="minorHAnsi"/>
+          <w:b/>
+          <w:i/>
+          <w:iCs/>
+        </w:rPr>
+        <w:fldChar w:fldCharType="end"/>
+      </w:r>
+      <w:r>
+        <w:rPr>
+          <w:rFonts w:asciiTheme="minorHAnsi" w:hAnsiTheme="minorHAnsi" w:cstheme="minorHAnsi"/>
+          <w:b/>
+          <w:i/>
+          <w:iCs/>
+        </w:rPr>
+        <w:instrText xml:space="preserve"> = "</w:instrText>
+      </w:r>
+      <w:r>
+        <w:rPr>
+          <w:rFonts w:asciiTheme="minorHAnsi" w:hAnsiTheme="minorHAnsi" w:cstheme="minorHAnsi"/>
+          <w:b/>
+          <w:i/>
+          <w:iCs/>
+          <w:color w:val="000000"/>
+        </w:rPr>
+        <w:instrText>COPACABANA - SALUD P.</w:instrText>
+      </w:r>
+      <w:r>
+        <w:rPr>
+          <w:rFonts w:asciiTheme="minorHAnsi" w:hAnsiTheme="minorHAnsi" w:cstheme="minorHAnsi"/>
+          <w:b/>
+          <w:i/>
+          <w:iCs/>
+        </w:rPr>
+        <w:instrText>" "</w:instrText>
+      </w:r>
+      <w:r>
+        <w:rPr>
+          <w:rFonts w:asciiTheme="minorHAnsi" w:hAnsiTheme="minorHAnsi" w:cstheme="minorHAnsi"/>
+          <w:b/>
+          <w:i/>
+          <w:iCs/>
+          <w:color w:val="000000"/>
+        </w:rPr>
+        <w:instrText>E.S.E. Hospital Santa Margarita - Programa Salud Pública</w:instrText>
+      </w:r>
+      <w:r>
+        <w:rPr>
+          <w:rFonts w:asciiTheme="minorHAnsi" w:hAnsiTheme="minorHAnsi" w:cstheme="minorHAnsi"/>
+          <w:b/>
+          <w:i/>
+          <w:iCs/>
+        </w:rPr>
+        <w:instrText xml:space="preserve">" </w:instrText>
+      </w:r>
+      <w:r>
+        <w:rPr>
+          <w:rFonts w:asciiTheme="minorHAnsi" w:hAnsiTheme="minorHAnsi" w:cstheme="minorHAnsi"/>
+          <w:b/>
+          <w:i/>
+          <w:iCs/>
+        </w:rPr>
+        <w:fldChar w:fldCharType="end"/>
+      </w:r>
+      <w:r>
+        <w:rPr>
+          <w:rFonts w:asciiTheme="minorHAnsi" w:hAnsiTheme="minorHAnsi" w:cstheme="minorHAnsi"/>
+          <w:b/>
+          <w:i/>
+          <w:iCs/>
+        </w:rPr>
+        <w:fldChar w:fldCharType="begin"/>
+      </w:r>
+      <w:r>
+        <w:rPr>
+          <w:rFonts w:asciiTheme="minorHAnsi" w:hAnsiTheme="minorHAnsi" w:cstheme="minorHAnsi"/>
+          <w:b/>
+          <w:i/>
+          <w:iCs/>
+        </w:rPr>
+        <w:instrText xml:space="preserve"> IF </w:instrText>
+      </w:r>
+      <w:r>
+        <w:rPr>
+          <w:rFonts w:asciiTheme="minorHAnsi" w:hAnsiTheme="minorHAnsi" w:cstheme="minorHAnsi"/>
+          <w:b/>
+          <w:i/>
+          <w:iCs/>
+        </w:rPr>
+        <w:fldChar w:fldCharType="begin"/>
+      </w:r>
+      <w:r>
+        <w:rPr>
+          <w:rFonts w:asciiTheme="minorHAnsi" w:hAnsiTheme="minorHAnsi" w:cstheme="minorHAnsi"/>
+          <w:b/>
+          <w:i/>
+          <w:iCs/>
+        </w:rPr>
+        <w:instrText xml:space="preserve"> MERGEFIELD HOSPITAL </w:instrText>
+      </w:r>
+      <w:r>
+        <w:rPr>
+          <w:rFonts w:asciiTheme="minorHAnsi" w:hAnsiTheme="minorHAnsi" w:cstheme="minorHAnsi"/>
+          <w:b/>
+          <w:i/>
+          <w:iCs/>
+        </w:rPr>
+        <w:fldChar w:fldCharType="separate"/>
+      </w:r>
+      <w:r>
+        <w:rPr>
+          <w:rFonts w:asciiTheme="minorHAnsi" w:hAnsiTheme="minorHAnsi" w:cstheme="minorHAnsi"/>
+          <w:b/>
+          <w:i/>
+          <w:iCs/>
+          <w:noProof/>
+        </w:rPr>
+        <w:instrText>HSJDRionegro</w:instrText>
+      </w:r>
+      <w:r>
+        <w:rPr>
+          <w:rFonts w:asciiTheme="minorHAnsi" w:hAnsiTheme="minorHAnsi" w:cstheme="minorHAnsi"/>
+          <w:b/>
+          <w:i/>
+          <w:iCs/>
+        </w:rPr>
+        <w:fldChar w:fldCharType="end"/>
+      </w:r>
+      <w:r>
+        <w:rPr>
+          <w:rFonts w:asciiTheme="minorHAnsi" w:hAnsiTheme="minorHAnsi" w:cstheme="minorHAnsi"/>
+          <w:b/>
+          <w:i/>
+          <w:iCs/>
+        </w:rPr>
+        <w:instrText xml:space="preserve"> = "</w:instrText>
+      </w:r>
+      <w:r>
+        <w:rPr>
+          <w:rFonts w:asciiTheme="minorHAnsi" w:hAnsiTheme="minorHAnsi" w:cstheme="minorHAnsi"/>
+          <w:b/>
+          <w:i/>
+          <w:iCs/>
+          <w:color w:val="000000"/>
+        </w:rPr>
+        <w:instrText>ITAGUI</w:instrText>
+      </w:r>
+      <w:r>
+        <w:rPr>
+          <w:rFonts w:asciiTheme="minorHAnsi" w:hAnsiTheme="minorHAnsi" w:cstheme="minorHAnsi"/>
+          <w:b/>
+          <w:i/>
+          <w:iCs/>
+        </w:rPr>
+        <w:instrText>" "</w:instrText>
+      </w:r>
+      <w:r>
+        <w:rPr>
+          <w:rFonts w:asciiTheme="minorHAnsi" w:hAnsiTheme="minorHAnsi" w:cstheme="minorHAnsi"/>
+          <w:b/>
+          <w:i/>
+          <w:iCs/>
+          <w:color w:val="000000"/>
+        </w:rPr>
+        <w:instrText>E.S.E. Hospital San Rafael Itagui</w:instrText>
+      </w:r>
+      <w:r>
+        <w:rPr>
+          <w:rFonts w:asciiTheme="minorHAnsi" w:hAnsiTheme="minorHAnsi" w:cstheme="minorHAnsi"/>
+          <w:b/>
+          <w:i/>
+          <w:iCs/>
+        </w:rPr>
+        <w:instrText xml:space="preserve">" </w:instrText>
+      </w:r>
+      <w:r>
+        <w:rPr>
+          <w:rFonts w:asciiTheme="minorHAnsi" w:hAnsiTheme="minorHAnsi" w:cstheme="minorHAnsi"/>
+          <w:b/>
+          <w:i/>
+          <w:iCs/>
+        </w:rPr>
+        <w:fldChar w:fldCharType="end"/>
+      </w:r>
+      <w:r>
+        <w:rPr>
+          <w:rFonts w:asciiTheme="minorHAnsi" w:hAnsiTheme="minorHAnsi" w:cstheme="minorHAnsi"/>
+          <w:b/>
+          <w:i/>
+          <w:iCs/>
+        </w:rPr>
+        <w:fldChar w:fldCharType="begin"/>
+      </w:r>
+      <w:r>
+        <w:rPr>
+          <w:rFonts w:asciiTheme="minorHAnsi" w:hAnsiTheme="minorHAnsi" w:cstheme="minorHAnsi"/>
+          <w:b/>
+          <w:i/>
+          <w:iCs/>
+        </w:rPr>
+        <w:instrText xml:space="preserve"> IF </w:instrText>
+      </w:r>
+      <w:r>
+        <w:rPr>
+          <w:rFonts w:asciiTheme="minorHAnsi" w:hAnsiTheme="minorHAnsi" w:cstheme="minorHAnsi"/>
+          <w:b/>
+          <w:i/>
+          <w:iCs/>
+        </w:rPr>
+        <w:fldChar w:fldCharType="begin"/>
+      </w:r>
+      <w:r>
+        <w:rPr>
+          <w:rFonts w:asciiTheme="minorHAnsi" w:hAnsiTheme="minorHAnsi" w:cstheme="minorHAnsi"/>
+          <w:b/>
+          <w:i/>
+          <w:iCs/>
+        </w:rPr>
+        <w:instrText xml:space="preserve"> MERGEFIELD HOSPITAL </w:instrText>
+      </w:r>
+      <w:r>
+        <w:rPr>
+          <w:rFonts w:asciiTheme="minorHAnsi" w:hAnsiTheme="minorHAnsi" w:cstheme="minorHAnsi"/>
+          <w:b/>
+          <w:i/>
+          <w:iCs/>
+        </w:rPr>
+        <w:fldChar w:fldCharType="separate"/>
+      </w:r>
+      <w:r>
+        <w:rPr>
+          <w:rFonts w:asciiTheme="minorHAnsi" w:hAnsiTheme="minorHAnsi" w:cstheme="minorHAnsi"/>
+          <w:b/>
+          <w:i/>
+          <w:iCs/>
+          <w:noProof/>
+        </w:rPr>
+        <w:instrText>HSJDRionegro</w:instrText>
+      </w:r>
+      <w:r>
+        <w:rPr>
+          <w:rFonts w:asciiTheme="minorHAnsi" w:hAnsiTheme="minorHAnsi" w:cstheme="minorHAnsi"/>
+          <w:b/>
+          <w:i/>
+          <w:iCs/>
+        </w:rPr>
+        <w:fldChar w:fldCharType="end"/>
+      </w:r>
+      <w:r>
+        <w:rPr>
+          <w:rFonts w:asciiTheme="minorHAnsi" w:hAnsiTheme="minorHAnsi" w:cstheme="minorHAnsi"/>
+          <w:b/>
+          <w:i/>
+          <w:iCs/>
+        </w:rPr>
+        <w:instrText xml:space="preserve"> = "</w:instrText>
+      </w:r>
+      <w:r>
+        <w:rPr>
+          <w:rFonts w:asciiTheme="minorHAnsi" w:hAnsiTheme="minorHAnsi" w:cstheme="minorHAnsi"/>
+          <w:b/>
+          <w:i/>
+          <w:iCs/>
+          <w:color w:val="000000"/>
+        </w:rPr>
+        <w:instrText>SAMEIN</w:instrText>
+      </w:r>
+      <w:r>
+        <w:rPr>
+          <w:rFonts w:asciiTheme="minorHAnsi" w:hAnsiTheme="minorHAnsi" w:cstheme="minorHAnsi"/>
+          <w:b/>
+          <w:i/>
+          <w:iCs/>
+        </w:rPr>
+        <w:instrText>" "</w:instrText>
+      </w:r>
+      <w:r>
+        <w:rPr>
+          <w:rFonts w:asciiTheme="minorHAnsi" w:hAnsiTheme="minorHAnsi" w:cstheme="minorHAnsi"/>
+          <w:b/>
+          <w:i/>
+          <w:iCs/>
+          <w:color w:val="000000"/>
+        </w:rPr>
+        <w:instrText>I.P.S. Samein S.A.</w:instrText>
+      </w:r>
+      <w:r>
+        <w:rPr>
+          <w:rFonts w:asciiTheme="minorHAnsi" w:hAnsiTheme="minorHAnsi" w:cstheme="minorHAnsi"/>
+          <w:b/>
+          <w:i/>
+          <w:iCs/>
+        </w:rPr>
+        <w:instrText xml:space="preserve">" </w:instrText>
+      </w:r>
+      <w:r>
+        <w:rPr>
+          <w:rFonts w:asciiTheme="minorHAnsi" w:hAnsiTheme="minorHAnsi" w:cstheme="minorHAnsi"/>
+          <w:b/>
+          <w:i/>
+          <w:iCs/>
+        </w:rPr>
+        <w:fldChar w:fldCharType="end"/>
+      </w:r>
+      <w:r>
+        <w:rPr>
+          <w:rFonts w:asciiTheme="minorHAnsi" w:hAnsiTheme="minorHAnsi" w:cstheme="minorHAnsi"/>
+          <w:b/>
+          <w:i/>
+          <w:iCs/>
+        </w:rPr>
+        <w:fldChar w:fldCharType="begin"/>
+      </w:r>
+      <w:r>
+        <w:rPr>
+          <w:rFonts w:asciiTheme="minorHAnsi" w:hAnsiTheme="minorHAnsi" w:cstheme="minorHAnsi"/>
+          <w:b/>
+          <w:i/>
+          <w:iCs/>
+        </w:rPr>
+        <w:instrText xml:space="preserve"> IF </w:instrText>
+      </w:r>
+      <w:r>
+        <w:rPr>
+          <w:rFonts w:asciiTheme="minorHAnsi" w:hAnsiTheme="minorHAnsi" w:cstheme="minorHAnsi"/>
+          <w:b/>
+          <w:i/>
+          <w:iCs/>
+        </w:rPr>
+        <w:fldChar w:fldCharType="begin"/>
+      </w:r>
+      <w:r>
+        <w:rPr>
+          <w:rFonts w:asciiTheme="minorHAnsi" w:hAnsiTheme="minorHAnsi" w:cstheme="minorHAnsi"/>
+          <w:b/>
+          <w:i/>
+          <w:iCs/>
+        </w:rPr>
+        <w:instrText xml:space="preserve"> MERGEFIELD HOSPITAL </w:instrText>
+      </w:r>
+      <w:r>
+        <w:rPr>
+          <w:rFonts w:asciiTheme="minorHAnsi" w:hAnsiTheme="minorHAnsi" w:cstheme="minorHAnsi"/>
+          <w:b/>
+          <w:i/>
+          <w:iCs/>
+        </w:rPr>
+        <w:fldChar w:fldCharType="separate"/>
+      </w:r>
+      <w:r>
+        <w:rPr>
+          <w:rFonts w:asciiTheme="minorHAnsi" w:hAnsiTheme="minorHAnsi" w:cstheme="minorHAnsi"/>
+          <w:b/>
+          <w:i/>
+          <w:iCs/>
+          <w:noProof/>
+        </w:rPr>
+        <w:instrText>HSJDRionegro</w:instrText>
+      </w:r>
+      <w:r>
+        <w:rPr>
+          <w:rFonts w:asciiTheme="minorHAnsi" w:hAnsiTheme="minorHAnsi" w:cstheme="minorHAnsi"/>
+          <w:b/>
+          <w:i/>
+          <w:iCs/>
+        </w:rPr>
+        <w:fldChar w:fldCharType="end"/>
+      </w:r>
+      <w:r>
+        <w:rPr>
+          <w:rFonts w:asciiTheme="minorHAnsi" w:hAnsiTheme="minorHAnsi" w:cstheme="minorHAnsi"/>
+          <w:b/>
+          <w:i/>
+          <w:iCs/>
+        </w:rPr>
+        <w:instrText xml:space="preserve"> = "</w:instrText>
+      </w:r>
+      <w:r>
+        <w:rPr>
+          <w:rFonts w:asciiTheme="minorHAnsi" w:hAnsiTheme="minorHAnsi" w:cstheme="minorHAnsi"/>
+          <w:b/>
+          <w:i/>
+          <w:iCs/>
+          <w:color w:val="000000"/>
+        </w:rPr>
+        <w:instrText>STA GERTRUDIS</w:instrText>
+      </w:r>
+      <w:r>
+        <w:rPr>
+          <w:rFonts w:asciiTheme="minorHAnsi" w:hAnsiTheme="minorHAnsi" w:cstheme="minorHAnsi"/>
+          <w:b/>
+          <w:i/>
+          <w:iCs/>
+        </w:rPr>
+        <w:instrText xml:space="preserve">" "E.S.E. Santa Gertrudis" </w:instrText>
+      </w:r>
+      <w:r>
+        <w:rPr>
+          <w:rFonts w:asciiTheme="minorHAnsi" w:hAnsiTheme="minorHAnsi" w:cstheme="minorHAnsi"/>
+          <w:b/>
+          <w:i/>
+          <w:iCs/>
+        </w:rPr>
+        <w:fldChar w:fldCharType="end"/>
+      </w:r>
+      <w:r>
+        <w:rPr>
+          <w:rFonts w:asciiTheme="minorHAnsi" w:hAnsiTheme="minorHAnsi" w:cstheme="minorHAnsi"/>
+          <w:b/>
+          <w:i/>
+          <w:iCs/>
+        </w:rPr>
+        <w:fldChar w:fldCharType="begin"/>
+      </w:r>
+      <w:r>
+        <w:rPr>
+          <w:rFonts w:asciiTheme="minorHAnsi" w:hAnsiTheme="minorHAnsi" w:cstheme="minorHAnsi"/>
+          <w:b/>
+          <w:i/>
+          <w:iCs/>
+        </w:rPr>
+        <w:instrText xml:space="preserve"> IF </w:instrText>
+      </w:r>
+      <w:r>
+        <w:rPr>
+          <w:rFonts w:asciiTheme="minorHAnsi" w:hAnsiTheme="minorHAnsi" w:cstheme="minorHAnsi"/>
+          <w:b/>
+          <w:i/>
+          <w:iCs/>
+        </w:rPr>
+        <w:fldChar w:fldCharType="begin"/>
+      </w:r>
+      <w:r>
+        <w:rPr>
+          <w:rFonts w:asciiTheme="minorHAnsi" w:hAnsiTheme="minorHAnsi" w:cstheme="minorHAnsi"/>
+          <w:b/>
+          <w:i/>
+          <w:iCs/>
+        </w:rPr>
+        <w:instrText xml:space="preserve"> MERGEFIELD HOSPITAL </w:instrText>
+      </w:r>
+      <w:r>
+        <w:rPr>
+          <w:rFonts w:asciiTheme="minorHAnsi" w:hAnsiTheme="minorHAnsi" w:cstheme="minorHAnsi"/>
+          <w:b/>
+          <w:i/>
+          <w:iCs/>
+        </w:rPr>
+        <w:fldChar w:fldCharType="separate"/>
+      </w:r>
+      <w:r>
+        <w:rPr>
+          <w:rFonts w:asciiTheme="minorHAnsi" w:hAnsiTheme="minorHAnsi" w:cstheme="minorHAnsi"/>
+          <w:b/>
+          <w:i/>
+          <w:iCs/>
+          <w:noProof/>
+        </w:rPr>
+        <w:instrText>HSJDRionegro</w:instrText>
+      </w:r>
+      <w:r>
+        <w:rPr>
+          <w:rFonts w:asciiTheme="minorHAnsi" w:hAnsiTheme="minorHAnsi" w:cstheme="minorHAnsi"/>
+          <w:b/>
+          <w:i/>
+          <w:iCs/>
+        </w:rPr>
+        <w:fldChar w:fldCharType="end"/>
+      </w:r>
+      <w:r>
+        <w:rPr>
+          <w:rFonts w:asciiTheme="minorHAnsi" w:hAnsiTheme="minorHAnsi" w:cstheme="minorHAnsi"/>
+          <w:b/>
+          <w:i/>
+          <w:iCs/>
+        </w:rPr>
+        <w:instrText xml:space="preserve"> = "</w:instrText>
+      </w:r>
+      <w:r>
+        <w:rPr>
+          <w:rFonts w:asciiTheme="minorHAnsi" w:hAnsiTheme="minorHAnsi" w:cstheme="minorHAnsi"/>
+          <w:b/>
+          <w:i/>
+          <w:iCs/>
+          <w:color w:val="000000"/>
+        </w:rPr>
+        <w:instrText>SAN LUIS</w:instrText>
+      </w:r>
+      <w:r>
+        <w:rPr>
+          <w:rFonts w:asciiTheme="minorHAnsi" w:hAnsiTheme="minorHAnsi" w:cstheme="minorHAnsi"/>
+          <w:b/>
+          <w:i/>
+          <w:iCs/>
+        </w:rPr>
+        <w:instrText xml:space="preserve">" "E.S.E. Hospital San Rafael de San Luis" </w:instrText>
+      </w:r>
+      <w:r>
+        <w:rPr>
+          <w:rFonts w:asciiTheme="minorHAnsi" w:hAnsiTheme="minorHAnsi" w:cstheme="minorHAnsi"/>
+          <w:b/>
+          <w:i/>
+          <w:iCs/>
+        </w:rPr>
+        <w:fldChar w:fldCharType="end"/>
+      </w:r>
+      <w:r>
+        <w:rPr>
+          <w:rFonts w:asciiTheme="minorHAnsi" w:hAnsiTheme="minorHAnsi" w:cstheme="minorHAnsi"/>
+          <w:b/>
+          <w:i/>
+          <w:iCs/>
+        </w:rPr>
+        <w:fldChar w:fldCharType="begin"/>
+      </w:r>
+      <w:r>
+        <w:rPr>
+          <w:rFonts w:asciiTheme="minorHAnsi" w:hAnsiTheme="minorHAnsi" w:cstheme="minorHAnsi"/>
+          <w:b/>
+          <w:i/>
+          <w:iCs/>
+        </w:rPr>
+        <w:instrText xml:space="preserve"> IF </w:instrText>
+      </w:r>
+      <w:r>
+        <w:rPr>
+          <w:rFonts w:asciiTheme="minorHAnsi" w:hAnsiTheme="minorHAnsi" w:cstheme="minorHAnsi"/>
+          <w:b/>
+          <w:i/>
+          <w:iCs/>
+        </w:rPr>
+        <w:fldChar w:fldCharType="begin"/>
+      </w:r>
+      <w:r>
+        <w:rPr>
+          <w:rFonts w:asciiTheme="minorHAnsi" w:hAnsiTheme="minorHAnsi" w:cstheme="minorHAnsi"/>
+          <w:b/>
+          <w:i/>
+          <w:iCs/>
+        </w:rPr>
+        <w:instrText xml:space="preserve"> MERGEFIELD HOSPITAL </w:instrText>
+      </w:r>
+      <w:r>
+        <w:rPr>
+          <w:rFonts w:asciiTheme="minorHAnsi" w:hAnsiTheme="minorHAnsi" w:cstheme="minorHAnsi"/>
+          <w:b/>
+          <w:i/>
+          <w:iCs/>
+        </w:rPr>
+        <w:fldChar w:fldCharType="separate"/>
+      </w:r>
+      <w:r>
+        <w:rPr>
+          <w:rFonts w:asciiTheme="minorHAnsi" w:hAnsiTheme="minorHAnsi" w:cstheme="minorHAnsi"/>
+          <w:b/>
+          <w:i/>
+          <w:iCs/>
+          <w:noProof/>
+        </w:rPr>
+        <w:instrText>HSJDRionegro</w:instrText>
+      </w:r>
+      <w:r>
+        <w:rPr>
+          <w:rFonts w:asciiTheme="minorHAnsi" w:hAnsiTheme="minorHAnsi" w:cstheme="minorHAnsi"/>
+          <w:b/>
+          <w:i/>
+          <w:iCs/>
+        </w:rPr>
+        <w:fldChar w:fldCharType="end"/>
+      </w:r>
+      <w:r>
+        <w:rPr>
+          <w:rFonts w:asciiTheme="minorHAnsi" w:hAnsiTheme="minorHAnsi" w:cstheme="minorHAnsi"/>
+          <w:b/>
+          <w:i/>
+          <w:iCs/>
+        </w:rPr>
+        <w:instrText xml:space="preserve"> = "</w:instrText>
+      </w:r>
+      <w:r>
+        <w:rPr>
+          <w:rFonts w:asciiTheme="minorHAnsi" w:hAnsiTheme="minorHAnsi" w:cstheme="minorHAnsi"/>
+          <w:b/>
+          <w:i/>
+          <w:iCs/>
+          <w:color w:val="000000"/>
+        </w:rPr>
+        <w:instrText>STA GERTRUDIS - ENTORNO S.</w:instrText>
+      </w:r>
+      <w:r>
+        <w:rPr>
+          <w:rFonts w:asciiTheme="minorHAnsi" w:hAnsiTheme="minorHAnsi" w:cstheme="minorHAnsi"/>
+          <w:b/>
+          <w:i/>
+          <w:iCs/>
+        </w:rPr>
+        <w:instrText xml:space="preserve">" "E.S.E. Santa Gertrudis - con el rograma Entorno Saludable" </w:instrText>
+      </w:r>
+      <w:r>
+        <w:rPr>
+          <w:rFonts w:asciiTheme="minorHAnsi" w:hAnsiTheme="minorHAnsi" w:cstheme="minorHAnsi"/>
+          <w:b/>
+          <w:i/>
+          <w:iCs/>
+        </w:rPr>
+        <w:fldChar w:fldCharType="end"/>
+      </w:r>
+      <w:r>
+        <w:rPr>
+          <w:rFonts w:asciiTheme="minorHAnsi" w:hAnsiTheme="minorHAnsi" w:cstheme="minorHAnsi"/>
+          <w:b/>
+          <w:i/>
+          <w:iCs/>
+        </w:rPr>
+        <w:fldChar w:fldCharType="begin"/>
+      </w:r>
+      <w:r>
+        <w:rPr>
+          <w:rFonts w:asciiTheme="minorHAnsi" w:hAnsiTheme="minorHAnsi" w:cstheme="minorHAnsi"/>
+          <w:b/>
+          <w:i/>
+          <w:iCs/>
+        </w:rPr>
+        <w:instrText xml:space="preserve"> IF </w:instrText>
+      </w:r>
+      <w:r>
+        <w:rPr>
+          <w:rFonts w:asciiTheme="minorHAnsi" w:hAnsiTheme="minorHAnsi" w:cstheme="minorHAnsi"/>
+          <w:b/>
+          <w:i/>
+          <w:iCs/>
+        </w:rPr>
+        <w:fldChar w:fldCharType="begin"/>
+      </w:r>
+      <w:r>
+        <w:rPr>
+          <w:rFonts w:asciiTheme="minorHAnsi" w:hAnsiTheme="minorHAnsi" w:cstheme="minorHAnsi"/>
+          <w:b/>
+          <w:i/>
+          <w:iCs/>
+        </w:rPr>
+        <w:instrText xml:space="preserve"> MERGEFIELD HOSPITAL </w:instrText>
+      </w:r>
+      <w:r>
+        <w:rPr>
+          <w:rFonts w:asciiTheme="minorHAnsi" w:hAnsiTheme="minorHAnsi" w:cstheme="minorHAnsi"/>
+          <w:b/>
+          <w:i/>
+          <w:iCs/>
+        </w:rPr>
+        <w:fldChar w:fldCharType="separate"/>
+      </w:r>
+      <w:r>
+        <w:rPr>
+          <w:rFonts w:asciiTheme="minorHAnsi" w:hAnsiTheme="minorHAnsi" w:cstheme="minorHAnsi"/>
+          <w:b/>
+          <w:i/>
+          <w:iCs/>
+          <w:noProof/>
+        </w:rPr>
+        <w:instrText>HSJDRionegro</w:instrText>
+      </w:r>
+      <w:r>
+        <w:rPr>
+          <w:rFonts w:asciiTheme="minorHAnsi" w:hAnsiTheme="minorHAnsi" w:cstheme="minorHAnsi"/>
+          <w:b/>
+          <w:i/>
+          <w:iCs/>
+        </w:rPr>
+        <w:fldChar w:fldCharType="end"/>
+      </w:r>
+      <w:r>
+        <w:rPr>
+          <w:rFonts w:asciiTheme="minorHAnsi" w:hAnsiTheme="minorHAnsi" w:cstheme="minorHAnsi"/>
+          <w:b/>
+          <w:i/>
+          <w:iCs/>
+        </w:rPr>
+        <w:instrText xml:space="preserve"> = "</w:instrText>
+      </w:r>
+      <w:r>
+        <w:rPr>
+          <w:rFonts w:asciiTheme="minorHAnsi" w:hAnsiTheme="minorHAnsi" w:cstheme="minorHAnsi"/>
+          <w:b/>
+          <w:i/>
+          <w:iCs/>
+          <w:color w:val="000000"/>
+        </w:rPr>
+        <w:instrText>URRAO</w:instrText>
+      </w:r>
+      <w:r>
+        <w:rPr>
+          <w:rFonts w:asciiTheme="minorHAnsi" w:hAnsiTheme="minorHAnsi" w:cstheme="minorHAnsi"/>
+          <w:b/>
+          <w:i/>
+          <w:iCs/>
+        </w:rPr>
+        <w:instrText xml:space="preserve">" "E.S.E. Hospital Ivan Restrepo Gomez" </w:instrText>
+      </w:r>
+      <w:r>
+        <w:rPr>
+          <w:rFonts w:asciiTheme="minorHAnsi" w:hAnsiTheme="minorHAnsi" w:cstheme="minorHAnsi"/>
+          <w:b/>
+          <w:i/>
+          <w:iCs/>
+        </w:rPr>
+        <w:fldChar w:fldCharType="end"/>
+      </w:r>
+      <w:r>
+        <w:rPr>
+          <w:rFonts w:asciiTheme="minorHAnsi" w:hAnsiTheme="minorHAnsi" w:cstheme="minorHAnsi"/>
+          <w:b/>
+          <w:i/>
+          <w:iCs/>
+        </w:rPr>
+        <w:fldChar w:fldCharType="begin"/>
+      </w:r>
+      <w:r>
+        <w:rPr>
+          <w:rFonts w:asciiTheme="minorHAnsi" w:hAnsiTheme="minorHAnsi" w:cstheme="minorHAnsi"/>
+          <w:b/>
+          <w:i/>
+          <w:iCs/>
+        </w:rPr>
+        <w:instrText xml:space="preserve"> IF </w:instrText>
+      </w:r>
+      <w:r>
+        <w:rPr>
+          <w:rFonts w:asciiTheme="minorHAnsi" w:hAnsiTheme="minorHAnsi" w:cstheme="minorHAnsi"/>
+          <w:b/>
+          <w:i/>
+          <w:iCs/>
+        </w:rPr>
+        <w:fldChar w:fldCharType="begin"/>
+      </w:r>
+      <w:r>
+        <w:rPr>
+          <w:rFonts w:asciiTheme="minorHAnsi" w:hAnsiTheme="minorHAnsi" w:cstheme="minorHAnsi"/>
+          <w:b/>
+          <w:i/>
+          <w:iCs/>
+        </w:rPr>
+        <w:instrText xml:space="preserve"> MERGEFIELD HOSPITAL </w:instrText>
+      </w:r>
+      <w:r>
+        <w:rPr>
+          <w:rFonts w:asciiTheme="minorHAnsi" w:hAnsiTheme="minorHAnsi" w:cstheme="minorHAnsi"/>
+          <w:b/>
+          <w:i/>
+          <w:iCs/>
+        </w:rPr>
+        <w:fldChar w:fldCharType="separate"/>
+      </w:r>
+      <w:r>
+        <w:rPr>
+          <w:rFonts w:asciiTheme="minorHAnsi" w:hAnsiTheme="minorHAnsi" w:cstheme="minorHAnsi"/>
+          <w:b/>
+          <w:i/>
+          <w:iCs/>
+          <w:noProof/>
+        </w:rPr>
+        <w:instrText>HSJDRionegro</w:instrText>
+      </w:r>
+      <w:r>
+        <w:rPr>
+          <w:rFonts w:asciiTheme="minorHAnsi" w:hAnsiTheme="minorHAnsi" w:cstheme="minorHAnsi"/>
+          <w:b/>
+          <w:i/>
+          <w:iCs/>
+        </w:rPr>
+        <w:fldChar w:fldCharType="end"/>
+      </w:r>
+      <w:r>
+        <w:rPr>
+          <w:rFonts w:asciiTheme="minorHAnsi" w:hAnsiTheme="minorHAnsi" w:cstheme="minorHAnsi"/>
+          <w:b/>
+          <w:i/>
+          <w:iCs/>
+        </w:rPr>
+        <w:instrText xml:space="preserve"> = "</w:instrText>
+      </w:r>
+      <w:r>
+        <w:rPr>
+          <w:rFonts w:asciiTheme="minorHAnsi" w:hAnsiTheme="minorHAnsi" w:cstheme="minorHAnsi"/>
+          <w:b/>
+          <w:i/>
+          <w:iCs/>
+          <w:color w:val="000000"/>
+        </w:rPr>
+        <w:instrText>CIUDAD BOLIVAR</w:instrText>
+      </w:r>
+      <w:r>
+        <w:rPr>
+          <w:rFonts w:asciiTheme="minorHAnsi" w:hAnsiTheme="minorHAnsi" w:cstheme="minorHAnsi"/>
+          <w:b/>
+          <w:i/>
+          <w:iCs/>
+        </w:rPr>
+        <w:instrText xml:space="preserve">" "E.S.E. Hospital La Merced - Ciudad Bolivar (Ant)" </w:instrText>
+      </w:r>
+      <w:r>
+        <w:rPr>
+          <w:rFonts w:asciiTheme="minorHAnsi" w:hAnsiTheme="minorHAnsi" w:cstheme="minorHAnsi"/>
+          <w:b/>
+          <w:i/>
+          <w:iCs/>
+        </w:rPr>
+        <w:fldChar w:fldCharType="end"/>
+      </w:r>
+      <w:r>
+        <w:rPr>
+          <w:rFonts w:asciiTheme="minorHAnsi" w:hAnsiTheme="minorHAnsi" w:cstheme="minorHAnsi"/>
+          <w:b/>
+          <w:i/>
+          <w:iCs/>
+        </w:rPr>
+        <w:fldChar w:fldCharType="begin"/>
+      </w:r>
+      <w:r>
+        <w:rPr>
+          <w:rFonts w:asciiTheme="minorHAnsi" w:hAnsiTheme="minorHAnsi" w:cstheme="minorHAnsi"/>
+          <w:b/>
+          <w:i/>
+          <w:iCs/>
+        </w:rPr>
+        <w:instrText xml:space="preserve"> IF </w:instrText>
+      </w:r>
+      <w:r>
+        <w:rPr>
+          <w:rFonts w:asciiTheme="minorHAnsi" w:hAnsiTheme="minorHAnsi" w:cstheme="minorHAnsi"/>
+          <w:b/>
+          <w:i/>
+          <w:iCs/>
+        </w:rPr>
+        <w:fldChar w:fldCharType="begin"/>
+      </w:r>
+      <w:r>
+        <w:rPr>
+          <w:rFonts w:asciiTheme="minorHAnsi" w:hAnsiTheme="minorHAnsi" w:cstheme="minorHAnsi"/>
+          <w:b/>
+          <w:i/>
+          <w:iCs/>
+        </w:rPr>
+        <w:instrText xml:space="preserve"> MERGEFIELD HOSPITAL </w:instrText>
+      </w:r>
+      <w:r>
+        <w:rPr>
+          <w:rFonts w:asciiTheme="minorHAnsi" w:hAnsiTheme="minorHAnsi" w:cstheme="minorHAnsi"/>
+          <w:b/>
+          <w:i/>
+          <w:iCs/>
+        </w:rPr>
+        <w:fldChar w:fldCharType="separate"/>
+      </w:r>
+      <w:r>
+        <w:rPr>
+          <w:rFonts w:asciiTheme="minorHAnsi" w:hAnsiTheme="minorHAnsi" w:cstheme="minorHAnsi"/>
+          <w:b/>
+          <w:i/>
+          <w:iCs/>
+          <w:noProof/>
+        </w:rPr>
+        <w:instrText>HSJDRionegro</w:instrText>
+      </w:r>
+      <w:r>
+        <w:rPr>
+          <w:rFonts w:asciiTheme="minorHAnsi" w:hAnsiTheme="minorHAnsi" w:cstheme="minorHAnsi"/>
+          <w:b/>
+          <w:i/>
+          <w:iCs/>
+        </w:rPr>
+        <w:fldChar w:fldCharType="end"/>
+      </w:r>
+      <w:r>
+        <w:rPr>
+          <w:rFonts w:asciiTheme="minorHAnsi" w:hAnsiTheme="minorHAnsi" w:cstheme="minorHAnsi"/>
+          <w:b/>
+          <w:i/>
+          <w:iCs/>
+        </w:rPr>
+        <w:instrText xml:space="preserve"> = "</w:instrText>
+      </w:r>
+      <w:r>
+        <w:rPr>
+          <w:rFonts w:asciiTheme="minorHAnsi" w:hAnsiTheme="minorHAnsi" w:cstheme="minorHAnsi"/>
+          <w:b/>
+          <w:i/>
+          <w:iCs/>
+          <w:color w:val="000000"/>
+        </w:rPr>
+        <w:instrText>VENANCIO - SALUD MENTAL</w:instrText>
+      </w:r>
+      <w:r>
+        <w:rPr>
+          <w:rFonts w:asciiTheme="minorHAnsi" w:hAnsiTheme="minorHAnsi" w:cstheme="minorHAnsi"/>
+          <w:b/>
+          <w:i/>
+          <w:iCs/>
+        </w:rPr>
+        <w:instrText>" "E.S.E. Hospital Venancio Díaz Díaz</w:instrText>
+      </w:r>
+      <w:r>
+        <w:rPr>
+          <w:rFonts w:asciiTheme="minorHAnsi" w:hAnsiTheme="minorHAnsi" w:cstheme="minorHAnsi"/>
           <w:bCs/>
-        </w:rPr>
-        <w:t>${</w:t>
-      </w:r>
-      <w:r>
-        <w:rPr>
-          <w:b/>
-          <w:bCs/>
-          <w:i/>
-          <w:iCs/>
-        </w:rPr>
-        <w:t>HOSPITAL</w:t>
-      </w:r>
-      <w:r>
-        <w:rPr>
-          <w:rFonts w:asciiTheme="minorHAnsi" w:hAnsiTheme="minorHAnsi" w:cstheme="minorHAnsi"/>
-          <w:b/>
-          <w:bCs/>
-        </w:rPr>
-        <w:t>}</w:t>
+          <w:i/>
+          <w:iCs/>
+        </w:rPr>
+        <w:instrText xml:space="preserve"> - con el programa 'Salud mental'</w:instrText>
+      </w:r>
+      <w:r>
+        <w:rPr>
+          <w:rFonts w:asciiTheme="minorHAnsi" w:hAnsiTheme="minorHAnsi" w:cstheme="minorHAnsi"/>
+          <w:b/>
+          <w:i/>
+          <w:iCs/>
+        </w:rPr>
+        <w:instrText xml:space="preserve">" </w:instrText>
+      </w:r>
+      <w:r>
+        <w:rPr>
+          <w:rFonts w:asciiTheme="minorHAnsi" w:hAnsiTheme="minorHAnsi" w:cstheme="minorHAnsi"/>
+          <w:b/>
+          <w:i/>
+          <w:iCs/>
+        </w:rPr>
+        <w:fldChar w:fldCharType="end"/>
       </w:r>
       <w:r>
         <w:rPr>
@@ -573,7 +2189,26 @@
           <w:i/>
           <w:iCs/>
         </w:rPr>
-        <w:instrText xml:space="preserve"> = "BARBOSA" "E.S.E. Hospital San Vicente de Paul - Barbosa (Ant)" </w:instrText>
+        <w:instrText xml:space="preserve"> = "</w:instrText>
+      </w:r>
+      <w:r>
+        <w:rPr>
+          <w:rFonts w:asciiTheme="minorHAnsi" w:hAnsiTheme="minorHAnsi" w:cstheme="minorHAnsi"/>
+          <w:b/>
+          <w:i/>
+          <w:iCs/>
+          <w:color w:val="000000"/>
+        </w:rPr>
+        <w:instrText>VENANCIO - ASIST</w:instrText>
+      </w:r>
+      <w:r>
+        <w:rPr>
+          <w:rFonts w:asciiTheme="minorHAnsi" w:hAnsiTheme="minorHAnsi" w:cstheme="minorHAnsi"/>
+          <w:b/>
+          <w:i/>
+          <w:iCs/>
+        </w:rPr>
+        <w:instrText xml:space="preserve">" "E.S.E. Hospital Venancio Díaz Díaz" </w:instrText>
       </w:r>
       <w:r>
         <w:rPr>
@@ -655,7 +2290,26 @@
           <w:i/>
           <w:iCs/>
         </w:rPr>
-        <w:instrText xml:space="preserve"> = "PUERTO BERRIO" "E.S.E. Hospital La Cruz" </w:instrText>
+        <w:instrText xml:space="preserve"> = "</w:instrText>
+      </w:r>
+      <w:r>
+        <w:rPr>
+          <w:rFonts w:asciiTheme="minorHAnsi" w:hAnsiTheme="minorHAnsi" w:cstheme="minorHAnsi"/>
+          <w:b/>
+          <w:i/>
+          <w:iCs/>
+          <w:color w:val="000000"/>
+        </w:rPr>
+        <w:instrText>VENANCIO - UCI</w:instrText>
+      </w:r>
+      <w:r>
+        <w:rPr>
+          <w:rFonts w:asciiTheme="minorHAnsi" w:hAnsiTheme="minorHAnsi" w:cstheme="minorHAnsi"/>
+          <w:b/>
+          <w:i/>
+          <w:iCs/>
+        </w:rPr>
+        <w:instrText xml:space="preserve">" "E.S.E. Hospital Venancio Díaz Díaz" </w:instrText>
       </w:r>
       <w:r>
         <w:rPr>
@@ -737,7 +2391,26 @@
           <w:i/>
           <w:iCs/>
         </w:rPr>
-        <w:instrText xml:space="preserve"> = "ABEJORRAL SP" "E.S.E. Hospital San Juan De Dios Abejorral" </w:instrText>
+        <w:instrText xml:space="preserve"> = "</w:instrText>
+      </w:r>
+      <w:r>
+        <w:rPr>
+          <w:rFonts w:asciiTheme="minorHAnsi" w:hAnsiTheme="minorHAnsi" w:cstheme="minorHAnsi"/>
+          <w:b/>
+          <w:i/>
+          <w:iCs/>
+          <w:color w:val="000000"/>
+        </w:rPr>
+        <w:instrText>VENANCIO - ADMON</w:instrText>
+      </w:r>
+      <w:r>
+        <w:rPr>
+          <w:rFonts w:asciiTheme="minorHAnsi" w:hAnsiTheme="minorHAnsi" w:cstheme="minorHAnsi"/>
+          <w:b/>
+          <w:i/>
+          <w:iCs/>
+        </w:rPr>
+        <w:instrText xml:space="preserve">" "E.S.E. Hospital Venancio Díaz Díaz" </w:instrText>
       </w:r>
       <w:r>
         <w:rPr>
@@ -819,7 +2492,26 @@
           <w:i/>
           <w:iCs/>
         </w:rPr>
-        <w:instrText xml:space="preserve"> = "ABEJORRAL - BUEN COMIENZO" "E.S.E. Hospital San Juan de Dios Abejorral - Programa Buen Comienzo" </w:instrText>
+        <w:instrText xml:space="preserve"> = "</w:instrText>
+      </w:r>
+      <w:r>
+        <w:rPr>
+          <w:rFonts w:asciiTheme="minorHAnsi" w:hAnsiTheme="minorHAnsi" w:cstheme="minorHAnsi"/>
+          <w:b/>
+          <w:i/>
+          <w:iCs/>
+          <w:color w:val="000000"/>
+        </w:rPr>
+        <w:instrText>VENANCIO ADMON - APH</w:instrText>
+      </w:r>
+      <w:r>
+        <w:rPr>
+          <w:rFonts w:asciiTheme="minorHAnsi" w:hAnsiTheme="minorHAnsi" w:cstheme="minorHAnsi"/>
+          <w:b/>
+          <w:i/>
+          <w:iCs/>
+        </w:rPr>
+        <w:instrText xml:space="preserve">" "E.S.E. Hospital Venancio Díaz Díaz" </w:instrText>
       </w:r>
       <w:r>
         <w:rPr>
@@ -901,7 +2593,26 @@
           <w:i/>
           <w:iCs/>
         </w:rPr>
-        <w:instrText xml:space="preserve"> = "ABEJORRAL - SALUD P." "E.S.E. Hospital San Juan de Dios Abejorral - Programa Salud Pública" </w:instrText>
+        <w:instrText xml:space="preserve"> = "</w:instrText>
+      </w:r>
+      <w:r>
+        <w:rPr>
+          <w:rFonts w:asciiTheme="minorHAnsi" w:hAnsiTheme="minorHAnsi" w:cstheme="minorHAnsi"/>
+          <w:b/>
+          <w:i/>
+          <w:iCs/>
+          <w:color w:val="000000"/>
+        </w:rPr>
+        <w:instrText>VENANCIO - SALUD P.</w:instrText>
+      </w:r>
+      <w:r>
+        <w:rPr>
+          <w:rFonts w:asciiTheme="minorHAnsi" w:hAnsiTheme="minorHAnsi" w:cstheme="minorHAnsi"/>
+          <w:b/>
+          <w:i/>
+          <w:iCs/>
+        </w:rPr>
+        <w:instrText xml:space="preserve">" "E.S.E. Hospital Venancio Díaz Díaz" </w:instrText>
       </w:r>
       <w:r>
         <w:rPr>
@@ -983,7 +2694,26 @@
           <w:i/>
           <w:iCs/>
         </w:rPr>
-        <w:instrText xml:space="preserve"> = "BETANIA" "E.S.E. Hospital San Antonio de Betania" </w:instrText>
+        <w:instrText xml:space="preserve"> = "</w:instrText>
+      </w:r>
+      <w:r>
+        <w:rPr>
+          <w:rFonts w:asciiTheme="minorHAnsi" w:hAnsiTheme="minorHAnsi" w:cstheme="minorHAnsi"/>
+          <w:b/>
+          <w:i/>
+          <w:iCs/>
+          <w:color w:val="000000"/>
+        </w:rPr>
+        <w:instrText>VENANCIO - PIC</w:instrText>
+      </w:r>
+      <w:r>
+        <w:rPr>
+          <w:rFonts w:asciiTheme="minorHAnsi" w:hAnsiTheme="minorHAnsi" w:cstheme="minorHAnsi"/>
+          <w:b/>
+          <w:i/>
+          <w:iCs/>
+        </w:rPr>
+        <w:instrText xml:space="preserve">" "E.S.E. Hospital Venancio Díaz Díaz - Programa PIC" </w:instrText>
       </w:r>
       <w:r>
         <w:rPr>
@@ -1065,7 +2795,26 @@
           <w:i/>
           <w:iCs/>
         </w:rPr>
-        <w:instrText xml:space="preserve"> = "BETANIA - BUEN COMIENZO" "E.S.E. Hospital San Antonio de Betania" </w:instrText>
+        <w:instrText xml:space="preserve"> = "</w:instrText>
+      </w:r>
+      <w:r>
+        <w:rPr>
+          <w:rFonts w:asciiTheme="minorHAnsi" w:hAnsiTheme="minorHAnsi" w:cstheme="minorHAnsi"/>
+          <w:b/>
+          <w:i/>
+          <w:iCs/>
+          <w:color w:val="000000"/>
+        </w:rPr>
+        <w:instrText>VENANCIO</w:instrText>
+      </w:r>
+      <w:r>
+        <w:rPr>
+          <w:rFonts w:asciiTheme="minorHAnsi" w:hAnsiTheme="minorHAnsi" w:cstheme="minorHAnsi"/>
+          <w:b/>
+          <w:i/>
+          <w:iCs/>
+        </w:rPr>
+        <w:instrText xml:space="preserve">" "E.S.E. Hospital Venancio Díaz Díaz" </w:instrText>
       </w:r>
       <w:r>
         <w:rPr>
@@ -1157,16 +2906,98 @@
           <w:iCs/>
           <w:color w:val="000000"/>
         </w:rPr>
-        <w:instrText>COPACABANA</w:instrText>
-      </w:r>
-      <w:r>
-        <w:rPr>
-          <w:rFonts w:asciiTheme="minorHAnsi" w:hAnsiTheme="minorHAnsi" w:cstheme="minorHAnsi"/>
-          <w:b/>
-          <w:i/>
-          <w:iCs/>
-        </w:rPr>
-        <w:instrText>" "</w:instrText>
+        <w:instrText>BELLO</w:instrText>
+      </w:r>
+      <w:r>
+        <w:rPr>
+          <w:rFonts w:asciiTheme="minorHAnsi" w:hAnsiTheme="minorHAnsi" w:cstheme="minorHAnsi"/>
+          <w:b/>
+          <w:i/>
+          <w:iCs/>
+        </w:rPr>
+        <w:instrText xml:space="preserve">" "E.S.E. Hospital Marco Fidel Suárez de Bello" </w:instrText>
+      </w:r>
+      <w:r>
+        <w:rPr>
+          <w:rFonts w:asciiTheme="minorHAnsi" w:hAnsiTheme="minorHAnsi" w:cstheme="minorHAnsi"/>
+          <w:b/>
+          <w:i/>
+          <w:iCs/>
+        </w:rPr>
+        <w:fldChar w:fldCharType="end"/>
+      </w:r>
+      <w:r>
+        <w:rPr>
+          <w:rFonts w:asciiTheme="minorHAnsi" w:hAnsiTheme="minorHAnsi" w:cstheme="minorHAnsi"/>
+          <w:b/>
+          <w:i/>
+          <w:iCs/>
+        </w:rPr>
+        <w:fldChar w:fldCharType="begin"/>
+      </w:r>
+      <w:r>
+        <w:rPr>
+          <w:rFonts w:asciiTheme="minorHAnsi" w:hAnsiTheme="minorHAnsi" w:cstheme="minorHAnsi"/>
+          <w:b/>
+          <w:i/>
+          <w:iCs/>
+        </w:rPr>
+        <w:instrText xml:space="preserve"> IF </w:instrText>
+      </w:r>
+      <w:r>
+        <w:rPr>
+          <w:rFonts w:asciiTheme="minorHAnsi" w:hAnsiTheme="minorHAnsi" w:cstheme="minorHAnsi"/>
+          <w:b/>
+          <w:i/>
+          <w:iCs/>
+        </w:rPr>
+        <w:fldChar w:fldCharType="begin"/>
+      </w:r>
+      <w:r>
+        <w:rPr>
+          <w:rFonts w:asciiTheme="minorHAnsi" w:hAnsiTheme="minorHAnsi" w:cstheme="minorHAnsi"/>
+          <w:b/>
+          <w:i/>
+          <w:iCs/>
+        </w:rPr>
+        <w:instrText xml:space="preserve"> MERGEFIELD HOSPITAL </w:instrText>
+      </w:r>
+      <w:r>
+        <w:rPr>
+          <w:rFonts w:asciiTheme="minorHAnsi" w:hAnsiTheme="minorHAnsi" w:cstheme="minorHAnsi"/>
+          <w:b/>
+          <w:i/>
+          <w:iCs/>
+        </w:rPr>
+        <w:fldChar w:fldCharType="separate"/>
+      </w:r>
+      <w:r>
+        <w:rPr>
+          <w:rFonts w:asciiTheme="minorHAnsi" w:hAnsiTheme="minorHAnsi" w:cstheme="minorHAnsi"/>
+          <w:b/>
+          <w:i/>
+          <w:iCs/>
+          <w:noProof/>
+        </w:rPr>
+        <w:instrText>HSJDRionegro</w:instrText>
+      </w:r>
+      <w:r>
+        <w:rPr>
+          <w:rFonts w:asciiTheme="minorHAnsi" w:hAnsiTheme="minorHAnsi" w:cstheme="minorHAnsi"/>
+          <w:b/>
+          <w:i/>
+          <w:iCs/>
+        </w:rPr>
+        <w:fldChar w:fldCharType="end"/>
+      </w:r>
+      <w:r>
+        <w:rPr>
+          <w:rFonts w:asciiTheme="minorHAnsi" w:hAnsiTheme="minorHAnsi" w:cstheme="minorHAnsi"/>
+          <w:b/>
+          <w:i/>
+          <w:iCs/>
+        </w:rPr>
+        <w:instrText xml:space="preserve"> = "</w:instrText>
       </w:r>
       <w:r>
         <w:rPr>
@@ -1176,16 +3007,16 @@
           <w:iCs/>
           <w:color w:val="000000"/>
         </w:rPr>
-        <w:instrText>E.S.E. Hospital Santa Margarita</w:instrText>
-      </w:r>
-      <w:r>
-        <w:rPr>
-          <w:rFonts w:asciiTheme="minorHAnsi" w:hAnsiTheme="minorHAnsi" w:cstheme="minorHAnsi"/>
-          <w:b/>
-          <w:i/>
-          <w:iCs/>
-        </w:rPr>
-        <w:instrText xml:space="preserve">" </w:instrText>
+        <w:instrText>HSRI</w:instrText>
+      </w:r>
+      <w:r>
+        <w:rPr>
+          <w:rFonts w:asciiTheme="minorHAnsi" w:hAnsiTheme="minorHAnsi" w:cstheme="minorHAnsi"/>
+          <w:b/>
+          <w:i/>
+          <w:iCs/>
+        </w:rPr>
+        <w:instrText xml:space="preserve">" "E.S.E. Hospital San Rafael de Itagüí" </w:instrText>
       </w:r>
       <w:r>
         <w:rPr>
@@ -1277,1899 +3108,6 @@
           <w:iCs/>
           <w:color w:val="000000"/>
         </w:rPr>
-        <w:instrText>COPACABANA - SALUD P.</w:instrText>
-      </w:r>
-      <w:r>
-        <w:rPr>
-          <w:rFonts w:asciiTheme="minorHAnsi" w:hAnsiTheme="minorHAnsi" w:cstheme="minorHAnsi"/>
-          <w:b/>
-          <w:i/>
-          <w:iCs/>
-        </w:rPr>
-        <w:instrText>" "</w:instrText>
-      </w:r>
-      <w:r>
-        <w:rPr>
-          <w:rFonts w:asciiTheme="minorHAnsi" w:hAnsiTheme="minorHAnsi" w:cstheme="minorHAnsi"/>
-          <w:b/>
-          <w:i/>
-          <w:iCs/>
-          <w:color w:val="000000"/>
-        </w:rPr>
-        <w:instrText>E.S.E. Hospital Santa Margarita - Programa Salud Pública</w:instrText>
-      </w:r>
-      <w:r>
-        <w:rPr>
-          <w:rFonts w:asciiTheme="minorHAnsi" w:hAnsiTheme="minorHAnsi" w:cstheme="minorHAnsi"/>
-          <w:b/>
-          <w:i/>
-          <w:iCs/>
-        </w:rPr>
-        <w:instrText xml:space="preserve">" </w:instrText>
-      </w:r>
-      <w:r>
-        <w:rPr>
-          <w:rFonts w:asciiTheme="minorHAnsi" w:hAnsiTheme="minorHAnsi" w:cstheme="minorHAnsi"/>
-          <w:b/>
-          <w:i/>
-          <w:iCs/>
-        </w:rPr>
-        <w:fldChar w:fldCharType="end"/>
-      </w:r>
-      <w:r>
-        <w:rPr>
-          <w:rFonts w:asciiTheme="minorHAnsi" w:hAnsiTheme="minorHAnsi" w:cstheme="minorHAnsi"/>
-          <w:b/>
-          <w:i/>
-          <w:iCs/>
-        </w:rPr>
-        <w:fldChar w:fldCharType="begin"/>
-      </w:r>
-      <w:r>
-        <w:rPr>
-          <w:rFonts w:asciiTheme="minorHAnsi" w:hAnsiTheme="minorHAnsi" w:cstheme="minorHAnsi"/>
-          <w:b/>
-          <w:i/>
-          <w:iCs/>
-        </w:rPr>
-        <w:instrText xml:space="preserve"> IF </w:instrText>
-      </w:r>
-      <w:r>
-        <w:rPr>
-          <w:rFonts w:asciiTheme="minorHAnsi" w:hAnsiTheme="minorHAnsi" w:cstheme="minorHAnsi"/>
-          <w:b/>
-          <w:i/>
-          <w:iCs/>
-        </w:rPr>
-        <w:fldChar w:fldCharType="begin"/>
-      </w:r>
-      <w:r>
-        <w:rPr>
-          <w:rFonts w:asciiTheme="minorHAnsi" w:hAnsiTheme="minorHAnsi" w:cstheme="minorHAnsi"/>
-          <w:b/>
-          <w:i/>
-          <w:iCs/>
-        </w:rPr>
-        <w:instrText xml:space="preserve"> MERGEFIELD HOSPITAL </w:instrText>
-      </w:r>
-      <w:r>
-        <w:rPr>
-          <w:rFonts w:asciiTheme="minorHAnsi" w:hAnsiTheme="minorHAnsi" w:cstheme="minorHAnsi"/>
-          <w:b/>
-          <w:i/>
-          <w:iCs/>
-        </w:rPr>
-        <w:fldChar w:fldCharType="separate"/>
-      </w:r>
-      <w:r>
-        <w:rPr>
-          <w:rFonts w:asciiTheme="minorHAnsi" w:hAnsiTheme="minorHAnsi" w:cstheme="minorHAnsi"/>
-          <w:b/>
-          <w:i/>
-          <w:iCs/>
-          <w:noProof/>
-        </w:rPr>
-        <w:instrText>HSJDRionegro</w:instrText>
-      </w:r>
-      <w:r>
-        <w:rPr>
-          <w:rFonts w:asciiTheme="minorHAnsi" w:hAnsiTheme="minorHAnsi" w:cstheme="minorHAnsi"/>
-          <w:b/>
-          <w:i/>
-          <w:iCs/>
-        </w:rPr>
-        <w:fldChar w:fldCharType="end"/>
-      </w:r>
-      <w:r>
-        <w:rPr>
-          <w:rFonts w:asciiTheme="minorHAnsi" w:hAnsiTheme="minorHAnsi" w:cstheme="minorHAnsi"/>
-          <w:b/>
-          <w:i/>
-          <w:iCs/>
-        </w:rPr>
-        <w:instrText xml:space="preserve"> = "</w:instrText>
-      </w:r>
-      <w:r>
-        <w:rPr>
-          <w:rFonts w:asciiTheme="minorHAnsi" w:hAnsiTheme="minorHAnsi" w:cstheme="minorHAnsi"/>
-          <w:b/>
-          <w:i/>
-          <w:iCs/>
-          <w:color w:val="000000"/>
-        </w:rPr>
-        <w:instrText>ITAGUI</w:instrText>
-      </w:r>
-      <w:r>
-        <w:rPr>
-          <w:rFonts w:asciiTheme="minorHAnsi" w:hAnsiTheme="minorHAnsi" w:cstheme="minorHAnsi"/>
-          <w:b/>
-          <w:i/>
-          <w:iCs/>
-        </w:rPr>
-        <w:instrText>" "</w:instrText>
-      </w:r>
-      <w:r>
-        <w:rPr>
-          <w:rFonts w:asciiTheme="minorHAnsi" w:hAnsiTheme="minorHAnsi" w:cstheme="minorHAnsi"/>
-          <w:b/>
-          <w:i/>
-          <w:iCs/>
-          <w:color w:val="000000"/>
-        </w:rPr>
-        <w:instrText>E.S.E. Hospital San Rafael Itagui</w:instrText>
-      </w:r>
-      <w:r>
-        <w:rPr>
-          <w:rFonts w:asciiTheme="minorHAnsi" w:hAnsiTheme="minorHAnsi" w:cstheme="minorHAnsi"/>
-          <w:b/>
-          <w:i/>
-          <w:iCs/>
-        </w:rPr>
-        <w:instrText xml:space="preserve">" </w:instrText>
-      </w:r>
-      <w:r>
-        <w:rPr>
-          <w:rFonts w:asciiTheme="minorHAnsi" w:hAnsiTheme="minorHAnsi" w:cstheme="minorHAnsi"/>
-          <w:b/>
-          <w:i/>
-          <w:iCs/>
-        </w:rPr>
-        <w:fldChar w:fldCharType="end"/>
-      </w:r>
-      <w:r>
-        <w:rPr>
-          <w:rFonts w:asciiTheme="minorHAnsi" w:hAnsiTheme="minorHAnsi" w:cstheme="minorHAnsi"/>
-          <w:b/>
-          <w:i/>
-          <w:iCs/>
-        </w:rPr>
-        <w:fldChar w:fldCharType="begin"/>
-      </w:r>
-      <w:r>
-        <w:rPr>
-          <w:rFonts w:asciiTheme="minorHAnsi" w:hAnsiTheme="minorHAnsi" w:cstheme="minorHAnsi"/>
-          <w:b/>
-          <w:i/>
-          <w:iCs/>
-        </w:rPr>
-        <w:instrText xml:space="preserve"> IF </w:instrText>
-      </w:r>
-      <w:r>
-        <w:rPr>
-          <w:rFonts w:asciiTheme="minorHAnsi" w:hAnsiTheme="minorHAnsi" w:cstheme="minorHAnsi"/>
-          <w:b/>
-          <w:i/>
-          <w:iCs/>
-        </w:rPr>
-        <w:fldChar w:fldCharType="begin"/>
-      </w:r>
-      <w:r>
-        <w:rPr>
-          <w:rFonts w:asciiTheme="minorHAnsi" w:hAnsiTheme="minorHAnsi" w:cstheme="minorHAnsi"/>
-          <w:b/>
-          <w:i/>
-          <w:iCs/>
-        </w:rPr>
-        <w:instrText xml:space="preserve"> MERGEFIELD HOSPITAL </w:instrText>
-      </w:r>
-      <w:r>
-        <w:rPr>
-          <w:rFonts w:asciiTheme="minorHAnsi" w:hAnsiTheme="minorHAnsi" w:cstheme="minorHAnsi"/>
-          <w:b/>
-          <w:i/>
-          <w:iCs/>
-        </w:rPr>
-        <w:fldChar w:fldCharType="separate"/>
-      </w:r>
-      <w:r>
-        <w:rPr>
-          <w:rFonts w:asciiTheme="minorHAnsi" w:hAnsiTheme="minorHAnsi" w:cstheme="minorHAnsi"/>
-          <w:b/>
-          <w:i/>
-          <w:iCs/>
-          <w:noProof/>
-        </w:rPr>
-        <w:instrText>HSJDRionegro</w:instrText>
-      </w:r>
-      <w:r>
-        <w:rPr>
-          <w:rFonts w:asciiTheme="minorHAnsi" w:hAnsiTheme="minorHAnsi" w:cstheme="minorHAnsi"/>
-          <w:b/>
-          <w:i/>
-          <w:iCs/>
-        </w:rPr>
-        <w:fldChar w:fldCharType="end"/>
-      </w:r>
-      <w:r>
-        <w:rPr>
-          <w:rFonts w:asciiTheme="minorHAnsi" w:hAnsiTheme="minorHAnsi" w:cstheme="minorHAnsi"/>
-          <w:b/>
-          <w:i/>
-          <w:iCs/>
-        </w:rPr>
-        <w:instrText xml:space="preserve"> = "</w:instrText>
-      </w:r>
-      <w:r>
-        <w:rPr>
-          <w:rFonts w:asciiTheme="minorHAnsi" w:hAnsiTheme="minorHAnsi" w:cstheme="minorHAnsi"/>
-          <w:b/>
-          <w:i/>
-          <w:iCs/>
-          <w:color w:val="000000"/>
-        </w:rPr>
-        <w:instrText>SAMEIN</w:instrText>
-      </w:r>
-      <w:r>
-        <w:rPr>
-          <w:rFonts w:asciiTheme="minorHAnsi" w:hAnsiTheme="minorHAnsi" w:cstheme="minorHAnsi"/>
-          <w:b/>
-          <w:i/>
-          <w:iCs/>
-        </w:rPr>
-        <w:instrText>" "</w:instrText>
-      </w:r>
-      <w:r>
-        <w:rPr>
-          <w:rFonts w:asciiTheme="minorHAnsi" w:hAnsiTheme="minorHAnsi" w:cstheme="minorHAnsi"/>
-          <w:b/>
-          <w:i/>
-          <w:iCs/>
-          <w:color w:val="000000"/>
-        </w:rPr>
-        <w:instrText>I.P.S. Samein S.A.</w:instrText>
-      </w:r>
-      <w:r>
-        <w:rPr>
-          <w:rFonts w:asciiTheme="minorHAnsi" w:hAnsiTheme="minorHAnsi" w:cstheme="minorHAnsi"/>
-          <w:b/>
-          <w:i/>
-          <w:iCs/>
-        </w:rPr>
-        <w:instrText xml:space="preserve">" </w:instrText>
-      </w:r>
-      <w:r>
-        <w:rPr>
-          <w:rFonts w:asciiTheme="minorHAnsi" w:hAnsiTheme="minorHAnsi" w:cstheme="minorHAnsi"/>
-          <w:b/>
-          <w:i/>
-          <w:iCs/>
-        </w:rPr>
-        <w:fldChar w:fldCharType="end"/>
-      </w:r>
-      <w:r>
-        <w:rPr>
-          <w:rFonts w:asciiTheme="minorHAnsi" w:hAnsiTheme="minorHAnsi" w:cstheme="minorHAnsi"/>
-          <w:b/>
-          <w:i/>
-          <w:iCs/>
-        </w:rPr>
-        <w:fldChar w:fldCharType="begin"/>
-      </w:r>
-      <w:r>
-        <w:rPr>
-          <w:rFonts w:asciiTheme="minorHAnsi" w:hAnsiTheme="minorHAnsi" w:cstheme="minorHAnsi"/>
-          <w:b/>
-          <w:i/>
-          <w:iCs/>
-        </w:rPr>
-        <w:instrText xml:space="preserve"> IF </w:instrText>
-      </w:r>
-      <w:r>
-        <w:rPr>
-          <w:rFonts w:asciiTheme="minorHAnsi" w:hAnsiTheme="minorHAnsi" w:cstheme="minorHAnsi"/>
-          <w:b/>
-          <w:i/>
-          <w:iCs/>
-        </w:rPr>
-        <w:fldChar w:fldCharType="begin"/>
-      </w:r>
-      <w:r>
-        <w:rPr>
-          <w:rFonts w:asciiTheme="minorHAnsi" w:hAnsiTheme="minorHAnsi" w:cstheme="minorHAnsi"/>
-          <w:b/>
-          <w:i/>
-          <w:iCs/>
-        </w:rPr>
-        <w:instrText xml:space="preserve"> MERGEFIELD HOSPITAL </w:instrText>
-      </w:r>
-      <w:r>
-        <w:rPr>
-          <w:rFonts w:asciiTheme="minorHAnsi" w:hAnsiTheme="minorHAnsi" w:cstheme="minorHAnsi"/>
-          <w:b/>
-          <w:i/>
-          <w:iCs/>
-        </w:rPr>
-        <w:fldChar w:fldCharType="separate"/>
-      </w:r>
-      <w:r>
-        <w:rPr>
-          <w:rFonts w:asciiTheme="minorHAnsi" w:hAnsiTheme="minorHAnsi" w:cstheme="minorHAnsi"/>
-          <w:b/>
-          <w:i/>
-          <w:iCs/>
-          <w:noProof/>
-        </w:rPr>
-        <w:instrText>HSJDRionegro</w:instrText>
-      </w:r>
-      <w:r>
-        <w:rPr>
-          <w:rFonts w:asciiTheme="minorHAnsi" w:hAnsiTheme="minorHAnsi" w:cstheme="minorHAnsi"/>
-          <w:b/>
-          <w:i/>
-          <w:iCs/>
-        </w:rPr>
-        <w:fldChar w:fldCharType="end"/>
-      </w:r>
-      <w:r>
-        <w:rPr>
-          <w:rFonts w:asciiTheme="minorHAnsi" w:hAnsiTheme="minorHAnsi" w:cstheme="minorHAnsi"/>
-          <w:b/>
-          <w:i/>
-          <w:iCs/>
-        </w:rPr>
-        <w:instrText xml:space="preserve"> = "</w:instrText>
-      </w:r>
-      <w:r>
-        <w:rPr>
-          <w:rFonts w:asciiTheme="minorHAnsi" w:hAnsiTheme="minorHAnsi" w:cstheme="minorHAnsi"/>
-          <w:b/>
-          <w:i/>
-          <w:iCs/>
-          <w:color w:val="000000"/>
-        </w:rPr>
-        <w:instrText>STA GERTRUDIS</w:instrText>
-      </w:r>
-      <w:r>
-        <w:rPr>
-          <w:rFonts w:asciiTheme="minorHAnsi" w:hAnsiTheme="minorHAnsi" w:cstheme="minorHAnsi"/>
-          <w:b/>
-          <w:i/>
-          <w:iCs/>
-        </w:rPr>
-        <w:instrText xml:space="preserve">" "E.S.E. Santa Gertrudis" </w:instrText>
-      </w:r>
-      <w:r>
-        <w:rPr>
-          <w:rFonts w:asciiTheme="minorHAnsi" w:hAnsiTheme="minorHAnsi" w:cstheme="minorHAnsi"/>
-          <w:b/>
-          <w:i/>
-          <w:iCs/>
-        </w:rPr>
-        <w:fldChar w:fldCharType="end"/>
-      </w:r>
-      <w:r>
-        <w:rPr>
-          <w:rFonts w:asciiTheme="minorHAnsi" w:hAnsiTheme="minorHAnsi" w:cstheme="minorHAnsi"/>
-          <w:b/>
-          <w:i/>
-          <w:iCs/>
-        </w:rPr>
-        <w:fldChar w:fldCharType="begin"/>
-      </w:r>
-      <w:r>
-        <w:rPr>
-          <w:rFonts w:asciiTheme="minorHAnsi" w:hAnsiTheme="minorHAnsi" w:cstheme="minorHAnsi"/>
-          <w:b/>
-          <w:i/>
-          <w:iCs/>
-        </w:rPr>
-        <w:instrText xml:space="preserve"> IF </w:instrText>
-      </w:r>
-      <w:r>
-        <w:rPr>
-          <w:rFonts w:asciiTheme="minorHAnsi" w:hAnsiTheme="minorHAnsi" w:cstheme="minorHAnsi"/>
-          <w:b/>
-          <w:i/>
-          <w:iCs/>
-        </w:rPr>
-        <w:fldChar w:fldCharType="begin"/>
-      </w:r>
-      <w:r>
-        <w:rPr>
-          <w:rFonts w:asciiTheme="minorHAnsi" w:hAnsiTheme="minorHAnsi" w:cstheme="minorHAnsi"/>
-          <w:b/>
-          <w:i/>
-          <w:iCs/>
-        </w:rPr>
-        <w:instrText xml:space="preserve"> MERGEFIELD HOSPITAL </w:instrText>
-      </w:r>
-      <w:r>
-        <w:rPr>
-          <w:rFonts w:asciiTheme="minorHAnsi" w:hAnsiTheme="minorHAnsi" w:cstheme="minorHAnsi"/>
-          <w:b/>
-          <w:i/>
-          <w:iCs/>
-        </w:rPr>
-        <w:fldChar w:fldCharType="separate"/>
-      </w:r>
-      <w:r>
-        <w:rPr>
-          <w:rFonts w:asciiTheme="minorHAnsi" w:hAnsiTheme="minorHAnsi" w:cstheme="minorHAnsi"/>
-          <w:b/>
-          <w:i/>
-          <w:iCs/>
-          <w:noProof/>
-        </w:rPr>
-        <w:instrText>HSJDRionegro</w:instrText>
-      </w:r>
-      <w:r>
-        <w:rPr>
-          <w:rFonts w:asciiTheme="minorHAnsi" w:hAnsiTheme="minorHAnsi" w:cstheme="minorHAnsi"/>
-          <w:b/>
-          <w:i/>
-          <w:iCs/>
-        </w:rPr>
-        <w:fldChar w:fldCharType="end"/>
-      </w:r>
-      <w:r>
-        <w:rPr>
-          <w:rFonts w:asciiTheme="minorHAnsi" w:hAnsiTheme="minorHAnsi" w:cstheme="minorHAnsi"/>
-          <w:b/>
-          <w:i/>
-          <w:iCs/>
-        </w:rPr>
-        <w:instrText xml:space="preserve"> = "</w:instrText>
-      </w:r>
-      <w:r>
-        <w:rPr>
-          <w:rFonts w:asciiTheme="minorHAnsi" w:hAnsiTheme="minorHAnsi" w:cstheme="minorHAnsi"/>
-          <w:b/>
-          <w:i/>
-          <w:iCs/>
-          <w:color w:val="000000"/>
-        </w:rPr>
-        <w:instrText>SAN LUIS</w:instrText>
-      </w:r>
-      <w:r>
-        <w:rPr>
-          <w:rFonts w:asciiTheme="minorHAnsi" w:hAnsiTheme="minorHAnsi" w:cstheme="minorHAnsi"/>
-          <w:b/>
-          <w:i/>
-          <w:iCs/>
-        </w:rPr>
-        <w:instrText xml:space="preserve">" "E.S.E. Hospital San Rafael de San Luis" </w:instrText>
-      </w:r>
-      <w:r>
-        <w:rPr>
-          <w:rFonts w:asciiTheme="minorHAnsi" w:hAnsiTheme="minorHAnsi" w:cstheme="minorHAnsi"/>
-          <w:b/>
-          <w:i/>
-          <w:iCs/>
-        </w:rPr>
-        <w:fldChar w:fldCharType="end"/>
-      </w:r>
-      <w:r>
-        <w:rPr>
-          <w:rFonts w:asciiTheme="minorHAnsi" w:hAnsiTheme="minorHAnsi" w:cstheme="minorHAnsi"/>
-          <w:b/>
-          <w:i/>
-          <w:iCs/>
-        </w:rPr>
-        <w:fldChar w:fldCharType="begin"/>
-      </w:r>
-      <w:r>
-        <w:rPr>
-          <w:rFonts w:asciiTheme="minorHAnsi" w:hAnsiTheme="minorHAnsi" w:cstheme="minorHAnsi"/>
-          <w:b/>
-          <w:i/>
-          <w:iCs/>
-        </w:rPr>
-        <w:instrText xml:space="preserve"> IF </w:instrText>
-      </w:r>
-      <w:r>
-        <w:rPr>
-          <w:rFonts w:asciiTheme="minorHAnsi" w:hAnsiTheme="minorHAnsi" w:cstheme="minorHAnsi"/>
-          <w:b/>
-          <w:i/>
-          <w:iCs/>
-        </w:rPr>
-        <w:fldChar w:fldCharType="begin"/>
-      </w:r>
-      <w:r>
-        <w:rPr>
-          <w:rFonts w:asciiTheme="minorHAnsi" w:hAnsiTheme="minorHAnsi" w:cstheme="minorHAnsi"/>
-          <w:b/>
-          <w:i/>
-          <w:iCs/>
-        </w:rPr>
-        <w:instrText xml:space="preserve"> MERGEFIELD HOSPITAL </w:instrText>
-      </w:r>
-      <w:r>
-        <w:rPr>
-          <w:rFonts w:asciiTheme="minorHAnsi" w:hAnsiTheme="minorHAnsi" w:cstheme="minorHAnsi"/>
-          <w:b/>
-          <w:i/>
-          <w:iCs/>
-        </w:rPr>
-        <w:fldChar w:fldCharType="separate"/>
-      </w:r>
-      <w:r>
-        <w:rPr>
-          <w:rFonts w:asciiTheme="minorHAnsi" w:hAnsiTheme="minorHAnsi" w:cstheme="minorHAnsi"/>
-          <w:b/>
-          <w:i/>
-          <w:iCs/>
-          <w:noProof/>
-        </w:rPr>
-        <w:instrText>HSJDRionegro</w:instrText>
-      </w:r>
-      <w:r>
-        <w:rPr>
-          <w:rFonts w:asciiTheme="minorHAnsi" w:hAnsiTheme="minorHAnsi" w:cstheme="minorHAnsi"/>
-          <w:b/>
-          <w:i/>
-          <w:iCs/>
-        </w:rPr>
-        <w:fldChar w:fldCharType="end"/>
-      </w:r>
-      <w:r>
-        <w:rPr>
-          <w:rFonts w:asciiTheme="minorHAnsi" w:hAnsiTheme="minorHAnsi" w:cstheme="minorHAnsi"/>
-          <w:b/>
-          <w:i/>
-          <w:iCs/>
-        </w:rPr>
-        <w:instrText xml:space="preserve"> = "</w:instrText>
-      </w:r>
-      <w:r>
-        <w:rPr>
-          <w:rFonts w:asciiTheme="minorHAnsi" w:hAnsiTheme="minorHAnsi" w:cstheme="minorHAnsi"/>
-          <w:b/>
-          <w:i/>
-          <w:iCs/>
-          <w:color w:val="000000"/>
-        </w:rPr>
-        <w:instrText>STA GERTRUDIS - ENTORNO S.</w:instrText>
-      </w:r>
-      <w:r>
-        <w:rPr>
-          <w:rFonts w:asciiTheme="minorHAnsi" w:hAnsiTheme="minorHAnsi" w:cstheme="minorHAnsi"/>
-          <w:b/>
-          <w:i/>
-          <w:iCs/>
-        </w:rPr>
-        <w:instrText xml:space="preserve">" "E.S.E. Santa Gertrudis - con el rograma Entorno Saludable" </w:instrText>
-      </w:r>
-      <w:r>
-        <w:rPr>
-          <w:rFonts w:asciiTheme="minorHAnsi" w:hAnsiTheme="minorHAnsi" w:cstheme="minorHAnsi"/>
-          <w:b/>
-          <w:i/>
-          <w:iCs/>
-        </w:rPr>
-        <w:fldChar w:fldCharType="end"/>
-      </w:r>
-      <w:r>
-        <w:rPr>
-          <w:rFonts w:asciiTheme="minorHAnsi" w:hAnsiTheme="minorHAnsi" w:cstheme="minorHAnsi"/>
-          <w:b/>
-          <w:i/>
-          <w:iCs/>
-        </w:rPr>
-        <w:fldChar w:fldCharType="begin"/>
-      </w:r>
-      <w:r>
-        <w:rPr>
-          <w:rFonts w:asciiTheme="minorHAnsi" w:hAnsiTheme="minorHAnsi" w:cstheme="minorHAnsi"/>
-          <w:b/>
-          <w:i/>
-          <w:iCs/>
-        </w:rPr>
-        <w:instrText xml:space="preserve"> IF </w:instrText>
-      </w:r>
-      <w:r>
-        <w:rPr>
-          <w:rFonts w:asciiTheme="minorHAnsi" w:hAnsiTheme="minorHAnsi" w:cstheme="minorHAnsi"/>
-          <w:b/>
-          <w:i/>
-          <w:iCs/>
-        </w:rPr>
-        <w:fldChar w:fldCharType="begin"/>
-      </w:r>
-      <w:r>
-        <w:rPr>
-          <w:rFonts w:asciiTheme="minorHAnsi" w:hAnsiTheme="minorHAnsi" w:cstheme="minorHAnsi"/>
-          <w:b/>
-          <w:i/>
-          <w:iCs/>
-        </w:rPr>
-        <w:instrText xml:space="preserve"> MERGEFIELD HOSPITAL </w:instrText>
-      </w:r>
-      <w:r>
-        <w:rPr>
-          <w:rFonts w:asciiTheme="minorHAnsi" w:hAnsiTheme="minorHAnsi" w:cstheme="minorHAnsi"/>
-          <w:b/>
-          <w:i/>
-          <w:iCs/>
-        </w:rPr>
-        <w:fldChar w:fldCharType="separate"/>
-      </w:r>
-      <w:r>
-        <w:rPr>
-          <w:rFonts w:asciiTheme="minorHAnsi" w:hAnsiTheme="minorHAnsi" w:cstheme="minorHAnsi"/>
-          <w:b/>
-          <w:i/>
-          <w:iCs/>
-          <w:noProof/>
-        </w:rPr>
-        <w:instrText>HSJDRionegro</w:instrText>
-      </w:r>
-      <w:r>
-        <w:rPr>
-          <w:rFonts w:asciiTheme="minorHAnsi" w:hAnsiTheme="minorHAnsi" w:cstheme="minorHAnsi"/>
-          <w:b/>
-          <w:i/>
-          <w:iCs/>
-        </w:rPr>
-        <w:fldChar w:fldCharType="end"/>
-      </w:r>
-      <w:r>
-        <w:rPr>
-          <w:rFonts w:asciiTheme="minorHAnsi" w:hAnsiTheme="minorHAnsi" w:cstheme="minorHAnsi"/>
-          <w:b/>
-          <w:i/>
-          <w:iCs/>
-        </w:rPr>
-        <w:instrText xml:space="preserve"> = "</w:instrText>
-      </w:r>
-      <w:r>
-        <w:rPr>
-          <w:rFonts w:asciiTheme="minorHAnsi" w:hAnsiTheme="minorHAnsi" w:cstheme="minorHAnsi"/>
-          <w:b/>
-          <w:i/>
-          <w:iCs/>
-          <w:color w:val="000000"/>
-        </w:rPr>
-        <w:instrText>URRAO</w:instrText>
-      </w:r>
-      <w:r>
-        <w:rPr>
-          <w:rFonts w:asciiTheme="minorHAnsi" w:hAnsiTheme="minorHAnsi" w:cstheme="minorHAnsi"/>
-          <w:b/>
-          <w:i/>
-          <w:iCs/>
-        </w:rPr>
-        <w:instrText xml:space="preserve">" "E.S.E. Hospital Ivan Restrepo Gomez" </w:instrText>
-      </w:r>
-      <w:r>
-        <w:rPr>
-          <w:rFonts w:asciiTheme="minorHAnsi" w:hAnsiTheme="minorHAnsi" w:cstheme="minorHAnsi"/>
-          <w:b/>
-          <w:i/>
-          <w:iCs/>
-        </w:rPr>
-        <w:fldChar w:fldCharType="end"/>
-      </w:r>
-      <w:r>
-        <w:rPr>
-          <w:rFonts w:asciiTheme="minorHAnsi" w:hAnsiTheme="minorHAnsi" w:cstheme="minorHAnsi"/>
-          <w:b/>
-          <w:i/>
-          <w:iCs/>
-        </w:rPr>
-        <w:fldChar w:fldCharType="begin"/>
-      </w:r>
-      <w:r>
-        <w:rPr>
-          <w:rFonts w:asciiTheme="minorHAnsi" w:hAnsiTheme="minorHAnsi" w:cstheme="minorHAnsi"/>
-          <w:b/>
-          <w:i/>
-          <w:iCs/>
-        </w:rPr>
-        <w:instrText xml:space="preserve"> IF </w:instrText>
-      </w:r>
-      <w:r>
-        <w:rPr>
-          <w:rFonts w:asciiTheme="minorHAnsi" w:hAnsiTheme="minorHAnsi" w:cstheme="minorHAnsi"/>
-          <w:b/>
-          <w:i/>
-          <w:iCs/>
-        </w:rPr>
-        <w:fldChar w:fldCharType="begin"/>
-      </w:r>
-      <w:r>
-        <w:rPr>
-          <w:rFonts w:asciiTheme="minorHAnsi" w:hAnsiTheme="minorHAnsi" w:cstheme="minorHAnsi"/>
-          <w:b/>
-          <w:i/>
-          <w:iCs/>
-        </w:rPr>
-        <w:instrText xml:space="preserve"> MERGEFIELD HOSPITAL </w:instrText>
-      </w:r>
-      <w:r>
-        <w:rPr>
-          <w:rFonts w:asciiTheme="minorHAnsi" w:hAnsiTheme="minorHAnsi" w:cstheme="minorHAnsi"/>
-          <w:b/>
-          <w:i/>
-          <w:iCs/>
-        </w:rPr>
-        <w:fldChar w:fldCharType="separate"/>
-      </w:r>
-      <w:r>
-        <w:rPr>
-          <w:rFonts w:asciiTheme="minorHAnsi" w:hAnsiTheme="minorHAnsi" w:cstheme="minorHAnsi"/>
-          <w:b/>
-          <w:i/>
-          <w:iCs/>
-          <w:noProof/>
-        </w:rPr>
-        <w:instrText>HSJDRionegro</w:instrText>
-      </w:r>
-      <w:r>
-        <w:rPr>
-          <w:rFonts w:asciiTheme="minorHAnsi" w:hAnsiTheme="minorHAnsi" w:cstheme="minorHAnsi"/>
-          <w:b/>
-          <w:i/>
-          <w:iCs/>
-        </w:rPr>
-        <w:fldChar w:fldCharType="end"/>
-      </w:r>
-      <w:r>
-        <w:rPr>
-          <w:rFonts w:asciiTheme="minorHAnsi" w:hAnsiTheme="minorHAnsi" w:cstheme="minorHAnsi"/>
-          <w:b/>
-          <w:i/>
-          <w:iCs/>
-        </w:rPr>
-        <w:instrText xml:space="preserve"> = "</w:instrText>
-      </w:r>
-      <w:r>
-        <w:rPr>
-          <w:rFonts w:asciiTheme="minorHAnsi" w:hAnsiTheme="minorHAnsi" w:cstheme="minorHAnsi"/>
-          <w:b/>
-          <w:i/>
-          <w:iCs/>
-          <w:color w:val="000000"/>
-        </w:rPr>
-        <w:instrText>CIUDAD BOLIVAR</w:instrText>
-      </w:r>
-      <w:r>
-        <w:rPr>
-          <w:rFonts w:asciiTheme="minorHAnsi" w:hAnsiTheme="minorHAnsi" w:cstheme="minorHAnsi"/>
-          <w:b/>
-          <w:i/>
-          <w:iCs/>
-        </w:rPr>
-        <w:instrText xml:space="preserve">" "E.S.E. Hospital La Merced - Ciudad Bolivar (Ant)" </w:instrText>
-      </w:r>
-      <w:r>
-        <w:rPr>
-          <w:rFonts w:asciiTheme="minorHAnsi" w:hAnsiTheme="minorHAnsi" w:cstheme="minorHAnsi"/>
-          <w:b/>
-          <w:i/>
-          <w:iCs/>
-        </w:rPr>
-        <w:fldChar w:fldCharType="end"/>
-      </w:r>
-      <w:r>
-        <w:rPr>
-          <w:rFonts w:asciiTheme="minorHAnsi" w:hAnsiTheme="minorHAnsi" w:cstheme="minorHAnsi"/>
-          <w:b/>
-          <w:i/>
-          <w:iCs/>
-        </w:rPr>
-        <w:fldChar w:fldCharType="begin"/>
-      </w:r>
-      <w:r>
-        <w:rPr>
-          <w:rFonts w:asciiTheme="minorHAnsi" w:hAnsiTheme="minorHAnsi" w:cstheme="minorHAnsi"/>
-          <w:b/>
-          <w:i/>
-          <w:iCs/>
-        </w:rPr>
-        <w:instrText xml:space="preserve"> IF </w:instrText>
-      </w:r>
-      <w:r>
-        <w:rPr>
-          <w:rFonts w:asciiTheme="minorHAnsi" w:hAnsiTheme="minorHAnsi" w:cstheme="minorHAnsi"/>
-          <w:b/>
-          <w:i/>
-          <w:iCs/>
-        </w:rPr>
-        <w:fldChar w:fldCharType="begin"/>
-      </w:r>
-      <w:r>
-        <w:rPr>
-          <w:rFonts w:asciiTheme="minorHAnsi" w:hAnsiTheme="minorHAnsi" w:cstheme="minorHAnsi"/>
-          <w:b/>
-          <w:i/>
-          <w:iCs/>
-        </w:rPr>
-        <w:instrText xml:space="preserve"> MERGEFIELD HOSPITAL </w:instrText>
-      </w:r>
-      <w:r>
-        <w:rPr>
-          <w:rFonts w:asciiTheme="minorHAnsi" w:hAnsiTheme="minorHAnsi" w:cstheme="minorHAnsi"/>
-          <w:b/>
-          <w:i/>
-          <w:iCs/>
-        </w:rPr>
-        <w:fldChar w:fldCharType="separate"/>
-      </w:r>
-      <w:r>
-        <w:rPr>
-          <w:rFonts w:asciiTheme="minorHAnsi" w:hAnsiTheme="minorHAnsi" w:cstheme="minorHAnsi"/>
-          <w:b/>
-          <w:i/>
-          <w:iCs/>
-          <w:noProof/>
-        </w:rPr>
-        <w:instrText>HSJDRionegro</w:instrText>
-      </w:r>
-      <w:r>
-        <w:rPr>
-          <w:rFonts w:asciiTheme="minorHAnsi" w:hAnsiTheme="minorHAnsi" w:cstheme="minorHAnsi"/>
-          <w:b/>
-          <w:i/>
-          <w:iCs/>
-        </w:rPr>
-        <w:fldChar w:fldCharType="end"/>
-      </w:r>
-      <w:r>
-        <w:rPr>
-          <w:rFonts w:asciiTheme="minorHAnsi" w:hAnsiTheme="minorHAnsi" w:cstheme="minorHAnsi"/>
-          <w:b/>
-          <w:i/>
-          <w:iCs/>
-        </w:rPr>
-        <w:instrText xml:space="preserve"> = "</w:instrText>
-      </w:r>
-      <w:r>
-        <w:rPr>
-          <w:rFonts w:asciiTheme="minorHAnsi" w:hAnsiTheme="minorHAnsi" w:cstheme="minorHAnsi"/>
-          <w:b/>
-          <w:i/>
-          <w:iCs/>
-          <w:color w:val="000000"/>
-        </w:rPr>
-        <w:instrText>VENANCIO - SALUD MENTAL</w:instrText>
-      </w:r>
-      <w:r>
-        <w:rPr>
-          <w:rFonts w:asciiTheme="minorHAnsi" w:hAnsiTheme="minorHAnsi" w:cstheme="minorHAnsi"/>
-          <w:b/>
-          <w:i/>
-          <w:iCs/>
-        </w:rPr>
-        <w:instrText>" "E.S.E. Hospital Venancio Díaz Díaz</w:instrText>
-      </w:r>
-      <w:r>
-        <w:rPr>
-          <w:rFonts w:asciiTheme="minorHAnsi" w:hAnsiTheme="minorHAnsi" w:cstheme="minorHAnsi"/>
-          <w:bCs/>
-          <w:i/>
-          <w:iCs/>
-        </w:rPr>
-        <w:instrText xml:space="preserve"> - con el programa 'Salud mental'</w:instrText>
-      </w:r>
-      <w:r>
-        <w:rPr>
-          <w:rFonts w:asciiTheme="minorHAnsi" w:hAnsiTheme="minorHAnsi" w:cstheme="minorHAnsi"/>
-          <w:b/>
-          <w:i/>
-          <w:iCs/>
-        </w:rPr>
-        <w:instrText xml:space="preserve">" </w:instrText>
-      </w:r>
-      <w:r>
-        <w:rPr>
-          <w:rFonts w:asciiTheme="minorHAnsi" w:hAnsiTheme="minorHAnsi" w:cstheme="minorHAnsi"/>
-          <w:b/>
-          <w:i/>
-          <w:iCs/>
-        </w:rPr>
-        <w:fldChar w:fldCharType="end"/>
-      </w:r>
-      <w:r>
-        <w:rPr>
-          <w:rFonts w:asciiTheme="minorHAnsi" w:hAnsiTheme="minorHAnsi" w:cstheme="minorHAnsi"/>
-          <w:b/>
-          <w:i/>
-          <w:iCs/>
-        </w:rPr>
-        <w:fldChar w:fldCharType="begin"/>
-      </w:r>
-      <w:r>
-        <w:rPr>
-          <w:rFonts w:asciiTheme="minorHAnsi" w:hAnsiTheme="minorHAnsi" w:cstheme="minorHAnsi"/>
-          <w:b/>
-          <w:i/>
-          <w:iCs/>
-        </w:rPr>
-        <w:instrText xml:space="preserve"> IF </w:instrText>
-      </w:r>
-      <w:r>
-        <w:rPr>
-          <w:rFonts w:asciiTheme="minorHAnsi" w:hAnsiTheme="minorHAnsi" w:cstheme="minorHAnsi"/>
-          <w:b/>
-          <w:i/>
-          <w:iCs/>
-        </w:rPr>
-        <w:fldChar w:fldCharType="begin"/>
-      </w:r>
-      <w:r>
-        <w:rPr>
-          <w:rFonts w:asciiTheme="minorHAnsi" w:hAnsiTheme="minorHAnsi" w:cstheme="minorHAnsi"/>
-          <w:b/>
-          <w:i/>
-          <w:iCs/>
-        </w:rPr>
-        <w:instrText xml:space="preserve"> MERGEFIELD HOSPITAL </w:instrText>
-      </w:r>
-      <w:r>
-        <w:rPr>
-          <w:rFonts w:asciiTheme="minorHAnsi" w:hAnsiTheme="minorHAnsi" w:cstheme="minorHAnsi"/>
-          <w:b/>
-          <w:i/>
-          <w:iCs/>
-        </w:rPr>
-        <w:fldChar w:fldCharType="separate"/>
-      </w:r>
-      <w:r>
-        <w:rPr>
-          <w:rFonts w:asciiTheme="minorHAnsi" w:hAnsiTheme="minorHAnsi" w:cstheme="minorHAnsi"/>
-          <w:b/>
-          <w:i/>
-          <w:iCs/>
-          <w:noProof/>
-        </w:rPr>
-        <w:instrText>HSJDRionegro</w:instrText>
-      </w:r>
-      <w:r>
-        <w:rPr>
-          <w:rFonts w:asciiTheme="minorHAnsi" w:hAnsiTheme="minorHAnsi" w:cstheme="minorHAnsi"/>
-          <w:b/>
-          <w:i/>
-          <w:iCs/>
-        </w:rPr>
-        <w:fldChar w:fldCharType="end"/>
-      </w:r>
-      <w:r>
-        <w:rPr>
-          <w:rFonts w:asciiTheme="minorHAnsi" w:hAnsiTheme="minorHAnsi" w:cstheme="minorHAnsi"/>
-          <w:b/>
-          <w:i/>
-          <w:iCs/>
-        </w:rPr>
-        <w:instrText xml:space="preserve"> = "</w:instrText>
-      </w:r>
-      <w:r>
-        <w:rPr>
-          <w:rFonts w:asciiTheme="minorHAnsi" w:hAnsiTheme="minorHAnsi" w:cstheme="minorHAnsi"/>
-          <w:b/>
-          <w:i/>
-          <w:iCs/>
-          <w:color w:val="000000"/>
-        </w:rPr>
-        <w:instrText>VENANCIO - ASIST</w:instrText>
-      </w:r>
-      <w:r>
-        <w:rPr>
-          <w:rFonts w:asciiTheme="minorHAnsi" w:hAnsiTheme="minorHAnsi" w:cstheme="minorHAnsi"/>
-          <w:b/>
-          <w:i/>
-          <w:iCs/>
-        </w:rPr>
-        <w:instrText xml:space="preserve">" "E.S.E. Hospital Venancio Díaz Díaz" </w:instrText>
-      </w:r>
-      <w:r>
-        <w:rPr>
-          <w:rFonts w:asciiTheme="minorHAnsi" w:hAnsiTheme="minorHAnsi" w:cstheme="minorHAnsi"/>
-          <w:b/>
-          <w:i/>
-          <w:iCs/>
-        </w:rPr>
-        <w:fldChar w:fldCharType="end"/>
-      </w:r>
-      <w:r>
-        <w:rPr>
-          <w:rFonts w:asciiTheme="minorHAnsi" w:hAnsiTheme="minorHAnsi" w:cstheme="minorHAnsi"/>
-          <w:b/>
-          <w:i/>
-          <w:iCs/>
-        </w:rPr>
-        <w:fldChar w:fldCharType="begin"/>
-      </w:r>
-      <w:r>
-        <w:rPr>
-          <w:rFonts w:asciiTheme="minorHAnsi" w:hAnsiTheme="minorHAnsi" w:cstheme="minorHAnsi"/>
-          <w:b/>
-          <w:i/>
-          <w:iCs/>
-        </w:rPr>
-        <w:instrText xml:space="preserve"> IF </w:instrText>
-      </w:r>
-      <w:r>
-        <w:rPr>
-          <w:rFonts w:asciiTheme="minorHAnsi" w:hAnsiTheme="minorHAnsi" w:cstheme="minorHAnsi"/>
-          <w:b/>
-          <w:i/>
-          <w:iCs/>
-        </w:rPr>
-        <w:fldChar w:fldCharType="begin"/>
-      </w:r>
-      <w:r>
-        <w:rPr>
-          <w:rFonts w:asciiTheme="minorHAnsi" w:hAnsiTheme="minorHAnsi" w:cstheme="minorHAnsi"/>
-          <w:b/>
-          <w:i/>
-          <w:iCs/>
-        </w:rPr>
-        <w:instrText xml:space="preserve"> MERGEFIELD HOSPITAL </w:instrText>
-      </w:r>
-      <w:r>
-        <w:rPr>
-          <w:rFonts w:asciiTheme="minorHAnsi" w:hAnsiTheme="minorHAnsi" w:cstheme="minorHAnsi"/>
-          <w:b/>
-          <w:i/>
-          <w:iCs/>
-        </w:rPr>
-        <w:fldChar w:fldCharType="separate"/>
-      </w:r>
-      <w:r>
-        <w:rPr>
-          <w:rFonts w:asciiTheme="minorHAnsi" w:hAnsiTheme="minorHAnsi" w:cstheme="minorHAnsi"/>
-          <w:b/>
-          <w:i/>
-          <w:iCs/>
-          <w:noProof/>
-        </w:rPr>
-        <w:instrText>HSJDRionegro</w:instrText>
-      </w:r>
-      <w:r>
-        <w:rPr>
-          <w:rFonts w:asciiTheme="minorHAnsi" w:hAnsiTheme="minorHAnsi" w:cstheme="minorHAnsi"/>
-          <w:b/>
-          <w:i/>
-          <w:iCs/>
-        </w:rPr>
-        <w:fldChar w:fldCharType="end"/>
-      </w:r>
-      <w:r>
-        <w:rPr>
-          <w:rFonts w:asciiTheme="minorHAnsi" w:hAnsiTheme="minorHAnsi" w:cstheme="minorHAnsi"/>
-          <w:b/>
-          <w:i/>
-          <w:iCs/>
-        </w:rPr>
-        <w:instrText xml:space="preserve"> = "</w:instrText>
-      </w:r>
-      <w:r>
-        <w:rPr>
-          <w:rFonts w:asciiTheme="minorHAnsi" w:hAnsiTheme="minorHAnsi" w:cstheme="minorHAnsi"/>
-          <w:b/>
-          <w:i/>
-          <w:iCs/>
-          <w:color w:val="000000"/>
-        </w:rPr>
-        <w:instrText>VENANCIO - UCI</w:instrText>
-      </w:r>
-      <w:r>
-        <w:rPr>
-          <w:rFonts w:asciiTheme="minorHAnsi" w:hAnsiTheme="minorHAnsi" w:cstheme="minorHAnsi"/>
-          <w:b/>
-          <w:i/>
-          <w:iCs/>
-        </w:rPr>
-        <w:instrText xml:space="preserve">" "E.S.E. Hospital Venancio Díaz Díaz" </w:instrText>
-      </w:r>
-      <w:r>
-        <w:rPr>
-          <w:rFonts w:asciiTheme="minorHAnsi" w:hAnsiTheme="minorHAnsi" w:cstheme="minorHAnsi"/>
-          <w:b/>
-          <w:i/>
-          <w:iCs/>
-        </w:rPr>
-        <w:fldChar w:fldCharType="end"/>
-      </w:r>
-      <w:r>
-        <w:rPr>
-          <w:rFonts w:asciiTheme="minorHAnsi" w:hAnsiTheme="minorHAnsi" w:cstheme="minorHAnsi"/>
-          <w:b/>
-          <w:i/>
-          <w:iCs/>
-        </w:rPr>
-        <w:fldChar w:fldCharType="begin"/>
-      </w:r>
-      <w:r>
-        <w:rPr>
-          <w:rFonts w:asciiTheme="minorHAnsi" w:hAnsiTheme="minorHAnsi" w:cstheme="minorHAnsi"/>
-          <w:b/>
-          <w:i/>
-          <w:iCs/>
-        </w:rPr>
-        <w:instrText xml:space="preserve"> IF </w:instrText>
-      </w:r>
-      <w:r>
-        <w:rPr>
-          <w:rFonts w:asciiTheme="minorHAnsi" w:hAnsiTheme="minorHAnsi" w:cstheme="minorHAnsi"/>
-          <w:b/>
-          <w:i/>
-          <w:iCs/>
-        </w:rPr>
-        <w:fldChar w:fldCharType="begin"/>
-      </w:r>
-      <w:r>
-        <w:rPr>
-          <w:rFonts w:asciiTheme="minorHAnsi" w:hAnsiTheme="minorHAnsi" w:cstheme="minorHAnsi"/>
-          <w:b/>
-          <w:i/>
-          <w:iCs/>
-        </w:rPr>
-        <w:instrText xml:space="preserve"> MERGEFIELD HOSPITAL </w:instrText>
-      </w:r>
-      <w:r>
-        <w:rPr>
-          <w:rFonts w:asciiTheme="minorHAnsi" w:hAnsiTheme="minorHAnsi" w:cstheme="minorHAnsi"/>
-          <w:b/>
-          <w:i/>
-          <w:iCs/>
-        </w:rPr>
-        <w:fldChar w:fldCharType="separate"/>
-      </w:r>
-      <w:r>
-        <w:rPr>
-          <w:rFonts w:asciiTheme="minorHAnsi" w:hAnsiTheme="minorHAnsi" w:cstheme="minorHAnsi"/>
-          <w:b/>
-          <w:i/>
-          <w:iCs/>
-          <w:noProof/>
-        </w:rPr>
-        <w:instrText>HSJDRionegro</w:instrText>
-      </w:r>
-      <w:r>
-        <w:rPr>
-          <w:rFonts w:asciiTheme="minorHAnsi" w:hAnsiTheme="minorHAnsi" w:cstheme="minorHAnsi"/>
-          <w:b/>
-          <w:i/>
-          <w:iCs/>
-        </w:rPr>
-        <w:fldChar w:fldCharType="end"/>
-      </w:r>
-      <w:r>
-        <w:rPr>
-          <w:rFonts w:asciiTheme="minorHAnsi" w:hAnsiTheme="minorHAnsi" w:cstheme="minorHAnsi"/>
-          <w:b/>
-          <w:i/>
-          <w:iCs/>
-        </w:rPr>
-        <w:instrText xml:space="preserve"> = "</w:instrText>
-      </w:r>
-      <w:r>
-        <w:rPr>
-          <w:rFonts w:asciiTheme="minorHAnsi" w:hAnsiTheme="minorHAnsi" w:cstheme="minorHAnsi"/>
-          <w:b/>
-          <w:i/>
-          <w:iCs/>
-          <w:color w:val="000000"/>
-        </w:rPr>
-        <w:instrText>VENANCIO - ADMON</w:instrText>
-      </w:r>
-      <w:r>
-        <w:rPr>
-          <w:rFonts w:asciiTheme="minorHAnsi" w:hAnsiTheme="minorHAnsi" w:cstheme="minorHAnsi"/>
-          <w:b/>
-          <w:i/>
-          <w:iCs/>
-        </w:rPr>
-        <w:instrText xml:space="preserve">" "E.S.E. Hospital Venancio Díaz Díaz" </w:instrText>
-      </w:r>
-      <w:r>
-        <w:rPr>
-          <w:rFonts w:asciiTheme="minorHAnsi" w:hAnsiTheme="minorHAnsi" w:cstheme="minorHAnsi"/>
-          <w:b/>
-          <w:i/>
-          <w:iCs/>
-        </w:rPr>
-        <w:fldChar w:fldCharType="end"/>
-      </w:r>
-      <w:r>
-        <w:rPr>
-          <w:rFonts w:asciiTheme="minorHAnsi" w:hAnsiTheme="minorHAnsi" w:cstheme="minorHAnsi"/>
-          <w:b/>
-          <w:i/>
-          <w:iCs/>
-        </w:rPr>
-        <w:fldChar w:fldCharType="begin"/>
-      </w:r>
-      <w:r>
-        <w:rPr>
-          <w:rFonts w:asciiTheme="minorHAnsi" w:hAnsiTheme="minorHAnsi" w:cstheme="minorHAnsi"/>
-          <w:b/>
-          <w:i/>
-          <w:iCs/>
-        </w:rPr>
-        <w:instrText xml:space="preserve"> IF </w:instrText>
-      </w:r>
-      <w:r>
-        <w:rPr>
-          <w:rFonts w:asciiTheme="minorHAnsi" w:hAnsiTheme="minorHAnsi" w:cstheme="minorHAnsi"/>
-          <w:b/>
-          <w:i/>
-          <w:iCs/>
-        </w:rPr>
-        <w:fldChar w:fldCharType="begin"/>
-      </w:r>
-      <w:r>
-        <w:rPr>
-          <w:rFonts w:asciiTheme="minorHAnsi" w:hAnsiTheme="minorHAnsi" w:cstheme="minorHAnsi"/>
-          <w:b/>
-          <w:i/>
-          <w:iCs/>
-        </w:rPr>
-        <w:instrText xml:space="preserve"> MERGEFIELD HOSPITAL </w:instrText>
-      </w:r>
-      <w:r>
-        <w:rPr>
-          <w:rFonts w:asciiTheme="minorHAnsi" w:hAnsiTheme="minorHAnsi" w:cstheme="minorHAnsi"/>
-          <w:b/>
-          <w:i/>
-          <w:iCs/>
-        </w:rPr>
-        <w:fldChar w:fldCharType="separate"/>
-      </w:r>
-      <w:r>
-        <w:rPr>
-          <w:rFonts w:asciiTheme="minorHAnsi" w:hAnsiTheme="minorHAnsi" w:cstheme="minorHAnsi"/>
-          <w:b/>
-          <w:i/>
-          <w:iCs/>
-          <w:noProof/>
-        </w:rPr>
-        <w:instrText>HSJDRionegro</w:instrText>
-      </w:r>
-      <w:r>
-        <w:rPr>
-          <w:rFonts w:asciiTheme="minorHAnsi" w:hAnsiTheme="minorHAnsi" w:cstheme="minorHAnsi"/>
-          <w:b/>
-          <w:i/>
-          <w:iCs/>
-        </w:rPr>
-        <w:fldChar w:fldCharType="end"/>
-      </w:r>
-      <w:r>
-        <w:rPr>
-          <w:rFonts w:asciiTheme="minorHAnsi" w:hAnsiTheme="minorHAnsi" w:cstheme="minorHAnsi"/>
-          <w:b/>
-          <w:i/>
-          <w:iCs/>
-        </w:rPr>
-        <w:instrText xml:space="preserve"> = "</w:instrText>
-      </w:r>
-      <w:r>
-        <w:rPr>
-          <w:rFonts w:asciiTheme="minorHAnsi" w:hAnsiTheme="minorHAnsi" w:cstheme="minorHAnsi"/>
-          <w:b/>
-          <w:i/>
-          <w:iCs/>
-          <w:color w:val="000000"/>
-        </w:rPr>
-        <w:instrText>VENANCIO ADMON - APH</w:instrText>
-      </w:r>
-      <w:r>
-        <w:rPr>
-          <w:rFonts w:asciiTheme="minorHAnsi" w:hAnsiTheme="minorHAnsi" w:cstheme="minorHAnsi"/>
-          <w:b/>
-          <w:i/>
-          <w:iCs/>
-        </w:rPr>
-        <w:instrText xml:space="preserve">" "E.S.E. Hospital Venancio Díaz Díaz" </w:instrText>
-      </w:r>
-      <w:r>
-        <w:rPr>
-          <w:rFonts w:asciiTheme="minorHAnsi" w:hAnsiTheme="minorHAnsi" w:cstheme="minorHAnsi"/>
-          <w:b/>
-          <w:i/>
-          <w:iCs/>
-        </w:rPr>
-        <w:fldChar w:fldCharType="end"/>
-      </w:r>
-      <w:r>
-        <w:rPr>
-          <w:rFonts w:asciiTheme="minorHAnsi" w:hAnsiTheme="minorHAnsi" w:cstheme="minorHAnsi"/>
-          <w:b/>
-          <w:i/>
-          <w:iCs/>
-        </w:rPr>
-        <w:fldChar w:fldCharType="begin"/>
-      </w:r>
-      <w:r>
-        <w:rPr>
-          <w:rFonts w:asciiTheme="minorHAnsi" w:hAnsiTheme="minorHAnsi" w:cstheme="minorHAnsi"/>
-          <w:b/>
-          <w:i/>
-          <w:iCs/>
-        </w:rPr>
-        <w:instrText xml:space="preserve"> IF </w:instrText>
-      </w:r>
-      <w:r>
-        <w:rPr>
-          <w:rFonts w:asciiTheme="minorHAnsi" w:hAnsiTheme="minorHAnsi" w:cstheme="minorHAnsi"/>
-          <w:b/>
-          <w:i/>
-          <w:iCs/>
-        </w:rPr>
-        <w:fldChar w:fldCharType="begin"/>
-      </w:r>
-      <w:r>
-        <w:rPr>
-          <w:rFonts w:asciiTheme="minorHAnsi" w:hAnsiTheme="minorHAnsi" w:cstheme="minorHAnsi"/>
-          <w:b/>
-          <w:i/>
-          <w:iCs/>
-        </w:rPr>
-        <w:instrText xml:space="preserve"> MERGEFIELD HOSPITAL </w:instrText>
-      </w:r>
-      <w:r>
-        <w:rPr>
-          <w:rFonts w:asciiTheme="minorHAnsi" w:hAnsiTheme="minorHAnsi" w:cstheme="minorHAnsi"/>
-          <w:b/>
-          <w:i/>
-          <w:iCs/>
-        </w:rPr>
-        <w:fldChar w:fldCharType="separate"/>
-      </w:r>
-      <w:r>
-        <w:rPr>
-          <w:rFonts w:asciiTheme="minorHAnsi" w:hAnsiTheme="minorHAnsi" w:cstheme="minorHAnsi"/>
-          <w:b/>
-          <w:i/>
-          <w:iCs/>
-          <w:noProof/>
-        </w:rPr>
-        <w:instrText>HSJDRionegro</w:instrText>
-      </w:r>
-      <w:r>
-        <w:rPr>
-          <w:rFonts w:asciiTheme="minorHAnsi" w:hAnsiTheme="minorHAnsi" w:cstheme="minorHAnsi"/>
-          <w:b/>
-          <w:i/>
-          <w:iCs/>
-        </w:rPr>
-        <w:fldChar w:fldCharType="end"/>
-      </w:r>
-      <w:r>
-        <w:rPr>
-          <w:rFonts w:asciiTheme="minorHAnsi" w:hAnsiTheme="minorHAnsi" w:cstheme="minorHAnsi"/>
-          <w:b/>
-          <w:i/>
-          <w:iCs/>
-        </w:rPr>
-        <w:instrText xml:space="preserve"> = "</w:instrText>
-      </w:r>
-      <w:r>
-        <w:rPr>
-          <w:rFonts w:asciiTheme="minorHAnsi" w:hAnsiTheme="minorHAnsi" w:cstheme="minorHAnsi"/>
-          <w:b/>
-          <w:i/>
-          <w:iCs/>
-          <w:color w:val="000000"/>
-        </w:rPr>
-        <w:instrText>VENANCIO - SALUD P.</w:instrText>
-      </w:r>
-      <w:r>
-        <w:rPr>
-          <w:rFonts w:asciiTheme="minorHAnsi" w:hAnsiTheme="minorHAnsi" w:cstheme="minorHAnsi"/>
-          <w:b/>
-          <w:i/>
-          <w:iCs/>
-        </w:rPr>
-        <w:instrText xml:space="preserve">" "E.S.E. Hospital Venancio Díaz Díaz" </w:instrText>
-      </w:r>
-      <w:r>
-        <w:rPr>
-          <w:rFonts w:asciiTheme="minorHAnsi" w:hAnsiTheme="minorHAnsi" w:cstheme="minorHAnsi"/>
-          <w:b/>
-          <w:i/>
-          <w:iCs/>
-        </w:rPr>
-        <w:fldChar w:fldCharType="end"/>
-      </w:r>
-      <w:r>
-        <w:rPr>
-          <w:rFonts w:asciiTheme="minorHAnsi" w:hAnsiTheme="minorHAnsi" w:cstheme="minorHAnsi"/>
-          <w:b/>
-          <w:i/>
-          <w:iCs/>
-        </w:rPr>
-        <w:fldChar w:fldCharType="begin"/>
-      </w:r>
-      <w:r>
-        <w:rPr>
-          <w:rFonts w:asciiTheme="minorHAnsi" w:hAnsiTheme="minorHAnsi" w:cstheme="minorHAnsi"/>
-          <w:b/>
-          <w:i/>
-          <w:iCs/>
-        </w:rPr>
-        <w:instrText xml:space="preserve"> IF </w:instrText>
-      </w:r>
-      <w:r>
-        <w:rPr>
-          <w:rFonts w:asciiTheme="minorHAnsi" w:hAnsiTheme="minorHAnsi" w:cstheme="minorHAnsi"/>
-          <w:b/>
-          <w:i/>
-          <w:iCs/>
-        </w:rPr>
-        <w:fldChar w:fldCharType="begin"/>
-      </w:r>
-      <w:r>
-        <w:rPr>
-          <w:rFonts w:asciiTheme="minorHAnsi" w:hAnsiTheme="minorHAnsi" w:cstheme="minorHAnsi"/>
-          <w:b/>
-          <w:i/>
-          <w:iCs/>
-        </w:rPr>
-        <w:instrText xml:space="preserve"> MERGEFIELD HOSPITAL </w:instrText>
-      </w:r>
-      <w:r>
-        <w:rPr>
-          <w:rFonts w:asciiTheme="minorHAnsi" w:hAnsiTheme="minorHAnsi" w:cstheme="minorHAnsi"/>
-          <w:b/>
-          <w:i/>
-          <w:iCs/>
-        </w:rPr>
-        <w:fldChar w:fldCharType="separate"/>
-      </w:r>
-      <w:r>
-        <w:rPr>
-          <w:rFonts w:asciiTheme="minorHAnsi" w:hAnsiTheme="minorHAnsi" w:cstheme="minorHAnsi"/>
-          <w:b/>
-          <w:i/>
-          <w:iCs/>
-          <w:noProof/>
-        </w:rPr>
-        <w:instrText>HSJDRionegro</w:instrText>
-      </w:r>
-      <w:r>
-        <w:rPr>
-          <w:rFonts w:asciiTheme="minorHAnsi" w:hAnsiTheme="minorHAnsi" w:cstheme="minorHAnsi"/>
-          <w:b/>
-          <w:i/>
-          <w:iCs/>
-        </w:rPr>
-        <w:fldChar w:fldCharType="end"/>
-      </w:r>
-      <w:r>
-        <w:rPr>
-          <w:rFonts w:asciiTheme="minorHAnsi" w:hAnsiTheme="minorHAnsi" w:cstheme="minorHAnsi"/>
-          <w:b/>
-          <w:i/>
-          <w:iCs/>
-        </w:rPr>
-        <w:instrText xml:space="preserve"> = "</w:instrText>
-      </w:r>
-      <w:r>
-        <w:rPr>
-          <w:rFonts w:asciiTheme="minorHAnsi" w:hAnsiTheme="minorHAnsi" w:cstheme="minorHAnsi"/>
-          <w:b/>
-          <w:i/>
-          <w:iCs/>
-          <w:color w:val="000000"/>
-        </w:rPr>
-        <w:instrText>VENANCIO - PIC</w:instrText>
-      </w:r>
-      <w:r>
-        <w:rPr>
-          <w:rFonts w:asciiTheme="minorHAnsi" w:hAnsiTheme="minorHAnsi" w:cstheme="minorHAnsi"/>
-          <w:b/>
-          <w:i/>
-          <w:iCs/>
-        </w:rPr>
-        <w:instrText xml:space="preserve">" "E.S.E. Hospital Venancio Díaz Díaz - Programa PIC" </w:instrText>
-      </w:r>
-      <w:r>
-        <w:rPr>
-          <w:rFonts w:asciiTheme="minorHAnsi" w:hAnsiTheme="minorHAnsi" w:cstheme="minorHAnsi"/>
-          <w:b/>
-          <w:i/>
-          <w:iCs/>
-        </w:rPr>
-        <w:fldChar w:fldCharType="end"/>
-      </w:r>
-      <w:r>
-        <w:rPr>
-          <w:rFonts w:asciiTheme="minorHAnsi" w:hAnsiTheme="minorHAnsi" w:cstheme="minorHAnsi"/>
-          <w:b/>
-          <w:i/>
-          <w:iCs/>
-        </w:rPr>
-        <w:fldChar w:fldCharType="begin"/>
-      </w:r>
-      <w:r>
-        <w:rPr>
-          <w:rFonts w:asciiTheme="minorHAnsi" w:hAnsiTheme="minorHAnsi" w:cstheme="minorHAnsi"/>
-          <w:b/>
-          <w:i/>
-          <w:iCs/>
-        </w:rPr>
-        <w:instrText xml:space="preserve"> IF </w:instrText>
-      </w:r>
-      <w:r>
-        <w:rPr>
-          <w:rFonts w:asciiTheme="minorHAnsi" w:hAnsiTheme="minorHAnsi" w:cstheme="minorHAnsi"/>
-          <w:b/>
-          <w:i/>
-          <w:iCs/>
-        </w:rPr>
-        <w:fldChar w:fldCharType="begin"/>
-      </w:r>
-      <w:r>
-        <w:rPr>
-          <w:rFonts w:asciiTheme="minorHAnsi" w:hAnsiTheme="minorHAnsi" w:cstheme="minorHAnsi"/>
-          <w:b/>
-          <w:i/>
-          <w:iCs/>
-        </w:rPr>
-        <w:instrText xml:space="preserve"> MERGEFIELD HOSPITAL </w:instrText>
-      </w:r>
-      <w:r>
-        <w:rPr>
-          <w:rFonts w:asciiTheme="minorHAnsi" w:hAnsiTheme="minorHAnsi" w:cstheme="minorHAnsi"/>
-          <w:b/>
-          <w:i/>
-          <w:iCs/>
-        </w:rPr>
-        <w:fldChar w:fldCharType="separate"/>
-      </w:r>
-      <w:r>
-        <w:rPr>
-          <w:rFonts w:asciiTheme="minorHAnsi" w:hAnsiTheme="minorHAnsi" w:cstheme="minorHAnsi"/>
-          <w:b/>
-          <w:i/>
-          <w:iCs/>
-          <w:noProof/>
-        </w:rPr>
-        <w:instrText>HSJDRionegro</w:instrText>
-      </w:r>
-      <w:r>
-        <w:rPr>
-          <w:rFonts w:asciiTheme="minorHAnsi" w:hAnsiTheme="minorHAnsi" w:cstheme="minorHAnsi"/>
-          <w:b/>
-          <w:i/>
-          <w:iCs/>
-        </w:rPr>
-        <w:fldChar w:fldCharType="end"/>
-      </w:r>
-      <w:r>
-        <w:rPr>
-          <w:rFonts w:asciiTheme="minorHAnsi" w:hAnsiTheme="minorHAnsi" w:cstheme="minorHAnsi"/>
-          <w:b/>
-          <w:i/>
-          <w:iCs/>
-        </w:rPr>
-        <w:instrText xml:space="preserve"> = "</w:instrText>
-      </w:r>
-      <w:r>
-        <w:rPr>
-          <w:rFonts w:asciiTheme="minorHAnsi" w:hAnsiTheme="minorHAnsi" w:cstheme="minorHAnsi"/>
-          <w:b/>
-          <w:i/>
-          <w:iCs/>
-          <w:color w:val="000000"/>
-        </w:rPr>
-        <w:instrText>VENANCIO</w:instrText>
-      </w:r>
-      <w:r>
-        <w:rPr>
-          <w:rFonts w:asciiTheme="minorHAnsi" w:hAnsiTheme="minorHAnsi" w:cstheme="minorHAnsi"/>
-          <w:b/>
-          <w:i/>
-          <w:iCs/>
-        </w:rPr>
-        <w:instrText xml:space="preserve">" "E.S.E. Hospital Venancio Díaz Díaz" </w:instrText>
-      </w:r>
-      <w:r>
-        <w:rPr>
-          <w:rFonts w:asciiTheme="minorHAnsi" w:hAnsiTheme="minorHAnsi" w:cstheme="minorHAnsi"/>
-          <w:b/>
-          <w:i/>
-          <w:iCs/>
-        </w:rPr>
-        <w:fldChar w:fldCharType="end"/>
-      </w:r>
-      <w:r>
-        <w:rPr>
-          <w:rFonts w:asciiTheme="minorHAnsi" w:hAnsiTheme="minorHAnsi" w:cstheme="minorHAnsi"/>
-          <w:b/>
-          <w:i/>
-          <w:iCs/>
-        </w:rPr>
-        <w:fldChar w:fldCharType="begin"/>
-      </w:r>
-      <w:r>
-        <w:rPr>
-          <w:rFonts w:asciiTheme="minorHAnsi" w:hAnsiTheme="minorHAnsi" w:cstheme="minorHAnsi"/>
-          <w:b/>
-          <w:i/>
-          <w:iCs/>
-        </w:rPr>
-        <w:instrText xml:space="preserve"> IF </w:instrText>
-      </w:r>
-      <w:r>
-        <w:rPr>
-          <w:rFonts w:asciiTheme="minorHAnsi" w:hAnsiTheme="minorHAnsi" w:cstheme="minorHAnsi"/>
-          <w:b/>
-          <w:i/>
-          <w:iCs/>
-        </w:rPr>
-        <w:fldChar w:fldCharType="begin"/>
-      </w:r>
-      <w:r>
-        <w:rPr>
-          <w:rFonts w:asciiTheme="minorHAnsi" w:hAnsiTheme="minorHAnsi" w:cstheme="minorHAnsi"/>
-          <w:b/>
-          <w:i/>
-          <w:iCs/>
-        </w:rPr>
-        <w:instrText xml:space="preserve"> MERGEFIELD HOSPITAL </w:instrText>
-      </w:r>
-      <w:r>
-        <w:rPr>
-          <w:rFonts w:asciiTheme="minorHAnsi" w:hAnsiTheme="minorHAnsi" w:cstheme="minorHAnsi"/>
-          <w:b/>
-          <w:i/>
-          <w:iCs/>
-        </w:rPr>
-        <w:fldChar w:fldCharType="separate"/>
-      </w:r>
-      <w:r>
-        <w:rPr>
-          <w:rFonts w:asciiTheme="minorHAnsi" w:hAnsiTheme="minorHAnsi" w:cstheme="minorHAnsi"/>
-          <w:b/>
-          <w:i/>
-          <w:iCs/>
-          <w:noProof/>
-        </w:rPr>
-        <w:instrText>HSJDRionegro</w:instrText>
-      </w:r>
-      <w:r>
-        <w:rPr>
-          <w:rFonts w:asciiTheme="minorHAnsi" w:hAnsiTheme="minorHAnsi" w:cstheme="minorHAnsi"/>
-          <w:b/>
-          <w:i/>
-          <w:iCs/>
-        </w:rPr>
-        <w:fldChar w:fldCharType="end"/>
-      </w:r>
-      <w:r>
-        <w:rPr>
-          <w:rFonts w:asciiTheme="minorHAnsi" w:hAnsiTheme="minorHAnsi" w:cstheme="minorHAnsi"/>
-          <w:b/>
-          <w:i/>
-          <w:iCs/>
-        </w:rPr>
-        <w:instrText xml:space="preserve"> = "</w:instrText>
-      </w:r>
-      <w:r>
-        <w:rPr>
-          <w:rFonts w:asciiTheme="minorHAnsi" w:hAnsiTheme="minorHAnsi" w:cstheme="minorHAnsi"/>
-          <w:b/>
-          <w:i/>
-          <w:iCs/>
-          <w:color w:val="000000"/>
-        </w:rPr>
-        <w:instrText>BELLO</w:instrText>
-      </w:r>
-      <w:r>
-        <w:rPr>
-          <w:rFonts w:asciiTheme="minorHAnsi" w:hAnsiTheme="minorHAnsi" w:cstheme="minorHAnsi"/>
-          <w:b/>
-          <w:i/>
-          <w:iCs/>
-        </w:rPr>
-        <w:instrText xml:space="preserve">" "E.S.E. Hospital Marco Fidel Suárez de Bello" </w:instrText>
-      </w:r>
-      <w:r>
-        <w:rPr>
-          <w:rFonts w:asciiTheme="minorHAnsi" w:hAnsiTheme="minorHAnsi" w:cstheme="minorHAnsi"/>
-          <w:b/>
-          <w:i/>
-          <w:iCs/>
-        </w:rPr>
-        <w:fldChar w:fldCharType="end"/>
-      </w:r>
-      <w:r>
-        <w:rPr>
-          <w:rFonts w:asciiTheme="minorHAnsi" w:hAnsiTheme="minorHAnsi" w:cstheme="minorHAnsi"/>
-          <w:b/>
-          <w:i/>
-          <w:iCs/>
-        </w:rPr>
-        <w:fldChar w:fldCharType="begin"/>
-      </w:r>
-      <w:r>
-        <w:rPr>
-          <w:rFonts w:asciiTheme="minorHAnsi" w:hAnsiTheme="minorHAnsi" w:cstheme="minorHAnsi"/>
-          <w:b/>
-          <w:i/>
-          <w:iCs/>
-        </w:rPr>
-        <w:instrText xml:space="preserve"> IF </w:instrText>
-      </w:r>
-      <w:r>
-        <w:rPr>
-          <w:rFonts w:asciiTheme="minorHAnsi" w:hAnsiTheme="minorHAnsi" w:cstheme="minorHAnsi"/>
-          <w:b/>
-          <w:i/>
-          <w:iCs/>
-        </w:rPr>
-        <w:fldChar w:fldCharType="begin"/>
-      </w:r>
-      <w:r>
-        <w:rPr>
-          <w:rFonts w:asciiTheme="minorHAnsi" w:hAnsiTheme="minorHAnsi" w:cstheme="minorHAnsi"/>
-          <w:b/>
-          <w:i/>
-          <w:iCs/>
-        </w:rPr>
-        <w:instrText xml:space="preserve"> MERGEFIELD HOSPITAL </w:instrText>
-      </w:r>
-      <w:r>
-        <w:rPr>
-          <w:rFonts w:asciiTheme="minorHAnsi" w:hAnsiTheme="minorHAnsi" w:cstheme="minorHAnsi"/>
-          <w:b/>
-          <w:i/>
-          <w:iCs/>
-        </w:rPr>
-        <w:fldChar w:fldCharType="separate"/>
-      </w:r>
-      <w:r>
-        <w:rPr>
-          <w:rFonts w:asciiTheme="minorHAnsi" w:hAnsiTheme="minorHAnsi" w:cstheme="minorHAnsi"/>
-          <w:b/>
-          <w:i/>
-          <w:iCs/>
-          <w:noProof/>
-        </w:rPr>
-        <w:instrText>HSJDRionegro</w:instrText>
-      </w:r>
-      <w:r>
-        <w:rPr>
-          <w:rFonts w:asciiTheme="minorHAnsi" w:hAnsiTheme="minorHAnsi" w:cstheme="minorHAnsi"/>
-          <w:b/>
-          <w:i/>
-          <w:iCs/>
-        </w:rPr>
-        <w:fldChar w:fldCharType="end"/>
-      </w:r>
-      <w:r>
-        <w:rPr>
-          <w:rFonts w:asciiTheme="minorHAnsi" w:hAnsiTheme="minorHAnsi" w:cstheme="minorHAnsi"/>
-          <w:b/>
-          <w:i/>
-          <w:iCs/>
-        </w:rPr>
-        <w:instrText xml:space="preserve"> = "</w:instrText>
-      </w:r>
-      <w:r>
-        <w:rPr>
-          <w:rFonts w:asciiTheme="minorHAnsi" w:hAnsiTheme="minorHAnsi" w:cstheme="minorHAnsi"/>
-          <w:b/>
-          <w:i/>
-          <w:iCs/>
-          <w:color w:val="000000"/>
-        </w:rPr>
-        <w:instrText>HSRI</w:instrText>
-      </w:r>
-      <w:r>
-        <w:rPr>
-          <w:rFonts w:asciiTheme="minorHAnsi" w:hAnsiTheme="minorHAnsi" w:cstheme="minorHAnsi"/>
-          <w:b/>
-          <w:i/>
-          <w:iCs/>
-        </w:rPr>
-        <w:instrText xml:space="preserve">" "E.S.E. Hospital San Rafael de Itagüí" </w:instrText>
-      </w:r>
-      <w:r>
-        <w:rPr>
-          <w:rFonts w:asciiTheme="minorHAnsi" w:hAnsiTheme="minorHAnsi" w:cstheme="minorHAnsi"/>
-          <w:b/>
-          <w:i/>
-          <w:iCs/>
-        </w:rPr>
-        <w:fldChar w:fldCharType="end"/>
-      </w:r>
-      <w:r>
-        <w:rPr>
-          <w:rFonts w:asciiTheme="minorHAnsi" w:hAnsiTheme="minorHAnsi" w:cstheme="minorHAnsi"/>
-          <w:b/>
-          <w:i/>
-          <w:iCs/>
-        </w:rPr>
-        <w:fldChar w:fldCharType="begin"/>
-      </w:r>
-      <w:r>
-        <w:rPr>
-          <w:rFonts w:asciiTheme="minorHAnsi" w:hAnsiTheme="minorHAnsi" w:cstheme="minorHAnsi"/>
-          <w:b/>
-          <w:i/>
-          <w:iCs/>
-        </w:rPr>
-        <w:instrText xml:space="preserve"> IF </w:instrText>
-      </w:r>
-      <w:r>
-        <w:rPr>
-          <w:rFonts w:asciiTheme="minorHAnsi" w:hAnsiTheme="minorHAnsi" w:cstheme="minorHAnsi"/>
-          <w:b/>
-          <w:i/>
-          <w:iCs/>
-        </w:rPr>
-        <w:fldChar w:fldCharType="begin"/>
-      </w:r>
-      <w:r>
-        <w:rPr>
-          <w:rFonts w:asciiTheme="minorHAnsi" w:hAnsiTheme="minorHAnsi" w:cstheme="minorHAnsi"/>
-          <w:b/>
-          <w:i/>
-          <w:iCs/>
-        </w:rPr>
-        <w:instrText xml:space="preserve"> MERGEFIELD HOSPITAL </w:instrText>
-      </w:r>
-      <w:r>
-        <w:rPr>
-          <w:rFonts w:asciiTheme="minorHAnsi" w:hAnsiTheme="minorHAnsi" w:cstheme="minorHAnsi"/>
-          <w:b/>
-          <w:i/>
-          <w:iCs/>
-        </w:rPr>
-        <w:fldChar w:fldCharType="separate"/>
-      </w:r>
-      <w:r>
-        <w:rPr>
-          <w:rFonts w:asciiTheme="minorHAnsi" w:hAnsiTheme="minorHAnsi" w:cstheme="minorHAnsi"/>
-          <w:b/>
-          <w:i/>
-          <w:iCs/>
-          <w:noProof/>
-        </w:rPr>
-        <w:instrText>HSJDRionegro</w:instrText>
-      </w:r>
-      <w:r>
-        <w:rPr>
-          <w:rFonts w:asciiTheme="minorHAnsi" w:hAnsiTheme="minorHAnsi" w:cstheme="minorHAnsi"/>
-          <w:b/>
-          <w:i/>
-          <w:iCs/>
-        </w:rPr>
-        <w:fldChar w:fldCharType="end"/>
-      </w:r>
-      <w:r>
-        <w:rPr>
-          <w:rFonts w:asciiTheme="minorHAnsi" w:hAnsiTheme="minorHAnsi" w:cstheme="minorHAnsi"/>
-          <w:b/>
-          <w:i/>
-          <w:iCs/>
-        </w:rPr>
-        <w:instrText xml:space="preserve"> = "</w:instrText>
-      </w:r>
-      <w:r>
-        <w:rPr>
-          <w:rFonts w:asciiTheme="minorHAnsi" w:hAnsiTheme="minorHAnsi" w:cstheme="minorHAnsi"/>
-          <w:b/>
-          <w:i/>
-          <w:iCs/>
-          <w:color w:val="000000"/>
-        </w:rPr>
         <w:instrText>CALDAS</w:instrText>
       </w:r>
       <w:r>
@@ -3197,37 +3135,14 @@
           <w:i/>
           <w:iCs/>
         </w:rPr>
-        <w:t>.</w:t>
-      </w:r>
-      <w:r>
-        <w:rPr>
-          <w:rFonts w:asciiTheme="minorHAnsi" w:hAnsiTheme="minorHAnsi" w:cstheme="minorHAnsi"/>
-          <w:b/>
-          <w:i/>
-          <w:iCs/>
-        </w:rPr>
-        <w:t xml:space="preserve"> </w:t>
-      </w:r>
-      <w:r>
-        <w:rPr>
-          <w:i/>
-          <w:iCs/>
-        </w:rPr>
-        <w:t>La fecha de ingreso</w:t>
-      </w:r>
-      <w:r>
-        <w:rPr>
-          <w:i/>
-          <w:iCs/>
-        </w:rPr>
-        <w:t>/retiro</w:t>
-      </w:r>
-      <w:r>
-        <w:rPr>
-          <w:i/>
-          <w:iCs/>
-        </w:rPr>
-        <w:t xml:space="preserve"> puede verificarse en la sección de </w:t>
+        <w:t xml:space="preserve">. </w:t>
+      </w:r>
+      <w:r>
+        <w:rPr>
+          <w:i/>
+          <w:iCs/>
+        </w:rPr>
+        <w:t xml:space="preserve">La fecha de ingreso/retiro puede verificarse en la sección de </w:t>
       </w:r>
       <w:r>
         <w:rPr>
@@ -3359,6 +3274,10 @@
         <w:t xml:space="preserve">En calidad de </w:t>
       </w:r>
       <w:r>
+        <w:rPr>
+          <w:i/>
+          <w:iCs/>
+        </w:rPr>
         <w:t xml:space="preserve">persona afiliada </w:t>
       </w:r>
       <w:r>
@@ -3624,6 +3543,8 @@
           <w:rFonts w:asciiTheme="minorHAnsi" w:hAnsiTheme="minorHAnsi" w:cstheme="minorHAnsi"/>
           <w:b/>
           <w:bCs/>
+          <w:i/>
+          <w:iCs/>
         </w:rPr>
         <w:t>${</w:t>
       </w:r>
@@ -3641,6 +3562,8 @@
           <w:rFonts w:asciiTheme="minorHAnsi" w:hAnsiTheme="minorHAnsi" w:cstheme="minorHAnsi"/>
           <w:b/>
           <w:bCs/>
+          <w:i/>
+          <w:iCs/>
         </w:rPr>
         <w:t>}</w:t>
       </w:r>
@@ -5380,14 +5303,7 @@
           <w:iCs/>
           <w:color w:val="000000" w:themeColor="text1"/>
         </w:rPr>
-        <w:instrText>&lt;&gt;"" "</w:instrText>
-      </w:r>
-      <w:r>
-        <w:rPr>
-          <w:rFonts w:asciiTheme="minorHAnsi" w:hAnsiTheme="minorHAnsi" w:cstheme="minorHAnsi"/>
-          <w:color w:val="000000" w:themeColor="text1"/>
-        </w:rPr>
-        <w:instrText xml:space="preserve"> </w:instrText>
+        <w:instrText xml:space="preserve">&lt;&gt;"" " </w:instrText>
       </w:r>
       <w:r>
         <w:rPr>
@@ -5713,12 +5629,16 @@
         <w:rPr>
           <w:i/>
           <w:iCs/>
+          <w:sz w:val="20"/>
+          <w:szCs w:val="20"/>
         </w:rPr>
       </w:pPr>
       <w:r>
         <w:rPr>
           <w:i/>
           <w:iCs/>
+          <w:sz w:val="20"/>
+          <w:szCs w:val="20"/>
         </w:rPr>
         <w:t>${LISTA_CONVENIOS}</w:t>
       </w:r>
@@ -14357,32 +14277,6 @@
         </w:rPr>
         <w:t>ProSalud</w:t>
       </w:r>
-      <w:r>
-        <w:rPr>
-          <w:b/>
-          <w:i/>
-          <w:iCs/>
-          <w:color w:val="BFBFBF" w:themeColor="background1" w:themeShade="BF"/>
-          <w:sz w:val="20"/>
-          <w:szCs w:val="20"/>
-        </w:rPr>
-        <w:t xml:space="preserve"> </w:t>
-      </w:r>
-    </w:p>
-    <w:p>
-      <w:pPr>
-        <w:pStyle w:val="Sinespaciado"/>
-        <w:ind w:left="709"/>
-        <w:jc w:val="right"/>
-        <w:rPr>
-          <w:b/>
-          <w:i/>
-          <w:iCs/>
-          <w:color w:val="BFBFBF" w:themeColor="background1" w:themeShade="BF"/>
-          <w:sz w:val="20"/>
-          <w:szCs w:val="20"/>
-        </w:rPr>
-      </w:pPr>
     </w:p>
     <w:sectPr>
       <w:headerReference w:type="default" r:id="rId11"/>
@@ -14821,7 +14715,7 @@
         <v:path o:extrusionok="f" gradientshapeok="t" o:connecttype="rect"/>
         <o:lock v:ext="edit" aspectratio="t"/>
       </v:shapetype>
-      <v:shape id="Imagen 1302488667" o:spid="_x0000_i1025" type="#_x0000_t75" style="width:11.7pt;height:11.7pt;visibility:visible;mso-wrap-style:square" o:bullet="t">
+      <v:shape id="Imagen 1302488667" o:spid="_x0000_i1025" type="#_x0000_t75" style="width:11.55pt;height:11.55pt;visibility:visible;mso-wrap-style:square" o:bullet="t">
         <v:imagedata r:id="rId1" o:title=""/>
       </v:shape>
     </w:pict>

</xml_diff>

<commit_message>
feat: integrate your own word to pdf conversion service
</commit_message>
<xml_diff>
--- a/resources/templates/certificado_convenio_actividades_template.docx
+++ b/resources/templates/certificado_convenio_actividades_template.docx
@@ -17,21 +17,13 @@
           <w:noProof/>
           <w:lang w:val="es-419" w:eastAsia="es-419"/>
         </w:rPr>
-      </w:r>
-      <w:r>
-        <w:rPr>
-          <w:i/>
-          <w:iCs/>
-          <w:noProof/>
-          <w:lang w:val="es-419" w:eastAsia="es-419"/>
-        </w:rPr>
-        <w:pict w14:anchorId="4FCD88D6">
+        <w:pict w14:anchorId="1C7844AB">
           <v:shapetype id="_x0000_t201" coordsize="21600,21600" o:spt="201" path="m,l,21600r21600,l21600,xe">
             <v:stroke joinstyle="miter"/>
             <v:path shadowok="f" o:extrusionok="f" strokeok="f" fillok="f" o:connecttype="rect"/>
             <o:lock v:ext="edit" shapetype="t"/>
           </v:shapetype>
-          <v:shape id="_x0000_s1026" type="#_x0000_t201" alt="" style="position:absolute;margin-left:537.85pt;margin-top:34.8pt;width:83.25pt;height:36.75pt;z-index:251660288;mso-wrap-edited:f;mso-width-percent:0;mso-height-percent:0;mso-width-percent:0;mso-height-percent:0" o:preferrelative="t" filled="f" stroked="f">
+          <v:shape id="_x0000_s2050" type="#_x0000_t201" alt="" style="position:absolute;margin-left:537.85pt;margin-top:34.8pt;width:83.25pt;height:36.75pt;z-index:251660288;mso-wrap-edited:f;mso-width-percent:0;mso-height-percent:0;mso-width-percent:0;mso-height-percent:0" o:preferrelative="t" filled="f" stroked="f">
             <v:imagedata r:id="rId8" o:title=""/>
             <o:lock v:ext="edit" aspectratio="t"/>
           </v:shape>
@@ -3305,7 +3297,6 @@
       </w:r>
       <w:r>
         <w:rPr>
-          <w:rFonts w:asciiTheme="minorHAnsi" w:hAnsiTheme="minorHAnsi" w:cstheme="minorHAnsi"/>
           <w:i/>
           <w:iCs/>
         </w:rPr>
@@ -3313,109 +3304,10 @@
       </w:r>
       <w:r>
         <w:rPr>
-          <w:rFonts w:asciiTheme="minorHAnsi" w:hAnsiTheme="minorHAnsi" w:cstheme="minorHAnsi"/>
-          <w:i/>
-          <w:iCs/>
-        </w:rPr>
-        <w:fldChar w:fldCharType="begin"/>
-      </w:r>
-      <w:r>
-        <w:rPr>
-          <w:rFonts w:asciiTheme="minorHAnsi" w:hAnsiTheme="minorHAnsi" w:cstheme="minorHAnsi"/>
-          <w:i/>
-          <w:iCs/>
-        </w:rPr>
-        <w:instrText xml:space="preserve"> IF </w:instrText>
-      </w:r>
-      <w:r>
-        <w:rPr>
-          <w:rFonts w:asciiTheme="minorHAnsi" w:hAnsiTheme="minorHAnsi" w:cstheme="minorHAnsi"/>
-          <w:i/>
-          <w:iCs/>
-        </w:rPr>
-        <w:fldChar w:fldCharType="begin"/>
-      </w:r>
-      <w:r>
-        <w:rPr>
-          <w:rFonts w:asciiTheme="minorHAnsi" w:hAnsiTheme="minorHAnsi" w:cstheme="minorHAnsi"/>
-          <w:i/>
-          <w:iCs/>
-        </w:rPr>
-        <w:instrText xml:space="preserve"> MERGEFIELD ESTADO </w:instrText>
-      </w:r>
-      <w:r>
-        <w:rPr>
-          <w:rFonts w:asciiTheme="minorHAnsi" w:hAnsiTheme="minorHAnsi" w:cstheme="minorHAnsi"/>
-          <w:i/>
-          <w:iCs/>
-        </w:rPr>
-        <w:fldChar w:fldCharType="separate"/>
-      </w:r>
-      <w:r>
-        <w:rPr>
-          <w:rFonts w:asciiTheme="minorHAnsi" w:hAnsiTheme="minorHAnsi" w:cstheme="minorHAnsi"/>
-          <w:i/>
-          <w:iCs/>
-          <w:noProof/>
-        </w:rPr>
-        <w:instrText>ACTIVO</w:instrText>
-      </w:r>
-      <w:r>
-        <w:rPr>
-          <w:rFonts w:asciiTheme="minorHAnsi" w:hAnsiTheme="minorHAnsi" w:cstheme="minorHAnsi"/>
-          <w:i/>
-          <w:iCs/>
-        </w:rPr>
-        <w:fldChar w:fldCharType="end"/>
-      </w:r>
-      <w:r>
-        <w:rPr>
-          <w:rFonts w:asciiTheme="minorHAnsi" w:hAnsiTheme="minorHAnsi" w:cstheme="minorHAnsi"/>
-          <w:i/>
-          <w:iCs/>
-        </w:rPr>
-        <w:instrText xml:space="preserve"> = "ACTIVO" "</w:instrText>
-      </w:r>
-      <w:r>
-        <w:rPr>
-          <w:rFonts w:asciiTheme="minorHAnsi" w:hAnsiTheme="minorHAnsi" w:cstheme="minorHAnsi"/>
-          <w:i/>
-          <w:iCs/>
-        </w:rPr>
-        <w:instrText>atiende procesos de</w:instrText>
-      </w:r>
-      <w:r>
-        <w:rPr>
-          <w:rFonts w:asciiTheme="minorHAnsi" w:hAnsiTheme="minorHAnsi" w:cstheme="minorHAnsi"/>
-          <w:i/>
-          <w:iCs/>
-        </w:rPr>
-        <w:instrText xml:space="preserve">" "" </w:instrText>
-      </w:r>
-      <w:r>
-        <w:rPr>
-          <w:rFonts w:asciiTheme="minorHAnsi" w:hAnsiTheme="minorHAnsi" w:cstheme="minorHAnsi"/>
-          <w:i/>
-          <w:iCs/>
-        </w:rPr>
-        <w:fldChar w:fldCharType="separate"/>
-      </w:r>
-      <w:r>
-        <w:rPr>
-          <w:rFonts w:asciiTheme="minorHAnsi" w:hAnsiTheme="minorHAnsi" w:cstheme="minorHAnsi"/>
-          <w:i/>
-          <w:iCs/>
-          <w:noProof/>
+          <w:i/>
+          <w:iCs/>
         </w:rPr>
         <w:t>procesos de</w:t>
-      </w:r>
-      <w:r>
-        <w:rPr>
-          <w:rFonts w:asciiTheme="minorHAnsi" w:hAnsiTheme="minorHAnsi" w:cstheme="minorHAnsi"/>
-          <w:i/>
-          <w:iCs/>
-        </w:rPr>
-        <w:fldChar w:fldCharType="end"/>
       </w:r>
       <w:r>
         <w:rPr>
@@ -14696,7 +14588,7 @@
 <w:numbering xmlns:wpc="http://schemas.microsoft.com/office/word/2010/wordprocessingCanvas" xmlns:cx="http://schemas.microsoft.com/office/drawing/2014/chartex" xmlns:cx1="http://schemas.microsoft.com/office/drawing/2015/9/8/chartex" xmlns:cx2="http://schemas.microsoft.com/office/drawing/2015/10/21/chartex" xmlns:cx3="http://schemas.microsoft.com/office/drawing/2016/5/9/chartex" xmlns:cx4="http://schemas.microsoft.com/office/drawing/2016/5/10/chartex" xmlns:cx5="http://schemas.microsoft.com/office/drawing/2016/5/11/chartex" xmlns:cx6="http://schemas.microsoft.com/office/drawing/2016/5/12/chartex" xmlns:cx7="http://schemas.microsoft.com/office/drawing/2016/5/13/chartex" xmlns:cx8="http://schemas.microsoft.com/office/drawing/2016/5/14/chartex" xmlns:mc="http://schemas.openxmlformats.org/markup-compatibility/2006" xmlns:aink="http://schemas.microsoft.com/office/drawing/2016/ink" xmlns:am3d="http://schemas.microsoft.com/office/drawing/2017/model3d" xmlns:o="urn:schemas-microsoft-com:office:office" xmlns:oel="http://schemas.microsoft.com/office/2019/extlst" xmlns:r="http://schemas.openxmlformats.org/officeDocument/2006/relationships" xmlns:m="http://schemas.openxmlformats.org/officeDocument/2006/math" xmlns:v="urn:schemas-microsoft-com:vml" xmlns:wp14="http://schemas.microsoft.com/office/word/2010/wordprocessingDrawing" xmlns:wp="http://schemas.openxmlformats.org/drawingml/2006/wordprocessingDrawing" xmlns:w10="urn:schemas-microsoft-com:office:word" xmlns:w="http://schemas.openxmlformats.org/wordprocessingml/2006/main" xmlns:w14="http://schemas.microsoft.com/office/word/2010/wordml" xmlns:w15="http://schemas.microsoft.com/office/word/2012/wordml" xmlns:w16cex="http://schemas.microsoft.com/office/word/2018/wordml/cex" xmlns:w16cid="http://schemas.microsoft.com/office/word/2016/wordml/cid" xmlns:w16="http://schemas.microsoft.com/office/word/2018/wordml" xmlns:w16du="http://schemas.microsoft.com/office/word/2023/wordml/word16du" xmlns:w16sdtdh="http://schemas.microsoft.com/office/word/2020/wordml/sdtdatahash" xmlns:w16sdtfl="http://schemas.microsoft.com/office/word/2024/wordml/sdtformatlock" xmlns:w16se="http://schemas.microsoft.com/office/word/2015/wordml/symex" xmlns:wpg="http://schemas.microsoft.com/office/word/2010/wordprocessingGroup" xmlns:wpi="http://schemas.microsoft.com/office/word/2010/wordprocessingInk" xmlns:wne="http://schemas.microsoft.com/office/word/2006/wordml" xmlns:wps="http://schemas.microsoft.com/office/word/2010/wordprocessingShape" mc:Ignorable="w14 w15 w16se w16cid w16 w16cex w16sdtdh w16sdtfl w16du wp14">
   <w:numPicBullet w:numPicBulletId="0">
     <w:pict>
-      <v:shapetype w14:anchorId="4FCD88D6" id="_x0000_t75" coordsize="21600,21600" o:spt="75" o:preferrelative="t" path="m@4@5l@4@11@9@11@9@5xe" filled="f" stroked="f">
+      <v:shapetype w14:anchorId="1C7844AB" id="_x0000_t75" coordsize="21600,21600" o:spt="75" o:preferrelative="t" path="m@4@5l@4@11@9@11@9@5xe" filled="f" stroked="f">
         <v:stroke joinstyle="miter"/>
         <v:formulas>
           <v:f eqn="if lineDrawn pixelLineWidth 0"/>
@@ -14715,7 +14607,7 @@
         <v:path o:extrusionok="f" gradientshapeok="t" o:connecttype="rect"/>
         <o:lock v:ext="edit" aspectratio="t"/>
       </v:shapetype>
-      <v:shape id="Imagen 1302488667" o:spid="_x0000_i1025" type="#_x0000_t75" style="width:11.55pt;height:11.55pt;visibility:visible;mso-wrap-style:square" o:bullet="t">
+      <v:shape id="Imagen 1302488667" o:spid="_x0000_i1025" type="#_x0000_t75" style="width:11.6pt;height:11.6pt;visibility:visible;mso-wrap-style:square" o:bullet="t">
         <v:imagedata r:id="rId1" o:title=""/>
       </v:shape>
     </w:pict>

</xml_diff>